<commit_message>
Separate LSTM training and monitoring artifacts
</commit_message>
<xml_diff>
--- a/data/觀察版資料/13_專案記憶/專案記憶與討論摘要.docx
+++ b/data/觀察版資料/13_專案記憶/專案記憶與討論摘要.docx
@@ -26,7 +26,7 @@
           <w:b w:val="0"/>
           <w:sz w:val="20"/>
         </w:rPr>
-        <w:t>產生時間：2026-07-17 08:14 UTC｜來源：專案記憶資料夾</w:t>
+        <w:t>產生時間：2026-07-17 11:22 UTC｜來源：專案記憶資料夾</w:t>
       </w:r>
     </w:p>
     <w:p>
@@ -156,7 +156,7 @@
                 <w:b w:val="0"/>
                 <w:sz w:val="20"/>
               </w:rPr>
-              <w:t>7</w:t>
+              <w:t>9</w:t>
             </w:r>
           </w:p>
         </w:tc>
@@ -212,7 +212,7 @@
                 <w:b w:val="0"/>
                 <w:sz w:val="20"/>
               </w:rPr>
-              <w:t>7</w:t>
+              <w:t>9</w:t>
             </w:r>
           </w:p>
         </w:tc>
@@ -324,7 +324,7 @@
                 <w:b w:val="0"/>
                 <w:sz w:val="20"/>
               </w:rPr>
-              <w:t>2026-07-15</w:t>
+              <w:t>2026-07-17</w:t>
             </w:r>
           </w:p>
         </w:tc>
@@ -444,6 +444,154 @@
                 <w:sz w:val="20"/>
               </w:rPr>
               <w:t>狀態</w:t>
+            </w:r>
+          </w:p>
+        </w:tc>
+      </w:tr>
+      <w:tr>
+        <w:tc>
+          <w:tcPr>
+            <w:tcW w:type="dxa" w:w="2340"/>
+          </w:tcPr>
+          <w:p>
+            <w:pPr>
+              <w:jc w:val="left"/>
+            </w:pPr>
+            <w:r>
+              <w:rPr>
+                <w:rFonts w:ascii="PingFangTC-Regular" w:hAnsi="PingFangTC-Regular" w:eastAsia="PingFangTC-Regular" w:cs="PingFangTC-Regular"/>
+                <w:b w:val="0"/>
+                <w:sz w:val="20"/>
+              </w:rPr>
+              <w:t>決策</w:t>
+            </w:r>
+          </w:p>
+        </w:tc>
+        <w:tc>
+          <w:tcPr>
+            <w:tcW w:type="dxa" w:w="2340"/>
+          </w:tcPr>
+          <w:p>
+            <w:pPr>
+              <w:jc w:val="left"/>
+            </w:pPr>
+            <w:r>
+              <w:rPr>
+                <w:rFonts w:ascii="PingFangTC-Regular" w:hAnsi="PingFangTC-Regular" w:eastAsia="PingFangTC-Regular" w:cs="PingFangTC-Regular"/>
+                <w:b w:val="0"/>
+                <w:sz w:val="20"/>
+              </w:rPr>
+              <w:t>2026-07-17</w:t>
+            </w:r>
+          </w:p>
+        </w:tc>
+        <w:tc>
+          <w:tcPr>
+            <w:tcW w:type="dxa" w:w="2340"/>
+          </w:tcPr>
+          <w:p>
+            <w:pPr>
+              <w:jc w:val="left"/>
+            </w:pPr>
+            <w:r>
+              <w:rPr>
+                <w:rFonts w:ascii="PingFangTC-Regular" w:hAnsi="PingFangTC-Regular" w:eastAsia="PingFangTC-Regular" w:cs="PingFangTC-Regular"/>
+                <w:b w:val="0"/>
+                <w:sz w:val="20"/>
+              </w:rPr>
+              <w:t>增加最新掃描時間與掃描結果</w:t>
+            </w:r>
+          </w:p>
+        </w:tc>
+        <w:tc>
+          <w:tcPr>
+            <w:tcW w:type="dxa" w:w="2340"/>
+          </w:tcPr>
+          <w:p>
+            <w:pPr>
+              <w:jc w:val="left"/>
+            </w:pPr>
+            <w:r>
+              <w:rPr>
+                <w:rFonts w:ascii="PingFangTC-Regular" w:hAnsi="PingFangTC-Regular" w:eastAsia="PingFangTC-Regular" w:cs="PingFangTC-Regular"/>
+                <w:b w:val="0"/>
+                <w:sz w:val="20"/>
+              </w:rPr>
+              <w:t>已執行</w:t>
+            </w:r>
+          </w:p>
+        </w:tc>
+      </w:tr>
+      <w:tr>
+        <w:tc>
+          <w:tcPr>
+            <w:tcW w:type="dxa" w:w="2340"/>
+          </w:tcPr>
+          <w:p>
+            <w:pPr>
+              <w:jc w:val="left"/>
+            </w:pPr>
+            <w:r>
+              <w:rPr>
+                <w:rFonts w:ascii="PingFangTC-Regular" w:hAnsi="PingFangTC-Regular" w:eastAsia="PingFangTC-Regular" w:cs="PingFangTC-Regular"/>
+                <w:b w:val="0"/>
+                <w:sz w:val="20"/>
+              </w:rPr>
+              <w:t>決策</w:t>
+            </w:r>
+          </w:p>
+        </w:tc>
+        <w:tc>
+          <w:tcPr>
+            <w:tcW w:type="dxa" w:w="2340"/>
+          </w:tcPr>
+          <w:p>
+            <w:pPr>
+              <w:jc w:val="left"/>
+            </w:pPr>
+            <w:r>
+              <w:rPr>
+                <w:rFonts w:ascii="PingFangTC-Regular" w:hAnsi="PingFangTC-Regular" w:eastAsia="PingFangTC-Regular" w:cs="PingFangTC-Regular"/>
+                <w:b w:val="0"/>
+                <w:sz w:val="20"/>
+              </w:rPr>
+              <w:t>2026-07-17</w:t>
+            </w:r>
+          </w:p>
+        </w:tc>
+        <w:tc>
+          <w:tcPr>
+            <w:tcW w:type="dxa" w:w="2340"/>
+          </w:tcPr>
+          <w:p>
+            <w:pPr>
+              <w:jc w:val="left"/>
+            </w:pPr>
+            <w:r>
+              <w:rPr>
+                <w:rFonts w:ascii="PingFangTC-Regular" w:hAnsi="PingFangTC-Regular" w:eastAsia="PingFangTC-Regular" w:cs="PingFangTC-Regular"/>
+                <w:b w:val="0"/>
+                <w:sz w:val="20"/>
+              </w:rPr>
+              <w:t>分離訓練特徵與日常監控特徵並加入即時推論</w:t>
+            </w:r>
+          </w:p>
+        </w:tc>
+        <w:tc>
+          <w:tcPr>
+            <w:tcW w:type="dxa" w:w="2340"/>
+          </w:tcPr>
+          <w:p>
+            <w:pPr>
+              <w:jc w:val="left"/>
+            </w:pPr>
+            <w:r>
+              <w:rPr>
+                <w:rFonts w:ascii="PingFangTC-Regular" w:hAnsi="PingFangTC-Regular" w:eastAsia="PingFangTC-Regular" w:cs="PingFangTC-Regular"/>
+                <w:b w:val="0"/>
+                <w:sz w:val="20"/>
+              </w:rPr>
+              <w:t>已執行</w:t>
             </w:r>
           </w:p>
         </w:tc>
@@ -685,7 +833,7 @@
                 <w:b w:val="0"/>
                 <w:sz w:val="20"/>
               </w:rPr>
-              <w:t>決策</w:t>
+              <w:t>記憶更新</w:t>
             </w:r>
           </w:p>
         </w:tc>
@@ -703,7 +851,7 @@
                 <w:b w:val="0"/>
                 <w:sz w:val="20"/>
               </w:rPr>
-              <w:t>2026-05-21</w:t>
+              <w:t>2026-07-17</w:t>
             </w:r>
           </w:p>
         </w:tc>
@@ -721,7 +869,7 @@
                 <w:b w:val="0"/>
                 <w:sz w:val="20"/>
               </w:rPr>
-              <w:t>候選觀察股改為每日 Top 15 紀錄</w:t>
+              <w:t>記錄資料健康檢查增加最新掃描時間</w:t>
             </w:r>
           </w:p>
         </w:tc>
@@ -739,7 +887,7 @@
                 <w:b w:val="0"/>
                 <w:sz w:val="20"/>
               </w:rPr>
-              <w:t>已執行</w:t>
+              <w:t>使用者確認</w:t>
             </w:r>
           </w:p>
         </w:tc>
@@ -759,7 +907,7 @@
                 <w:b w:val="0"/>
                 <w:sz w:val="20"/>
               </w:rPr>
-              <w:t>決策</w:t>
+              <w:t>記憶更新</w:t>
             </w:r>
           </w:p>
         </w:tc>
@@ -777,7 +925,7 @@
                 <w:b w:val="0"/>
                 <w:sz w:val="20"/>
               </w:rPr>
-              <w:t>2026-05-20</w:t>
+              <w:t>2026-07-17</w:t>
             </w:r>
           </w:p>
         </w:tc>
@@ -795,7 +943,7 @@
                 <w:b w:val="0"/>
                 <w:sz w:val="20"/>
               </w:rPr>
-              <w:t>新增我的持倉監控</w:t>
+              <w:t>完成資料健康掃描欄位與 LSTM 訓練/監控分層</w:t>
             </w:r>
           </w:p>
         </w:tc>
@@ -813,7 +961,7 @@
                 <w:b w:val="0"/>
                 <w:sz w:val="20"/>
               </w:rPr>
-              <w:t>已執行</w:t>
+              <w:t>使用者確認</w:t>
             </w:r>
           </w:p>
         </w:tc>
@@ -1036,80 +1184,6 @@
                 <w:sz w:val="20"/>
               </w:rPr>
               <w:t>使用者確認</w:t>
-            </w:r>
-          </w:p>
-        </w:tc>
-      </w:tr>
-      <w:tr>
-        <w:tc>
-          <w:tcPr>
-            <w:tcW w:type="dxa" w:w="2340"/>
-          </w:tcPr>
-          <w:p>
-            <w:pPr>
-              <w:jc w:val="left"/>
-            </w:pPr>
-            <w:r>
-              <w:rPr>
-                <w:rFonts w:ascii="PingFangTC-Regular" w:hAnsi="PingFangTC-Regular" w:eastAsia="PingFangTC-Regular" w:cs="PingFangTC-Regular"/>
-                <w:b w:val="0"/>
-                <w:sz w:val="20"/>
-              </w:rPr>
-              <w:t>記憶更新</w:t>
-            </w:r>
-          </w:p>
-        </w:tc>
-        <w:tc>
-          <w:tcPr>
-            <w:tcW w:type="dxa" w:w="2340"/>
-          </w:tcPr>
-          <w:p>
-            <w:pPr>
-              <w:jc w:val="left"/>
-            </w:pPr>
-            <w:r>
-              <w:rPr>
-                <w:rFonts w:ascii="PingFangTC-Regular" w:hAnsi="PingFangTC-Regular" w:eastAsia="PingFangTC-Regular" w:cs="PingFangTC-Regular"/>
-                <w:b w:val="0"/>
-                <w:sz w:val="20"/>
-              </w:rPr>
-              <w:t>2026-07-15</w:t>
-            </w:r>
-          </w:p>
-        </w:tc>
-        <w:tc>
-          <w:tcPr>
-            <w:tcW w:type="dxa" w:w="2340"/>
-          </w:tcPr>
-          <w:p>
-            <w:pPr>
-              <w:jc w:val="left"/>
-            </w:pPr>
-            <w:r>
-              <w:rPr>
-                <w:rFonts w:ascii="PingFangTC-Regular" w:hAnsi="PingFangTC-Regular" w:eastAsia="PingFangTC-Regular" w:cs="PingFangTC-Regular"/>
-                <w:b w:val="0"/>
-                <w:sz w:val="20"/>
-              </w:rPr>
-              <w:t>加入敏感資訊過濾規則</w:t>
-            </w:r>
-          </w:p>
-        </w:tc>
-        <w:tc>
-          <w:tcPr>
-            <w:tcW w:type="dxa" w:w="2340"/>
-          </w:tcPr>
-          <w:p>
-            <w:pPr>
-              <w:jc w:val="left"/>
-            </w:pPr>
-            <w:r>
-              <w:rPr>
-                <w:rFonts w:ascii="PingFangTC-Regular" w:hAnsi="PingFangTC-Regular" w:eastAsia="PingFangTC-Regular" w:cs="PingFangTC-Regular"/>
-                <w:b w:val="0"/>
-                <w:sz w:val="20"/>
-              </w:rPr>
-              <w:t>系統檢查</w:t>
             </w:r>
           </w:p>
         </w:tc>
@@ -2078,6 +2152,61 @@
     </w:p>
     <w:p>
       <w:pPr>
+        <w:spacing w:before="200" w:after="120"/>
+      </w:pPr>
+      <w:r>
+        <w:rPr>
+          <w:rFonts w:ascii="PingFangTC-Regular" w:hAnsi="PingFangTC-Regular" w:eastAsia="PingFangTC-Regular" w:cs="PingFangTC-Regular"/>
+          <w:b w:val="0"/>
+          <w:sz w:val="24"/>
+        </w:rPr>
+        <w:t>9. 資料健康檢查的掃描時間</w:t>
+      </w:r>
+    </w:p>
+    <w:p>
+      <w:pPr>
+        <w:pStyle w:val="ListBullet"/>
+        <w:spacing w:after="60" w:line="276" w:lineRule="auto"/>
+      </w:pPr>
+      <w:r>
+        <w:rPr>
+          <w:rFonts w:ascii="PingFangTC-Regular" w:hAnsi="PingFangTC-Regular" w:eastAsia="PingFangTC-Regular" w:cs="PingFangTC-Regular"/>
+          <w:b w:val="0"/>
+          <w:sz w:val="22"/>
+        </w:rPr>
+        <w:t>討論：大盤事件窗只在出現新的 ±10% 事件時增加資料列，最新事件日期不等於最後掃描時間。</w:t>
+      </w:r>
+    </w:p>
+    <w:p>
+      <w:pPr>
+        <w:pStyle w:val="ListBullet"/>
+        <w:spacing w:after="60" w:line="276" w:lineRule="auto"/>
+      </w:pPr>
+      <w:r>
+        <w:rPr>
+          <w:rFonts w:ascii="PingFangTC-Regular" w:hAnsi="PingFangTC-Regular" w:eastAsia="PingFangTC-Regular" w:cs="PingFangTC-Regular"/>
+          <w:b w:val="0"/>
+          <w:sz w:val="22"/>
+        </w:rPr>
+        <w:t>結論：資料健康檢查應同時顯示「最新資料日期」、「最新掃描時間」與掃描結果，避免把沒有新事件誤判成系統停止更新。</w:t>
+      </w:r>
+    </w:p>
+    <w:p>
+      <w:pPr>
+        <w:pStyle w:val="ListBullet"/>
+        <w:spacing w:after="60" w:line="276" w:lineRule="auto"/>
+      </w:pPr>
+      <w:r>
+        <w:rPr>
+          <w:rFonts w:ascii="PingFangTC-Regular" w:hAnsi="PingFangTC-Regular" w:eastAsia="PingFangTC-Regular" w:cs="PingFangTC-Regular"/>
+          <w:b w:val="0"/>
+          <w:sz w:val="22"/>
+        </w:rPr>
+        <w:t>狀態：已確認，待與其他功能一起執行。</w:t>
+      </w:r>
+    </w:p>
+    <w:p>
+      <w:pPr>
         <w:pStyle w:val="ListBullet"/>
         <w:spacing w:after="60" w:line="276" w:lineRule="auto"/>
       </w:pPr>
@@ -2088,6 +2217,75 @@
           <w:sz w:val="22"/>
         </w:rPr>
         <w:t>狀態：本輪開始執行。</w:t>
+      </w:r>
+    </w:p>
+    <w:p>
+      <w:pPr>
+        <w:spacing w:before="200" w:after="120"/>
+      </w:pPr>
+      <w:r>
+        <w:rPr>
+          <w:rFonts w:ascii="PingFangTC-Regular" w:hAnsi="PingFangTC-Regular" w:eastAsia="PingFangTC-Regular" w:cs="PingFangTC-Regular"/>
+          <w:b w:val="0"/>
+          <w:sz w:val="24"/>
+        </w:rPr>
+        <w:t>10. LSTM 工件分層與即時推論</w:t>
+      </w:r>
+    </w:p>
+    <w:p>
+      <w:pPr>
+        <w:pStyle w:val="ListBullet"/>
+        <w:spacing w:after="60" w:line="276" w:lineRule="auto"/>
+      </w:pPr>
+      <w:r>
+        <w:rPr>
+          <w:rFonts w:ascii="PingFangTC-Regular" w:hAnsi="PingFangTC-Regular" w:eastAsia="PingFangTC-Regular" w:cs="PingFangTC-Regular"/>
+          <w:b w:val="0"/>
+          <w:sz w:val="22"/>
+        </w:rPr>
+        <w:t>訓練特徵改存於 `lstm_train_features.parquet`，只有模型訓練流程可以更新。</w:t>
+      </w:r>
+    </w:p>
+    <w:p>
+      <w:pPr>
+        <w:pStyle w:val="ListBullet"/>
+        <w:spacing w:after="60" w:line="276" w:lineRule="auto"/>
+      </w:pPr>
+      <w:r>
+        <w:rPr>
+          <w:rFonts w:ascii="PingFangTC-Regular" w:hAnsi="PingFangTC-Regular" w:eastAsia="PingFangTC-Regular" w:cs="PingFangTC-Regular"/>
+          <w:b w:val="0"/>
+          <w:sz w:val="22"/>
+        </w:rPr>
+        <w:t>日常 6 小時更新改存於 `lstm_monitor_features.parquet`，不含未來報酬或標籤，不會覆蓋訓練資料。</w:t>
+      </w:r>
+    </w:p>
+    <w:p>
+      <w:pPr>
+        <w:pStyle w:val="ListBullet"/>
+        <w:spacing w:after="60" w:line="276" w:lineRule="auto"/>
+      </w:pPr>
+      <w:r>
+        <w:rPr>
+          <w:rFonts w:ascii="PingFangTC-Regular" w:hAnsi="PingFangTC-Regular" w:eastAsia="PingFangTC-Regular" w:cs="PingFangTC-Regular"/>
+          <w:b w:val="0"/>
+          <w:sz w:val="22"/>
+        </w:rPr>
+        <w:t>模型訓練後產生真正的即時推論列，目標日為估計的 20 個交易日後；期滿後才進入回測。</w:t>
+      </w:r>
+    </w:p>
+    <w:p>
+      <w:pPr>
+        <w:pStyle w:val="ListBullet"/>
+        <w:spacing w:after="60" w:line="276" w:lineRule="auto"/>
+      </w:pPr>
+      <w:r>
+        <w:rPr>
+          <w:rFonts w:ascii="PingFangTC-Regular" w:hAnsi="PingFangTC-Regular" w:eastAsia="PingFangTC-Regular" w:cs="PingFangTC-Regular"/>
+          <w:b w:val="0"/>
+          <w:sz w:val="22"/>
+        </w:rPr>
+        <w:t>儀表板顯示訓練時間、預測生成時間、目標日、訓練/驗證/測試樣本、回測正確率與信心等級。</w:t>
       </w:r>
     </w:p>
     <w:p>
@@ -2306,6 +2504,34 @@
           <w:sz w:val="22"/>
         </w:rPr>
         <w:t>例行檢查時，同步更新專案記憶中的 `active_context.md` 與 `memory_changelog.csv`。</w:t>
+      </w:r>
+    </w:p>
+    <w:p>
+      <w:pPr>
+        <w:pStyle w:val="ListBullet"/>
+        <w:spacing w:after="60" w:line="276" w:lineRule="auto"/>
+      </w:pPr>
+      <w:r>
+        <w:rPr>
+          <w:rFonts w:ascii="PingFangTC-Regular" w:hAnsi="PingFangTC-Regular" w:eastAsia="PingFangTC-Regular" w:cs="PingFangTC-Regular"/>
+          <w:b w:val="0"/>
+          <w:sz w:val="22"/>
+        </w:rPr>
+        <w:t>本輪已完成：資料健康檢查增加「最新掃描時間」與「掃描結果」，並與「最新資料日期」分開顯示。</w:t>
+      </w:r>
+    </w:p>
+    <w:p>
+      <w:pPr>
+        <w:pStyle w:val="ListBullet"/>
+        <w:spacing w:after="60" w:line="276" w:lineRule="auto"/>
+      </w:pPr>
+      <w:r>
+        <w:rPr>
+          <w:rFonts w:ascii="PingFangTC-Regular" w:hAnsi="PingFangTC-Regular" w:eastAsia="PingFangTC-Regular" w:cs="PingFangTC-Regular"/>
+          <w:b w:val="0"/>
+          <w:sz w:val="22"/>
+        </w:rPr>
+        <w:t>本輪已完成：LSTM 分離訓練特徵與日常監控特徵，並新增不等待未來標籤的即時推論列。</w:t>
       </w:r>
     </w:p>
     <w:p>
@@ -3671,6 +3897,330 @@
           </w:p>
         </w:tc>
       </w:tr>
+      <w:tr>
+        <w:tc>
+          <w:tcPr>
+            <w:tcW w:type="dxa" w:w="1040"/>
+          </w:tcPr>
+          <w:p>
+            <w:pPr>
+              <w:jc w:val="left"/>
+            </w:pPr>
+            <w:r>
+              <w:rPr>
+                <w:rFonts w:ascii="PingFangTC-Regular" w:hAnsi="PingFangTC-Regular" w:eastAsia="PingFangTC-Regular" w:cs="PingFangTC-Regular"/>
+                <w:b w:val="0"/>
+                <w:sz w:val="20"/>
+              </w:rPr>
+              <w:t>D-008</w:t>
+            </w:r>
+          </w:p>
+        </w:tc>
+        <w:tc>
+          <w:tcPr>
+            <w:tcW w:type="dxa" w:w="1040"/>
+          </w:tcPr>
+          <w:p>
+            <w:pPr>
+              <w:jc w:val="left"/>
+            </w:pPr>
+            <w:r>
+              <w:rPr>
+                <w:rFonts w:ascii="PingFangTC-Regular" w:hAnsi="PingFangTC-Regular" w:eastAsia="PingFangTC-Regular" w:cs="PingFangTC-Regular"/>
+                <w:b w:val="0"/>
+                <w:sz w:val="20"/>
+              </w:rPr>
+              <w:t>2026-07-17</w:t>
+            </w:r>
+          </w:p>
+        </w:tc>
+        <w:tc>
+          <w:tcPr>
+            <w:tcW w:type="dxa" w:w="1040"/>
+          </w:tcPr>
+          <w:p>
+            <w:pPr>
+              <w:jc w:val="left"/>
+            </w:pPr>
+            <w:r>
+              <w:rPr>
+                <w:rFonts w:ascii="PingFangTC-Regular" w:hAnsi="PingFangTC-Regular" w:eastAsia="PingFangTC-Regular" w:cs="PingFangTC-Regular"/>
+                <w:b w:val="0"/>
+                <w:sz w:val="20"/>
+              </w:rPr>
+              <w:t>已執行</w:t>
+            </w:r>
+          </w:p>
+        </w:tc>
+        <w:tc>
+          <w:tcPr>
+            <w:tcW w:type="dxa" w:w="1040"/>
+          </w:tcPr>
+          <w:p>
+            <w:pPr>
+              <w:jc w:val="left"/>
+            </w:pPr>
+            <w:r>
+              <w:rPr>
+                <w:rFonts w:ascii="PingFangTC-Regular" w:hAnsi="PingFangTC-Regular" w:eastAsia="PingFangTC-Regular" w:cs="PingFangTC-Regular"/>
+                <w:b w:val="0"/>
+                <w:sz w:val="20"/>
+              </w:rPr>
+              <w:t>資料健康</w:t>
+            </w:r>
+          </w:p>
+        </w:tc>
+        <w:tc>
+          <w:tcPr>
+            <w:tcW w:type="dxa" w:w="1040"/>
+          </w:tcPr>
+          <w:p>
+            <w:pPr>
+              <w:jc w:val="left"/>
+            </w:pPr>
+            <w:r>
+              <w:rPr>
+                <w:rFonts w:ascii="PingFangTC-Regular" w:hAnsi="PingFangTC-Regular" w:eastAsia="PingFangTC-Regular" w:cs="PingFangTC-Regular"/>
+                <w:b w:val="0"/>
+                <w:sz w:val="20"/>
+              </w:rPr>
+              <w:t>增加最新掃描時間與掃描結果</w:t>
+            </w:r>
+          </w:p>
+        </w:tc>
+        <w:tc>
+          <w:tcPr>
+            <w:tcW w:type="dxa" w:w="1040"/>
+          </w:tcPr>
+          <w:p>
+            <w:pPr>
+              <w:jc w:val="left"/>
+            </w:pPr>
+            <w:r>
+              <w:rPr>
+                <w:rFonts w:ascii="PingFangTC-Regular" w:hAnsi="PingFangTC-Regular" w:eastAsia="PingFangTC-Regular" w:cs="PingFangTC-Regular"/>
+                <w:b w:val="0"/>
+                <w:sz w:val="20"/>
+              </w:rPr>
+              <w:t>區分最後一筆符合條件資料與系統最後一次掃描避免誤判未更新</w:t>
+            </w:r>
+          </w:p>
+        </w:tc>
+        <w:tc>
+          <w:tcPr>
+            <w:tcW w:type="dxa" w:w="1040"/>
+          </w:tcPr>
+          <w:p>
+            <w:pPr>
+              <w:jc w:val="left"/>
+            </w:pPr>
+            <w:r>
+              <w:rPr>
+                <w:rFonts w:ascii="PingFangTC-Regular" w:hAnsi="PingFangTC-Regular" w:eastAsia="PingFangTC-Regular" w:cs="PingFangTC-Regular"/>
+                <w:b w:val="0"/>
+                <w:sz w:val="20"/>
+              </w:rPr>
+              <w:t>資料健康檢查與大盤事件窗</w:t>
+            </w:r>
+          </w:p>
+        </w:tc>
+        <w:tc>
+          <w:tcPr>
+            <w:tcW w:type="dxa" w:w="1040"/>
+          </w:tcPr>
+          <w:p>
+            <w:pPr>
+              <w:jc w:val="left"/>
+            </w:pPr>
+            <w:r>
+              <w:rPr>
+                <w:rFonts w:ascii="PingFangTC-Regular" w:hAnsi="PingFangTC-Regular" w:eastAsia="PingFangTC-Regular" w:cs="PingFangTC-Regular"/>
+                <w:b w:val="0"/>
+                <w:sz w:val="20"/>
+              </w:rPr>
+            </w:r>
+          </w:p>
+        </w:tc>
+        <w:tc>
+          <w:tcPr>
+            <w:tcW w:type="dxa" w:w="1040"/>
+          </w:tcPr>
+          <w:p>
+            <w:pPr>
+              <w:jc w:val="left"/>
+            </w:pPr>
+            <w:r>
+              <w:rPr>
+                <w:rFonts w:ascii="PingFangTC-Regular" w:hAnsi="PingFangTC-Regular" w:eastAsia="PingFangTC-Regular" w:cs="PingFangTC-Regular"/>
+                <w:b w:val="0"/>
+                <w:sz w:val="20"/>
+              </w:rPr>
+            </w:r>
+          </w:p>
+        </w:tc>
+      </w:tr>
+      <w:tr>
+        <w:tc>
+          <w:tcPr>
+            <w:tcW w:type="dxa" w:w="1040"/>
+          </w:tcPr>
+          <w:p>
+            <w:pPr>
+              <w:jc w:val="left"/>
+            </w:pPr>
+            <w:r>
+              <w:rPr>
+                <w:rFonts w:ascii="PingFangTC-Regular" w:hAnsi="PingFangTC-Regular" w:eastAsia="PingFangTC-Regular" w:cs="PingFangTC-Regular"/>
+                <w:b w:val="0"/>
+                <w:sz w:val="20"/>
+              </w:rPr>
+              <w:t>D-009</w:t>
+            </w:r>
+          </w:p>
+        </w:tc>
+        <w:tc>
+          <w:tcPr>
+            <w:tcW w:type="dxa" w:w="1040"/>
+          </w:tcPr>
+          <w:p>
+            <w:pPr>
+              <w:jc w:val="left"/>
+            </w:pPr>
+            <w:r>
+              <w:rPr>
+                <w:rFonts w:ascii="PingFangTC-Regular" w:hAnsi="PingFangTC-Regular" w:eastAsia="PingFangTC-Regular" w:cs="PingFangTC-Regular"/>
+                <w:b w:val="0"/>
+                <w:sz w:val="20"/>
+              </w:rPr>
+              <w:t>2026-07-17</w:t>
+            </w:r>
+          </w:p>
+        </w:tc>
+        <w:tc>
+          <w:tcPr>
+            <w:tcW w:type="dxa" w:w="1040"/>
+          </w:tcPr>
+          <w:p>
+            <w:pPr>
+              <w:jc w:val="left"/>
+            </w:pPr>
+            <w:r>
+              <w:rPr>
+                <w:rFonts w:ascii="PingFangTC-Regular" w:hAnsi="PingFangTC-Regular" w:eastAsia="PingFangTC-Regular" w:cs="PingFangTC-Regular"/>
+                <w:b w:val="0"/>
+                <w:sz w:val="20"/>
+              </w:rPr>
+              <w:t>已執行</w:t>
+            </w:r>
+          </w:p>
+        </w:tc>
+        <w:tc>
+          <w:tcPr>
+            <w:tcW w:type="dxa" w:w="1040"/>
+          </w:tcPr>
+          <w:p>
+            <w:pPr>
+              <w:jc w:val="left"/>
+            </w:pPr>
+            <w:r>
+              <w:rPr>
+                <w:rFonts w:ascii="PingFangTC-Regular" w:hAnsi="PingFangTC-Regular" w:eastAsia="PingFangTC-Regular" w:cs="PingFangTC-Regular"/>
+                <w:b w:val="0"/>
+                <w:sz w:val="20"/>
+              </w:rPr>
+              <w:t>LSTM</w:t>
+            </w:r>
+          </w:p>
+        </w:tc>
+        <w:tc>
+          <w:tcPr>
+            <w:tcW w:type="dxa" w:w="1040"/>
+          </w:tcPr>
+          <w:p>
+            <w:pPr>
+              <w:jc w:val="left"/>
+            </w:pPr>
+            <w:r>
+              <w:rPr>
+                <w:rFonts w:ascii="PingFangTC-Regular" w:hAnsi="PingFangTC-Regular" w:eastAsia="PingFangTC-Regular" w:cs="PingFangTC-Regular"/>
+                <w:b w:val="0"/>
+                <w:sz w:val="20"/>
+              </w:rPr>
+              <w:t>分離訓練特徵與日常監控特徵並加入即時推論</w:t>
+            </w:r>
+          </w:p>
+        </w:tc>
+        <w:tc>
+          <w:tcPr>
+            <w:tcW w:type="dxa" w:w="1040"/>
+          </w:tcPr>
+          <w:p>
+            <w:pPr>
+              <w:jc w:val="left"/>
+            </w:pPr>
+            <w:r>
+              <w:rPr>
+                <w:rFonts w:ascii="PingFangTC-Regular" w:hAnsi="PingFangTC-Regular" w:eastAsia="PingFangTC-Regular" w:cs="PingFangTC-Regular"/>
+                <w:b w:val="0"/>
+                <w:sz w:val="20"/>
+              </w:rPr>
+              <w:t>避免每6小時更新覆蓋訓練資料；即時推論不等待未來報酬標籤</w:t>
+            </w:r>
+          </w:p>
+        </w:tc>
+        <w:tc>
+          <w:tcPr>
+            <w:tcW w:type="dxa" w:w="1040"/>
+          </w:tcPr>
+          <w:p>
+            <w:pPr>
+              <w:jc w:val="left"/>
+            </w:pPr>
+            <w:r>
+              <w:rPr>
+                <w:rFonts w:ascii="PingFangTC-Regular" w:hAnsi="PingFangTC-Regular" w:eastAsia="PingFangTC-Regular" w:cs="PingFangTC-Regular"/>
+                <w:b w:val="0"/>
+                <w:sz w:val="20"/>
+              </w:rPr>
+              <w:t>模型資料層與預測頁</w:t>
+            </w:r>
+          </w:p>
+        </w:tc>
+        <w:tc>
+          <w:tcPr>
+            <w:tcW w:type="dxa" w:w="1040"/>
+          </w:tcPr>
+          <w:p>
+            <w:pPr>
+              <w:jc w:val="left"/>
+            </w:pPr>
+            <w:r>
+              <w:rPr>
+                <w:rFonts w:ascii="PingFangTC-Regular" w:hAnsi="PingFangTC-Regular" w:eastAsia="PingFangTC-Regular" w:cs="PingFangTC-Regular"/>
+                <w:b w:val="0"/>
+                <w:sz w:val="20"/>
+              </w:rPr>
+            </w:r>
+          </w:p>
+        </w:tc>
+        <w:tc>
+          <w:tcPr>
+            <w:tcW w:type="dxa" w:w="1040"/>
+          </w:tcPr>
+          <w:p>
+            <w:pPr>
+              <w:jc w:val="left"/>
+            </w:pPr>
+            <w:r>
+              <w:rPr>
+                <w:rFonts w:ascii="PingFangTC-Regular" w:hAnsi="PingFangTC-Regular" w:eastAsia="PingFangTC-Regular" w:cs="PingFangTC-Regular"/>
+                <w:b w:val="0"/>
+                <w:sz w:val="20"/>
+              </w:rPr>
+            </w:r>
+          </w:p>
+        </w:tc>
+      </w:tr>
     </w:tbl>
     <w:p>
       <w:pPr>
@@ -4068,6 +4618,154 @@
           </w:p>
         </w:tc>
       </w:tr>
+      <w:tr>
+        <w:tc>
+          <w:tcPr>
+            <w:tcW w:type="dxa" w:w="2340"/>
+          </w:tcPr>
+          <w:p>
+            <w:pPr>
+              <w:jc w:val="left"/>
+            </w:pPr>
+            <w:r>
+              <w:rPr>
+                <w:rFonts w:ascii="PingFangTC-Regular" w:hAnsi="PingFangTC-Regular" w:eastAsia="PingFangTC-Regular" w:cs="PingFangTC-Regular"/>
+                <w:b w:val="0"/>
+                <w:sz w:val="20"/>
+              </w:rPr>
+              <w:t>2026-07-17</w:t>
+            </w:r>
+          </w:p>
+        </w:tc>
+        <w:tc>
+          <w:tcPr>
+            <w:tcW w:type="dxa" w:w="2340"/>
+          </w:tcPr>
+          <w:p>
+            <w:pPr>
+              <w:jc w:val="left"/>
+            </w:pPr>
+            <w:r>
+              <w:rPr>
+                <w:rFonts w:ascii="PingFangTC-Regular" w:hAnsi="PingFangTC-Regular" w:eastAsia="PingFangTC-Regular" w:cs="PingFangTC-Regular"/>
+                <w:b w:val="0"/>
+                <w:sz w:val="20"/>
+              </w:rPr>
+              <w:t>記錄資料健康檢查增加最新掃描時間</w:t>
+            </w:r>
+          </w:p>
+        </w:tc>
+        <w:tc>
+          <w:tcPr>
+            <w:tcW w:type="dxa" w:w="2340"/>
+          </w:tcPr>
+          <w:p>
+            <w:pPr>
+              <w:jc w:val="left"/>
+            </w:pPr>
+            <w:r>
+              <w:rPr>
+                <w:rFonts w:ascii="PingFangTC-Regular" w:hAnsi="PingFangTC-Regular" w:eastAsia="PingFangTC-Regular" w:cs="PingFangTC-Regular"/>
+                <w:b w:val="0"/>
+                <w:sz w:val="20"/>
+              </w:rPr>
+              <w:t>區分資料日期與系統掃描狀態</w:t>
+            </w:r>
+          </w:p>
+        </w:tc>
+        <w:tc>
+          <w:tcPr>
+            <w:tcW w:type="dxa" w:w="2340"/>
+          </w:tcPr>
+          <w:p>
+            <w:pPr>
+              <w:jc w:val="left"/>
+            </w:pPr>
+            <w:r>
+              <w:rPr>
+                <w:rFonts w:ascii="PingFangTC-Regular" w:hAnsi="PingFangTC-Regular" w:eastAsia="PingFangTC-Regular" w:cs="PingFangTC-Regular"/>
+                <w:b w:val="0"/>
+                <w:sz w:val="20"/>
+              </w:rPr>
+              <w:t>使用者確認</w:t>
+            </w:r>
+          </w:p>
+        </w:tc>
+      </w:tr>
+      <w:tr>
+        <w:tc>
+          <w:tcPr>
+            <w:tcW w:type="dxa" w:w="2340"/>
+          </w:tcPr>
+          <w:p>
+            <w:pPr>
+              <w:jc w:val="left"/>
+            </w:pPr>
+            <w:r>
+              <w:rPr>
+                <w:rFonts w:ascii="PingFangTC-Regular" w:hAnsi="PingFangTC-Regular" w:eastAsia="PingFangTC-Regular" w:cs="PingFangTC-Regular"/>
+                <w:b w:val="0"/>
+                <w:sz w:val="20"/>
+              </w:rPr>
+              <w:t>2026-07-17</w:t>
+            </w:r>
+          </w:p>
+        </w:tc>
+        <w:tc>
+          <w:tcPr>
+            <w:tcW w:type="dxa" w:w="2340"/>
+          </w:tcPr>
+          <w:p>
+            <w:pPr>
+              <w:jc w:val="left"/>
+            </w:pPr>
+            <w:r>
+              <w:rPr>
+                <w:rFonts w:ascii="PingFangTC-Regular" w:hAnsi="PingFangTC-Regular" w:eastAsia="PingFangTC-Regular" w:cs="PingFangTC-Regular"/>
+                <w:b w:val="0"/>
+                <w:sz w:val="20"/>
+              </w:rPr>
+              <w:t>完成資料健康掃描欄位與 LSTM 訓練/監控分層</w:t>
+            </w:r>
+          </w:p>
+        </w:tc>
+        <w:tc>
+          <w:tcPr>
+            <w:tcW w:type="dxa" w:w="2340"/>
+          </w:tcPr>
+          <w:p>
+            <w:pPr>
+              <w:jc w:val="left"/>
+            </w:pPr>
+            <w:r>
+              <w:rPr>
+                <w:rFonts w:ascii="PingFangTC-Regular" w:hAnsi="PingFangTC-Regular" w:eastAsia="PingFangTC-Regular" w:cs="PingFangTC-Regular"/>
+                <w:b w:val="0"/>
+                <w:sz w:val="20"/>
+              </w:rPr>
+              <w:t>避免事件窗誤判與六小時更新覆蓋模型資料</w:t>
+            </w:r>
+          </w:p>
+        </w:tc>
+        <w:tc>
+          <w:tcPr>
+            <w:tcW w:type="dxa" w:w="2340"/>
+          </w:tcPr>
+          <w:p>
+            <w:pPr>
+              <w:jc w:val="left"/>
+            </w:pPr>
+            <w:r>
+              <w:rPr>
+                <w:rFonts w:ascii="PingFangTC-Regular" w:hAnsi="PingFangTC-Regular" w:eastAsia="PingFangTC-Regular" w:cs="PingFangTC-Regular"/>
+                <w:b w:val="0"/>
+                <w:sz w:val="20"/>
+              </w:rPr>
+              <w:t>使用者確認</w:t>
+            </w:r>
+          </w:p>
+        </w:tc>
+      </w:tr>
     </w:tbl>
     <w:p>
       <w:pPr>

</xml_diff>

<commit_message>
Add durable confirmed-decision memory updates
</commit_message>
<xml_diff>
--- a/data/觀察版資料/13_專案記憶/專案記憶與討論摘要.docx
+++ b/data/觀察版資料/13_專案記憶/專案記憶與討論摘要.docx
@@ -26,7 +26,7 @@
           <w:b w:val="0"/>
           <w:sz w:val="20"/>
         </w:rPr>
-        <w:t>產生時間：2026-07-24 05:22 UTC｜來源：專案記憶資料夾</w:t>
+        <w:t>產生時間：2026-07-24 06:32 UTC｜來源：專案記憶資料夾</w:t>
       </w:r>
     </w:p>
     <w:p>
@@ -156,7 +156,7 @@
                 <w:b w:val="0"/>
                 <w:sz w:val="20"/>
               </w:rPr>
-              <w:t>9</w:t>
+              <w:t>12</w:t>
             </w:r>
           </w:p>
         </w:tc>
@@ -212,7 +212,7 @@
                 <w:b w:val="0"/>
                 <w:sz w:val="20"/>
               </w:rPr>
-              <w:t>9</w:t>
+              <w:t>11</w:t>
             </w:r>
           </w:p>
         </w:tc>
@@ -268,7 +268,7 @@
                 <w:b w:val="0"/>
                 <w:sz w:val="20"/>
               </w:rPr>
-              <w:t>0</w:t>
+              <w:t>1</w:t>
             </w:r>
           </w:p>
         </w:tc>
@@ -324,7 +324,7 @@
                 <w:b w:val="0"/>
                 <w:sz w:val="20"/>
               </w:rPr>
-              <w:t>2026-07-17</w:t>
+              <w:t>2026-07-24</w:t>
             </w:r>
           </w:p>
         </w:tc>
@@ -444,6 +444,228 @@
                 <w:sz w:val="20"/>
               </w:rPr>
               <w:t>狀態</w:t>
+            </w:r>
+          </w:p>
+        </w:tc>
+      </w:tr>
+      <w:tr>
+        <w:tc>
+          <w:tcPr>
+            <w:tcW w:type="dxa" w:w="2340"/>
+          </w:tcPr>
+          <w:p>
+            <w:pPr>
+              <w:jc w:val="left"/>
+            </w:pPr>
+            <w:r>
+              <w:rPr>
+                <w:rFonts w:ascii="PingFangTC-Regular" w:hAnsi="PingFangTC-Regular" w:eastAsia="PingFangTC-Regular" w:cs="PingFangTC-Regular"/>
+                <w:b w:val="0"/>
+                <w:sz w:val="20"/>
+              </w:rPr>
+              <w:t>決策</w:t>
+            </w:r>
+          </w:p>
+        </w:tc>
+        <w:tc>
+          <w:tcPr>
+            <w:tcW w:type="dxa" w:w="2340"/>
+          </w:tcPr>
+          <w:p>
+            <w:pPr>
+              <w:jc w:val="left"/>
+            </w:pPr>
+            <w:r>
+              <w:rPr>
+                <w:rFonts w:ascii="PingFangTC-Regular" w:hAnsi="PingFangTC-Regular" w:eastAsia="PingFangTC-Regular" w:cs="PingFangTC-Regular"/>
+                <w:b w:val="0"/>
+                <w:sz w:val="20"/>
+              </w:rPr>
+              <w:t>2026-07-24</w:t>
+            </w:r>
+          </w:p>
+        </w:tc>
+        <w:tc>
+          <w:tcPr>
+            <w:tcW w:type="dxa" w:w="2340"/>
+          </w:tcPr>
+          <w:p>
+            <w:pPr>
+              <w:jc w:val="left"/>
+            </w:pPr>
+            <w:r>
+              <w:rPr>
+                <w:rFonts w:ascii="PingFangTC-Regular" w:hAnsi="PingFangTC-Regular" w:eastAsia="PingFangTC-Regular" w:cs="PingFangTC-Regular"/>
+                <w:b w:val="0"/>
+                <w:sz w:val="20"/>
+              </w:rPr>
+              <w:t>KG 預測 V2 多因子趨勢觀察</w:t>
+            </w:r>
+          </w:p>
+        </w:tc>
+        <w:tc>
+          <w:tcPr>
+            <w:tcW w:type="dxa" w:w="2340"/>
+          </w:tcPr>
+          <w:p>
+            <w:pPr>
+              <w:jc w:val="left"/>
+            </w:pPr>
+            <w:r>
+              <w:rPr>
+                <w:rFonts w:ascii="PingFangTC-Regular" w:hAnsi="PingFangTC-Regular" w:eastAsia="PingFangTC-Regular" w:cs="PingFangTC-Regular"/>
+                <w:b w:val="0"/>
+                <w:sz w:val="20"/>
+              </w:rPr>
+              <w:t>已執行</w:t>
+            </w:r>
+          </w:p>
+        </w:tc>
+      </w:tr>
+      <w:tr>
+        <w:tc>
+          <w:tcPr>
+            <w:tcW w:type="dxa" w:w="2340"/>
+          </w:tcPr>
+          <w:p>
+            <w:pPr>
+              <w:jc w:val="left"/>
+            </w:pPr>
+            <w:r>
+              <w:rPr>
+                <w:rFonts w:ascii="PingFangTC-Regular" w:hAnsi="PingFangTC-Regular" w:eastAsia="PingFangTC-Regular" w:cs="PingFangTC-Regular"/>
+                <w:b w:val="0"/>
+                <w:sz w:val="20"/>
+              </w:rPr>
+              <w:t>決策</w:t>
+            </w:r>
+          </w:p>
+        </w:tc>
+        <w:tc>
+          <w:tcPr>
+            <w:tcW w:type="dxa" w:w="2340"/>
+          </w:tcPr>
+          <w:p>
+            <w:pPr>
+              <w:jc w:val="left"/>
+            </w:pPr>
+            <w:r>
+              <w:rPr>
+                <w:rFonts w:ascii="PingFangTC-Regular" w:hAnsi="PingFangTC-Regular" w:eastAsia="PingFangTC-Regular" w:cs="PingFangTC-Regular"/>
+                <w:b w:val="0"/>
+                <w:sz w:val="20"/>
+              </w:rPr>
+              <w:t>2026-07-24</w:t>
+            </w:r>
+          </w:p>
+        </w:tc>
+        <w:tc>
+          <w:tcPr>
+            <w:tcW w:type="dxa" w:w="2340"/>
+          </w:tcPr>
+          <w:p>
+            <w:pPr>
+              <w:jc w:val="left"/>
+            </w:pPr>
+            <w:r>
+              <w:rPr>
+                <w:rFonts w:ascii="PingFangTC-Regular" w:hAnsi="PingFangTC-Regular" w:eastAsia="PingFangTC-Regular" w:cs="PingFangTC-Regular"/>
+                <w:b w:val="0"/>
+                <w:sz w:val="20"/>
+              </w:rPr>
+              <w:t>專案記憶受控寫入流程</w:t>
+            </w:r>
+          </w:p>
+        </w:tc>
+        <w:tc>
+          <w:tcPr>
+            <w:tcW w:type="dxa" w:w="2340"/>
+          </w:tcPr>
+          <w:p>
+            <w:pPr>
+              <w:jc w:val="left"/>
+            </w:pPr>
+            <w:r>
+              <w:rPr>
+                <w:rFonts w:ascii="PingFangTC-Regular" w:hAnsi="PingFangTC-Regular" w:eastAsia="PingFangTC-Regular" w:cs="PingFangTC-Regular"/>
+                <w:b w:val="0"/>
+                <w:sz w:val="20"/>
+              </w:rPr>
+              <w:t>已執行</w:t>
+            </w:r>
+          </w:p>
+        </w:tc>
+      </w:tr>
+      <w:tr>
+        <w:tc>
+          <w:tcPr>
+            <w:tcW w:type="dxa" w:w="2340"/>
+          </w:tcPr>
+          <w:p>
+            <w:pPr>
+              <w:jc w:val="left"/>
+            </w:pPr>
+            <w:r>
+              <w:rPr>
+                <w:rFonts w:ascii="PingFangTC-Regular" w:hAnsi="PingFangTC-Regular" w:eastAsia="PingFangTC-Regular" w:cs="PingFangTC-Regular"/>
+                <w:b w:val="0"/>
+                <w:sz w:val="20"/>
+              </w:rPr>
+              <w:t>決策</w:t>
+            </w:r>
+          </w:p>
+        </w:tc>
+        <w:tc>
+          <w:tcPr>
+            <w:tcW w:type="dxa" w:w="2340"/>
+          </w:tcPr>
+          <w:p>
+            <w:pPr>
+              <w:jc w:val="left"/>
+            </w:pPr>
+            <w:r>
+              <w:rPr>
+                <w:rFonts w:ascii="PingFangTC-Regular" w:hAnsi="PingFangTC-Regular" w:eastAsia="PingFangTC-Regular" w:cs="PingFangTC-Regular"/>
+                <w:b w:val="0"/>
+                <w:sz w:val="20"/>
+              </w:rPr>
+              <w:t>2026-07-24</w:t>
+            </w:r>
+          </w:p>
+        </w:tc>
+        <w:tc>
+          <w:tcPr>
+            <w:tcW w:type="dxa" w:w="2340"/>
+          </w:tcPr>
+          <w:p>
+            <w:pPr>
+              <w:jc w:val="left"/>
+            </w:pPr>
+            <w:r>
+              <w:rPr>
+                <w:rFonts w:ascii="PingFangTC-Regular" w:hAnsi="PingFangTC-Regular" w:eastAsia="PingFangTC-Regular" w:cs="PingFangTC-Regular"/>
+                <w:b w:val="0"/>
+                <w:sz w:val="20"/>
+              </w:rPr>
+              <w:t>分層隨機歷史回測與多來源資料方向</w:t>
+            </w:r>
+          </w:p>
+        </w:tc>
+        <w:tc>
+          <w:tcPr>
+            <w:tcW w:type="dxa" w:w="2340"/>
+          </w:tcPr>
+          <w:p>
+            <w:pPr>
+              <w:jc w:val="left"/>
+            </w:pPr>
+            <w:r>
+              <w:rPr>
+                <w:rFonts w:ascii="PingFangTC-Regular" w:hAnsi="PingFangTC-Regular" w:eastAsia="PingFangTC-Regular" w:cs="PingFangTC-Regular"/>
+                <w:b w:val="0"/>
+                <w:sz w:val="20"/>
+              </w:rPr>
+              <w:t>待執行</w:t>
             </w:r>
           </w:p>
         </w:tc>
@@ -611,7 +833,7 @@
                 <w:b w:val="0"/>
                 <w:sz w:val="20"/>
               </w:rPr>
-              <w:t>決策</w:t>
+              <w:t>記憶更新</w:t>
             </w:r>
           </w:p>
         </w:tc>
@@ -629,7 +851,7 @@
                 <w:b w:val="0"/>
                 <w:sz w:val="20"/>
               </w:rPr>
-              <w:t>2026-07-15</w:t>
+              <w:t>2026-07-24</w:t>
             </w:r>
           </w:p>
         </w:tc>
@@ -647,7 +869,7 @@
                 <w:b w:val="0"/>
                 <w:sz w:val="20"/>
               </w:rPr>
-              <w:t>建立專案記憶系統</w:t>
+              <w:t>KG 預測 V2 多因子趨勢觀察</w:t>
             </w:r>
           </w:p>
         </w:tc>
@@ -665,7 +887,7 @@
                 <w:b w:val="0"/>
                 <w:sz w:val="20"/>
               </w:rPr>
-              <w:t>已執行</w:t>
+              <w:t>Codex 已確認決策</w:t>
             </w:r>
           </w:p>
         </w:tc>
@@ -685,7 +907,7 @@
                 <w:b w:val="0"/>
                 <w:sz w:val="20"/>
               </w:rPr>
-              <w:t>決策</w:t>
+              <w:t>記憶更新</w:t>
             </w:r>
           </w:p>
         </w:tc>
@@ -703,7 +925,7 @@
                 <w:b w:val="0"/>
                 <w:sz w:val="20"/>
               </w:rPr>
-              <w:t>2026-05-23</w:t>
+              <w:t>2026-07-24</w:t>
             </w:r>
           </w:p>
         </w:tc>
@@ -721,7 +943,7 @@
                 <w:b w:val="0"/>
                 <w:sz w:val="20"/>
               </w:rPr>
-              <w:t>資料治理採分層處理</w:t>
+              <w:t>專案記憶受控寫入流程</w:t>
             </w:r>
           </w:p>
         </w:tc>
@@ -739,7 +961,7 @@
                 <w:b w:val="0"/>
                 <w:sz w:val="20"/>
               </w:rPr>
-              <w:t>已執行</w:t>
+              <w:t>Codex 已確認決策</w:t>
             </w:r>
           </w:p>
         </w:tc>
@@ -759,7 +981,7 @@
                 <w:b w:val="0"/>
                 <w:sz w:val="20"/>
               </w:rPr>
-              <w:t>決策</w:t>
+              <w:t>記憶更新</w:t>
             </w:r>
           </w:p>
         </w:tc>
@@ -777,7 +999,7 @@
                 <w:b w:val="0"/>
                 <w:sz w:val="20"/>
               </w:rPr>
-              <w:t>2026-05-22</w:t>
+              <w:t>2026-07-24</w:t>
             </w:r>
           </w:p>
         </w:tc>
@@ -795,7 +1017,7 @@
                 <w:b w:val="0"/>
                 <w:sz w:val="20"/>
               </w:rPr>
-              <w:t>建立 KG v2 基礎架構</w:t>
+              <w:t>分層隨機歷史回測與多來源資料方向</w:t>
             </w:r>
           </w:p>
         </w:tc>
@@ -813,7 +1035,7 @@
                 <w:b w:val="0"/>
                 <w:sz w:val="20"/>
               </w:rPr>
-              <w:t>已執行</w:t>
+              <w:t>Codex 已確認決策</w:t>
             </w:r>
           </w:p>
         </w:tc>
@@ -944,228 +1166,6 @@
                 <w:sz w:val="20"/>
               </w:rPr>
               <w:t>完成資料健康掃描欄位與 LSTM 訓練/監控分層</w:t>
-            </w:r>
-          </w:p>
-        </w:tc>
-        <w:tc>
-          <w:tcPr>
-            <w:tcW w:type="dxa" w:w="2340"/>
-          </w:tcPr>
-          <w:p>
-            <w:pPr>
-              <w:jc w:val="left"/>
-            </w:pPr>
-            <w:r>
-              <w:rPr>
-                <w:rFonts w:ascii="PingFangTC-Regular" w:hAnsi="PingFangTC-Regular" w:eastAsia="PingFangTC-Regular" w:cs="PingFangTC-Regular"/>
-                <w:b w:val="0"/>
-                <w:sz w:val="20"/>
-              </w:rPr>
-              <w:t>使用者確認</w:t>
-            </w:r>
-          </w:p>
-        </w:tc>
-      </w:tr>
-      <w:tr>
-        <w:tc>
-          <w:tcPr>
-            <w:tcW w:type="dxa" w:w="2340"/>
-          </w:tcPr>
-          <w:p>
-            <w:pPr>
-              <w:jc w:val="left"/>
-            </w:pPr>
-            <w:r>
-              <w:rPr>
-                <w:rFonts w:ascii="PingFangTC-Regular" w:hAnsi="PingFangTC-Regular" w:eastAsia="PingFangTC-Regular" w:cs="PingFangTC-Regular"/>
-                <w:b w:val="0"/>
-                <w:sz w:val="20"/>
-              </w:rPr>
-              <w:t>記憶更新</w:t>
-            </w:r>
-          </w:p>
-        </w:tc>
-        <w:tc>
-          <w:tcPr>
-            <w:tcW w:type="dxa" w:w="2340"/>
-          </w:tcPr>
-          <w:p>
-            <w:pPr>
-              <w:jc w:val="left"/>
-            </w:pPr>
-            <w:r>
-              <w:rPr>
-                <w:rFonts w:ascii="PingFangTC-Regular" w:hAnsi="PingFangTC-Regular" w:eastAsia="PingFangTC-Regular" w:cs="PingFangTC-Regular"/>
-                <w:b w:val="0"/>
-                <w:sz w:val="20"/>
-              </w:rPr>
-              <w:t>2026-07-15</w:t>
-            </w:r>
-          </w:p>
-        </w:tc>
-        <w:tc>
-          <w:tcPr>
-            <w:tcW w:type="dxa" w:w="2340"/>
-          </w:tcPr>
-          <w:p>
-            <w:pPr>
-              <w:jc w:val="left"/>
-            </w:pPr>
-            <w:r>
-              <w:rPr>
-                <w:rFonts w:ascii="PingFangTC-Regular" w:hAnsi="PingFangTC-Regular" w:eastAsia="PingFangTC-Regular" w:cs="PingFangTC-Regular"/>
-                <w:b w:val="0"/>
-                <w:sz w:val="20"/>
-              </w:rPr>
-              <w:t>建立專案記憶目錄與初始檔案</w:t>
-            </w:r>
-          </w:p>
-        </w:tc>
-        <w:tc>
-          <w:tcPr>
-            <w:tcW w:type="dxa" w:w="2340"/>
-          </w:tcPr>
-          <w:p>
-            <w:pPr>
-              <w:jc w:val="left"/>
-            </w:pPr>
-            <w:r>
-              <w:rPr>
-                <w:rFonts w:ascii="PingFangTC-Regular" w:hAnsi="PingFangTC-Regular" w:eastAsia="PingFangTC-Regular" w:cs="PingFangTC-Regular"/>
-                <w:b w:val="0"/>
-                <w:sz w:val="20"/>
-              </w:rPr>
-              <w:t>使用者確認</w:t>
-            </w:r>
-          </w:p>
-        </w:tc>
-      </w:tr>
-      <w:tr>
-        <w:tc>
-          <w:tcPr>
-            <w:tcW w:type="dxa" w:w="2340"/>
-          </w:tcPr>
-          <w:p>
-            <w:pPr>
-              <w:jc w:val="left"/>
-            </w:pPr>
-            <w:r>
-              <w:rPr>
-                <w:rFonts w:ascii="PingFangTC-Regular" w:hAnsi="PingFangTC-Regular" w:eastAsia="PingFangTC-Regular" w:cs="PingFangTC-Regular"/>
-                <w:b w:val="0"/>
-                <w:sz w:val="20"/>
-              </w:rPr>
-              <w:t>記憶更新</w:t>
-            </w:r>
-          </w:p>
-        </w:tc>
-        <w:tc>
-          <w:tcPr>
-            <w:tcW w:type="dxa" w:w="2340"/>
-          </w:tcPr>
-          <w:p>
-            <w:pPr>
-              <w:jc w:val="left"/>
-            </w:pPr>
-            <w:r>
-              <w:rPr>
-                <w:rFonts w:ascii="PingFangTC-Regular" w:hAnsi="PingFangTC-Regular" w:eastAsia="PingFangTC-Regular" w:cs="PingFangTC-Regular"/>
-                <w:b w:val="0"/>
-                <w:sz w:val="20"/>
-              </w:rPr>
-              <w:t>2026-07-15</w:t>
-            </w:r>
-          </w:p>
-        </w:tc>
-        <w:tc>
-          <w:tcPr>
-            <w:tcW w:type="dxa" w:w="2340"/>
-          </w:tcPr>
-          <w:p>
-            <w:pPr>
-              <w:jc w:val="left"/>
-            </w:pPr>
-            <w:r>
-              <w:rPr>
-                <w:rFonts w:ascii="PingFangTC-Regular" w:hAnsi="PingFangTC-Regular" w:eastAsia="PingFangTC-Regular" w:cs="PingFangTC-Regular"/>
-                <w:b w:val="0"/>
-                <w:sz w:val="20"/>
-              </w:rPr>
-              <w:t>加入 Word 摘要輸出需求</w:t>
-            </w:r>
-          </w:p>
-        </w:tc>
-        <w:tc>
-          <w:tcPr>
-            <w:tcW w:type="dxa" w:w="2340"/>
-          </w:tcPr>
-          <w:p>
-            <w:pPr>
-              <w:jc w:val="left"/>
-            </w:pPr>
-            <w:r>
-              <w:rPr>
-                <w:rFonts w:ascii="PingFangTC-Regular" w:hAnsi="PingFangTC-Regular" w:eastAsia="PingFangTC-Regular" w:cs="PingFangTC-Regular"/>
-                <w:b w:val="0"/>
-                <w:sz w:val="20"/>
-              </w:rPr>
-              <w:t>使用者確認</w:t>
-            </w:r>
-          </w:p>
-        </w:tc>
-      </w:tr>
-      <w:tr>
-        <w:tc>
-          <w:tcPr>
-            <w:tcW w:type="dxa" w:w="2340"/>
-          </w:tcPr>
-          <w:p>
-            <w:pPr>
-              <w:jc w:val="left"/>
-            </w:pPr>
-            <w:r>
-              <w:rPr>
-                <w:rFonts w:ascii="PingFangTC-Regular" w:hAnsi="PingFangTC-Regular" w:eastAsia="PingFangTC-Regular" w:cs="PingFangTC-Regular"/>
-                <w:b w:val="0"/>
-                <w:sz w:val="20"/>
-              </w:rPr>
-              <w:t>記憶更新</w:t>
-            </w:r>
-          </w:p>
-        </w:tc>
-        <w:tc>
-          <w:tcPr>
-            <w:tcW w:type="dxa" w:w="2340"/>
-          </w:tcPr>
-          <w:p>
-            <w:pPr>
-              <w:jc w:val="left"/>
-            </w:pPr>
-            <w:r>
-              <w:rPr>
-                <w:rFonts w:ascii="PingFangTC-Regular" w:hAnsi="PingFangTC-Regular" w:eastAsia="PingFangTC-Regular" w:cs="PingFangTC-Regular"/>
-                <w:b w:val="0"/>
-                <w:sz w:val="20"/>
-              </w:rPr>
-              <w:t>2026-07-15</w:t>
-            </w:r>
-          </w:p>
-        </w:tc>
-        <w:tc>
-          <w:tcPr>
-            <w:tcW w:type="dxa" w:w="2340"/>
-          </w:tcPr>
-          <w:p>
-            <w:pPr>
-              <w:jc w:val="left"/>
-            </w:pPr>
-            <w:r>
-              <w:rPr>
-                <w:rFonts w:ascii="PingFangTC-Regular" w:hAnsi="PingFangTC-Regular" w:eastAsia="PingFangTC-Regular" w:cs="PingFangTC-Regular"/>
-                <w:b w:val="0"/>
-                <w:sz w:val="20"/>
-              </w:rPr>
-              <w:t>規劃 Streamlit 專案記憶頁籤</w:t>
             </w:r>
           </w:p>
         </w:tc>
@@ -1669,6 +1669,87 @@
           <w:sz w:val="22"/>
         </w:rPr>
         <w:t>規則化結果可以先跑，AI 只在真正能增加資訊密度時再介入。</w:t>
+      </w:r>
+    </w:p>
+    <w:p>
+      <w:pPr>
+        <w:spacing w:before="200" w:after="120"/>
+      </w:pPr>
+      <w:r>
+        <w:rPr>
+          <w:rFonts w:ascii="PingFangTC-Regular" w:hAnsi="PingFangTC-Regular" w:eastAsia="PingFangTC-Regular" w:cs="PingFangTC-Regular"/>
+          <w:b w:val="0"/>
+          <w:sz w:val="26"/>
+        </w:rPr>
+        <w:t>2026-07-24｜KG 預測 V2 多因子趨勢觀察</w:t>
+      </w:r>
+    </w:p>
+    <w:p>
+      <w:pPr>
+        <w:pStyle w:val="ListBullet"/>
+        <w:spacing w:after="60" w:line="276" w:lineRule="auto"/>
+      </w:pPr>
+      <w:r>
+        <w:rPr>
+          <w:rFonts w:ascii="PingFangTC-Regular" w:hAnsi="PingFangTC-Regular" w:eastAsia="PingFangTC-Regular" w:cs="PingFangTC-Regular"/>
+          <w:b w:val="0"/>
+          <w:sz w:val="22"/>
+        </w:rPr>
+        <w:t>KG 預測採版本化資料集。V2 使用五因子投票與跨來源門檻；來源不足時顯示資料不足，V1 歷史不得覆寫。</w:t>
+      </w:r>
+    </w:p>
+    <w:p>
+      <w:pPr>
+        <w:spacing w:before="200" w:after="120"/>
+      </w:pPr>
+      <w:r>
+        <w:rPr>
+          <w:rFonts w:ascii="PingFangTC-Regular" w:hAnsi="PingFangTC-Regular" w:eastAsia="PingFangTC-Regular" w:cs="PingFangTC-Regular"/>
+          <w:b w:val="0"/>
+          <w:sz w:val="26"/>
+        </w:rPr>
+        <w:t>2026-07-24｜專案記憶受控寫入流程</w:t>
+      </w:r>
+    </w:p>
+    <w:p>
+      <w:pPr>
+        <w:pStyle w:val="ListBullet"/>
+        <w:spacing w:after="60" w:line="276" w:lineRule="auto"/>
+      </w:pPr>
+      <w:r>
+        <w:rPr>
+          <w:rFonts w:ascii="PingFangTC-Regular" w:hAnsi="PingFangTC-Regular" w:eastAsia="PingFangTC-Regular" w:cs="PingFangTC-Regular"/>
+          <w:b w:val="0"/>
+          <w:sz w:val="22"/>
+        </w:rPr>
+        <w:t>專案記憶只保存已確認、可回溯且不含敏感資訊的內容。GitHub Actions 僅負責雲端保存與 Word 匯出，不推論聊天決策。</w:t>
+      </w:r>
+    </w:p>
+    <w:p>
+      <w:pPr>
+        <w:spacing w:before="200" w:after="120"/>
+      </w:pPr>
+      <w:r>
+        <w:rPr>
+          <w:rFonts w:ascii="PingFangTC-Regular" w:hAnsi="PingFangTC-Regular" w:eastAsia="PingFangTC-Regular" w:cs="PingFangTC-Regular"/>
+          <w:b w:val="0"/>
+          <w:sz w:val="26"/>
+        </w:rPr>
+        <w:t>2026-07-24｜分層隨機歷史回測與多來源資料方向</w:t>
+      </w:r>
+    </w:p>
+    <w:p>
+      <w:pPr>
+        <w:pStyle w:val="ListBullet"/>
+        <w:spacing w:after="60" w:line="276" w:lineRule="auto"/>
+      </w:pPr>
+      <w:r>
+        <w:rPr>
+          <w:rFonts w:ascii="PingFangTC-Regular" w:hAnsi="PingFangTC-Regular" w:eastAsia="PingFangTC-Regular" w:cs="PingFangTC-Regular"/>
+          <w:b w:val="0"/>
+          <w:sz w:val="22"/>
+        </w:rPr>
+        <w:t>長期回測採 point-in-time 原則：只使用當日以前可得的事實、新聞、技術與基本面資料，並以後續實際報酬與回撤驗證。</w:t>
       </w:r>
     </w:p>
     <w:p>
@@ -2290,6 +2371,87 @@
     </w:p>
     <w:p>
       <w:pPr>
+        <w:spacing w:before="200" w:after="120"/>
+      </w:pPr>
+      <w:r>
+        <w:rPr>
+          <w:rFonts w:ascii="PingFangTC-Regular" w:hAnsi="PingFangTC-Regular" w:eastAsia="PingFangTC-Regular" w:cs="PingFangTC-Regular"/>
+          <w:b w:val="0"/>
+          <w:sz w:val="26"/>
+        </w:rPr>
+        <w:t>2026-07-24｜KG 預測 V2 多因子趨勢觀察</w:t>
+      </w:r>
+    </w:p>
+    <w:p>
+      <w:pPr>
+        <w:pStyle w:val="ListBullet"/>
+        <w:spacing w:after="60" w:line="276" w:lineRule="auto"/>
+      </w:pPr>
+      <w:r>
+        <w:rPr>
+          <w:rFonts w:ascii="PingFangTC-Regular" w:hAnsi="PingFangTC-Regular" w:eastAsia="PingFangTC-Regular" w:cs="PingFangTC-Regular"/>
+          <w:b w:val="0"/>
+          <w:sz w:val="22"/>
+        </w:rPr>
+        <w:t>已確認：資料不足必須是正式結果；不再以成功或失敗標示預測，而是保存預測趨勢、實際報酬、回撤與基準方向。</w:t>
+      </w:r>
+    </w:p>
+    <w:p>
+      <w:pPr>
+        <w:spacing w:before="200" w:after="120"/>
+      </w:pPr>
+      <w:r>
+        <w:rPr>
+          <w:rFonts w:ascii="PingFangTC-Regular" w:hAnsi="PingFangTC-Regular" w:eastAsia="PingFangTC-Regular" w:cs="PingFangTC-Regular"/>
+          <w:b w:val="0"/>
+          <w:sz w:val="26"/>
+        </w:rPr>
+        <w:t>2026-07-24｜專案記憶受控寫入流程</w:t>
+      </w:r>
+    </w:p>
+    <w:p>
+      <w:pPr>
+        <w:pStyle w:val="ListBullet"/>
+        <w:spacing w:after="60" w:line="276" w:lineRule="auto"/>
+      </w:pPr>
+      <w:r>
+        <w:rPr>
+          <w:rFonts w:ascii="PingFangTC-Regular" w:hAnsi="PingFangTC-Regular" w:eastAsia="PingFangTC-Regular" w:cs="PingFangTC-Regular"/>
+          <w:b w:val="0"/>
+          <w:sz w:val="22"/>
+        </w:rPr>
+        <w:t>檢查發現舊機制只重建 Word，沒有保存 7 月後半的新討論；已改成由已確認決策寫入器管理。</w:t>
+      </w:r>
+    </w:p>
+    <w:p>
+      <w:pPr>
+        <w:spacing w:before="200" w:after="120"/>
+      </w:pPr>
+      <w:r>
+        <w:rPr>
+          <w:rFonts w:ascii="PingFangTC-Regular" w:hAnsi="PingFangTC-Regular" w:eastAsia="PingFangTC-Regular" w:cs="PingFangTC-Regular"/>
+          <w:b w:val="0"/>
+          <w:sz w:val="26"/>
+        </w:rPr>
+        <w:t>2026-07-24｜分層隨機歷史回測與多來源資料方向</w:t>
+      </w:r>
+    </w:p>
+    <w:p>
+      <w:pPr>
+        <w:pStyle w:val="ListBullet"/>
+        <w:spacing w:after="60" w:line="276" w:lineRule="auto"/>
+      </w:pPr>
+      <w:r>
+        <w:rPr>
+          <w:rFonts w:ascii="PingFangTC-Regular" w:hAnsi="PingFangTC-Regular" w:eastAsia="PingFangTC-Regular" w:cs="PingFangTC-Regular"/>
+          <w:b w:val="0"/>
+          <w:sz w:val="22"/>
+        </w:rPr>
+        <w:t>已確認：目標先抽樣約 500 個分層日期，來源不足時保留資料不足，不強行預測；官方一手資料與多家獨立新聞來源優先。</w:t>
+      </w:r>
+    </w:p>
+    <w:p>
+      <w:pPr>
         <w:spacing w:before="280" w:after="120"/>
       </w:pPr>
       <w:r>
@@ -2560,6 +2722,87 @@
           <w:sz w:val="22"/>
         </w:rPr>
         <w:t>後續若要再擴充功能，優先走「模組化 + 資料治理 + 驗證」路線，避免頁面與程式持續膨脹。</w:t>
+      </w:r>
+    </w:p>
+    <w:p>
+      <w:pPr>
+        <w:spacing w:before="200" w:after="120"/>
+      </w:pPr>
+      <w:r>
+        <w:rPr>
+          <w:rFonts w:ascii="PingFangTC-Regular" w:hAnsi="PingFangTC-Regular" w:eastAsia="PingFangTC-Regular" w:cs="PingFangTC-Regular"/>
+          <w:b w:val="0"/>
+          <w:sz w:val="26"/>
+        </w:rPr>
+        <w:t>2026-07-24｜KG 預測 V2 多因子趨勢觀察</w:t>
+      </w:r>
+    </w:p>
+    <w:p>
+      <w:pPr>
+        <w:pStyle w:val="ListBullet"/>
+        <w:spacing w:after="60" w:line="276" w:lineRule="auto"/>
+      </w:pPr>
+      <w:r>
+        <w:rPr>
+          <w:rFonts w:ascii="PingFangTC-Regular" w:hAnsi="PingFangTC-Regular" w:eastAsia="PingFangTC-Regular" w:cs="PingFangTC-Regular"/>
+          <w:b w:val="0"/>
+          <w:sz w:val="22"/>
+        </w:rPr>
+        <w:t>已執行：KG V2 已部署並建立第一組資料；後續由每 6 小時資料流程新增每日、每週、每月觀察。</w:t>
+      </w:r>
+    </w:p>
+    <w:p>
+      <w:pPr>
+        <w:spacing w:before="200" w:after="120"/>
+      </w:pPr>
+      <w:r>
+        <w:rPr>
+          <w:rFonts w:ascii="PingFangTC-Regular" w:hAnsi="PingFangTC-Regular" w:eastAsia="PingFangTC-Regular" w:cs="PingFangTC-Regular"/>
+          <w:b w:val="0"/>
+          <w:sz w:val="26"/>
+        </w:rPr>
+        <w:t>2026-07-24｜專案記憶受控寫入流程</w:t>
+      </w:r>
+    </w:p>
+    <w:p>
+      <w:pPr>
+        <w:pStyle w:val="ListBullet"/>
+        <w:spacing w:after="60" w:line="276" w:lineRule="auto"/>
+      </w:pPr>
+      <w:r>
+        <w:rPr>
+          <w:rFonts w:ascii="PingFangTC-Regular" w:hAnsi="PingFangTC-Regular" w:eastAsia="PingFangTC-Regular" w:cs="PingFangTC-Regular"/>
+          <w:b w:val="0"/>
+          <w:sz w:val="22"/>
+        </w:rPr>
+        <w:t>已執行：新增 scripts/update_project_memory.py；後續每次確認或完成功能時同步更新五份來源檔。</w:t>
+      </w:r>
+    </w:p>
+    <w:p>
+      <w:pPr>
+        <w:spacing w:before="200" w:after="120"/>
+      </w:pPr>
+      <w:r>
+        <w:rPr>
+          <w:rFonts w:ascii="PingFangTC-Regular" w:hAnsi="PingFangTC-Regular" w:eastAsia="PingFangTC-Regular" w:cs="PingFangTC-Regular"/>
+          <w:b w:val="0"/>
+          <w:sz w:val="26"/>
+        </w:rPr>
+        <w:t>2026-07-24｜分層隨機歷史回測與多來源資料方向</w:t>
+      </w:r>
+    </w:p>
+    <w:p>
+      <w:pPr>
+        <w:pStyle w:val="ListBullet"/>
+        <w:spacing w:after="60" w:line="276" w:lineRule="auto"/>
+      </w:pPr>
+      <w:r>
+        <w:rPr>
+          <w:rFonts w:ascii="PingFangTC-Regular" w:hAnsi="PingFangTC-Regular" w:eastAsia="PingFangTC-Regular" w:cs="PingFangTC-Regular"/>
+          <w:b w:val="0"/>
+          <w:sz w:val="22"/>
+        </w:rPr>
+        <w:t>待執行：先盤點可取得的歷史價格、官方事件、基本面與多來源新聞覆蓋，再建立獨立回測資料集，不混入日常正式預測。</w:t>
       </w:r>
     </w:p>
     <w:p>
@@ -4221,6 +4464,495 @@
           </w:p>
         </w:tc>
       </w:tr>
+      <w:tr>
+        <w:tc>
+          <w:tcPr>
+            <w:tcW w:type="dxa" w:w="1040"/>
+          </w:tcPr>
+          <w:p>
+            <w:pPr>
+              <w:jc w:val="left"/>
+            </w:pPr>
+            <w:r>
+              <w:rPr>
+                <w:rFonts w:ascii="PingFangTC-Regular" w:hAnsi="PingFangTC-Regular" w:eastAsia="PingFangTC-Regular" w:cs="PingFangTC-Regular"/>
+                <w:b w:val="0"/>
+                <w:sz w:val="20"/>
+              </w:rPr>
+              <w:t>D-010</w:t>
+            </w:r>
+          </w:p>
+        </w:tc>
+        <w:tc>
+          <w:tcPr>
+            <w:tcW w:type="dxa" w:w="1040"/>
+          </w:tcPr>
+          <w:p>
+            <w:pPr>
+              <w:jc w:val="left"/>
+            </w:pPr>
+            <w:r>
+              <w:rPr>
+                <w:rFonts w:ascii="PingFangTC-Regular" w:hAnsi="PingFangTC-Regular" w:eastAsia="PingFangTC-Regular" w:cs="PingFangTC-Regular"/>
+                <w:b w:val="0"/>
+                <w:sz w:val="20"/>
+              </w:rPr>
+              <w:t>2026-07-24</w:t>
+            </w:r>
+          </w:p>
+        </w:tc>
+        <w:tc>
+          <w:tcPr>
+            <w:tcW w:type="dxa" w:w="1040"/>
+          </w:tcPr>
+          <w:p>
+            <w:pPr>
+              <w:jc w:val="left"/>
+            </w:pPr>
+            <w:r>
+              <w:rPr>
+                <w:rFonts w:ascii="PingFangTC-Regular" w:hAnsi="PingFangTC-Regular" w:eastAsia="PingFangTC-Regular" w:cs="PingFangTC-Regular"/>
+                <w:b w:val="0"/>
+                <w:sz w:val="20"/>
+              </w:rPr>
+              <w:t>已執行</w:t>
+            </w:r>
+          </w:p>
+        </w:tc>
+        <w:tc>
+          <w:tcPr>
+            <w:tcW w:type="dxa" w:w="1040"/>
+          </w:tcPr>
+          <w:p>
+            <w:pPr>
+              <w:jc w:val="left"/>
+            </w:pPr>
+            <w:r>
+              <w:rPr>
+                <w:rFonts w:ascii="PingFangTC-Regular" w:hAnsi="PingFangTC-Regular" w:eastAsia="PingFangTC-Regular" w:cs="PingFangTC-Regular"/>
+                <w:b w:val="0"/>
+                <w:sz w:val="20"/>
+              </w:rPr>
+              <w:t>知識圖譜</w:t>
+            </w:r>
+          </w:p>
+        </w:tc>
+        <w:tc>
+          <w:tcPr>
+            <w:tcW w:type="dxa" w:w="1040"/>
+          </w:tcPr>
+          <w:p>
+            <w:pPr>
+              <w:jc w:val="left"/>
+            </w:pPr>
+            <w:r>
+              <w:rPr>
+                <w:rFonts w:ascii="PingFangTC-Regular" w:hAnsi="PingFangTC-Regular" w:eastAsia="PingFangTC-Regular" w:cs="PingFangTC-Regular"/>
+                <w:b w:val="0"/>
+                <w:sz w:val="20"/>
+              </w:rPr>
+              <w:t>KG 預測 V2 多因子趨勢觀察</w:t>
+            </w:r>
+          </w:p>
+        </w:tc>
+        <w:tc>
+          <w:tcPr>
+            <w:tcW w:type="dxa" w:w="1040"/>
+          </w:tcPr>
+          <w:p>
+            <w:pPr>
+              <w:jc w:val="left"/>
+            </w:pPr>
+            <w:r>
+              <w:rPr>
+                <w:rFonts w:ascii="PingFangTC-Regular" w:hAnsi="PingFangTC-Regular" w:eastAsia="PingFangTC-Regular" w:cs="PingFangTC-Regular"/>
+                <w:b w:val="0"/>
+                <w:sz w:val="20"/>
+              </w:rPr>
+              <w:t>KG V2 改為事實、敘事、技術、市場壓力與跨來源確認的多因子趨勢觀察；保留 V1，結果以實際報酬與最大回撤呈現。</w:t>
+            </w:r>
+          </w:p>
+        </w:tc>
+        <w:tc>
+          <w:tcPr>
+            <w:tcW w:type="dxa" w:w="1040"/>
+          </w:tcPr>
+          <w:p>
+            <w:pPr>
+              <w:jc w:val="left"/>
+            </w:pPr>
+            <w:r>
+              <w:rPr>
+                <w:rFonts w:ascii="PingFangTC-Regular" w:hAnsi="PingFangTC-Regular" w:eastAsia="PingFangTC-Regular" w:cs="PingFangTC-Regular"/>
+                <w:b w:val="0"/>
+                <w:sz w:val="20"/>
+              </w:rPr>
+              <w:t>降低單一來源與二元命中標籤造成的假確定性，保留可回測的原始數值。</w:t>
+            </w:r>
+          </w:p>
+        </w:tc>
+        <w:tc>
+          <w:tcPr>
+            <w:tcW w:type="dxa" w:w="1040"/>
+          </w:tcPr>
+          <w:p>
+            <w:pPr>
+              <w:jc w:val="left"/>
+            </w:pPr>
+            <w:r>
+              <w:rPr>
+                <w:rFonts w:ascii="PingFangTC-Regular" w:hAnsi="PingFangTC-Regular" w:eastAsia="PingFangTC-Regular" w:cs="PingFangTC-Regular"/>
+                <w:b w:val="0"/>
+                <w:sz w:val="20"/>
+              </w:rPr>
+              <w:t>金融知識圖譜、預測頁、量化數據中心、雲端更新快取</w:t>
+            </w:r>
+          </w:p>
+        </w:tc>
+        <w:tc>
+          <w:tcPr>
+            <w:tcW w:type="dxa" w:w="1040"/>
+          </w:tcPr>
+          <w:p>
+            <w:pPr>
+              <w:jc w:val="left"/>
+            </w:pPr>
+            <w:r>
+              <w:rPr>
+                <w:rFonts w:ascii="PingFangTC-Regular" w:hAnsi="PingFangTC-Regular" w:eastAsia="PingFangTC-Regular" w:cs="PingFangTC-Regular"/>
+                <w:b w:val="0"/>
+                <w:sz w:val="20"/>
+              </w:rPr>
+            </w:r>
+          </w:p>
+        </w:tc>
+      </w:tr>
+      <w:tr>
+        <w:tc>
+          <w:tcPr>
+            <w:tcW w:type="dxa" w:w="1040"/>
+          </w:tcPr>
+          <w:p>
+            <w:pPr>
+              <w:jc w:val="left"/>
+            </w:pPr>
+            <w:r>
+              <w:rPr>
+                <w:rFonts w:ascii="PingFangTC-Regular" w:hAnsi="PingFangTC-Regular" w:eastAsia="PingFangTC-Regular" w:cs="PingFangTC-Regular"/>
+                <w:b w:val="0"/>
+                <w:sz w:val="20"/>
+              </w:rPr>
+              <w:t>D-011</w:t>
+            </w:r>
+          </w:p>
+        </w:tc>
+        <w:tc>
+          <w:tcPr>
+            <w:tcW w:type="dxa" w:w="1040"/>
+          </w:tcPr>
+          <w:p>
+            <w:pPr>
+              <w:jc w:val="left"/>
+            </w:pPr>
+            <w:r>
+              <w:rPr>
+                <w:rFonts w:ascii="PingFangTC-Regular" w:hAnsi="PingFangTC-Regular" w:eastAsia="PingFangTC-Regular" w:cs="PingFangTC-Regular"/>
+                <w:b w:val="0"/>
+                <w:sz w:val="20"/>
+              </w:rPr>
+              <w:t>2026-07-24</w:t>
+            </w:r>
+          </w:p>
+        </w:tc>
+        <w:tc>
+          <w:tcPr>
+            <w:tcW w:type="dxa" w:w="1040"/>
+          </w:tcPr>
+          <w:p>
+            <w:pPr>
+              <w:jc w:val="left"/>
+            </w:pPr>
+            <w:r>
+              <w:rPr>
+                <w:rFonts w:ascii="PingFangTC-Regular" w:hAnsi="PingFangTC-Regular" w:eastAsia="PingFangTC-Regular" w:cs="PingFangTC-Regular"/>
+                <w:b w:val="0"/>
+                <w:sz w:val="20"/>
+              </w:rPr>
+              <w:t>已執行</w:t>
+            </w:r>
+          </w:p>
+        </w:tc>
+        <w:tc>
+          <w:tcPr>
+            <w:tcW w:type="dxa" w:w="1040"/>
+          </w:tcPr>
+          <w:p>
+            <w:pPr>
+              <w:jc w:val="left"/>
+            </w:pPr>
+            <w:r>
+              <w:rPr>
+                <w:rFonts w:ascii="PingFangTC-Regular" w:hAnsi="PingFangTC-Regular" w:eastAsia="PingFangTC-Regular" w:cs="PingFangTC-Regular"/>
+                <w:b w:val="0"/>
+                <w:sz w:val="20"/>
+              </w:rPr>
+              <w:t>記憶</w:t>
+            </w:r>
+          </w:p>
+        </w:tc>
+        <w:tc>
+          <w:tcPr>
+            <w:tcW w:type="dxa" w:w="1040"/>
+          </w:tcPr>
+          <w:p>
+            <w:pPr>
+              <w:jc w:val="left"/>
+            </w:pPr>
+            <w:r>
+              <w:rPr>
+                <w:rFonts w:ascii="PingFangTC-Regular" w:hAnsi="PingFangTC-Regular" w:eastAsia="PingFangTC-Regular" w:cs="PingFangTC-Regular"/>
+                <w:b w:val="0"/>
+                <w:sz w:val="20"/>
+              </w:rPr>
+              <w:t>專案記憶受控寫入流程</w:t>
+            </w:r>
+          </w:p>
+        </w:tc>
+        <w:tc>
+          <w:tcPr>
+            <w:tcW w:type="dxa" w:w="1040"/>
+          </w:tcPr>
+          <w:p>
+            <w:pPr>
+              <w:jc w:val="left"/>
+            </w:pPr>
+            <w:r>
+              <w:rPr>
+                <w:rFonts w:ascii="PingFangTC-Regular" w:hAnsi="PingFangTC-Regular" w:eastAsia="PingFangTC-Regular" w:cs="PingFangTC-Regular"/>
+                <w:b w:val="0"/>
+                <w:sz w:val="20"/>
+              </w:rPr>
+              <w:t>已確認決策與完成的功能必須經結構化寫入器更新長期記憶、討論摘要、上下文、決策登錄與變更紀錄，再重建 Word。</w:t>
+            </w:r>
+          </w:p>
+        </w:tc>
+        <w:tc>
+          <w:tcPr>
+            <w:tcW w:type="dxa" w:w="1040"/>
+          </w:tcPr>
+          <w:p>
+            <w:pPr>
+              <w:jc w:val="left"/>
+            </w:pPr>
+            <w:r>
+              <w:rPr>
+                <w:rFonts w:ascii="PingFangTC-Regular" w:hAnsi="PingFangTC-Regular" w:eastAsia="PingFangTC-Regular" w:cs="PingFangTC-Regular"/>
+                <w:b w:val="0"/>
+                <w:sz w:val="20"/>
+              </w:rPr>
+              <w:t>GitHub Actions 能重建 Word，但無法理解私人聊天內容；必須避免未確認討論被誤寫為既定規則。</w:t>
+            </w:r>
+          </w:p>
+        </w:tc>
+        <w:tc>
+          <w:tcPr>
+            <w:tcW w:type="dxa" w:w="1040"/>
+          </w:tcPr>
+          <w:p>
+            <w:pPr>
+              <w:jc w:val="left"/>
+            </w:pPr>
+            <w:r>
+              <w:rPr>
+                <w:rFonts w:ascii="PingFangTC-Regular" w:hAnsi="PingFangTC-Regular" w:eastAsia="PingFangTC-Regular" w:cs="PingFangTC-Regular"/>
+                <w:b w:val="0"/>
+                <w:sz w:val="20"/>
+              </w:rPr>
+              <w:t>專案記憶、Word 摘要、Streamlit 記憶頁、例行檢查流程</w:t>
+            </w:r>
+          </w:p>
+        </w:tc>
+        <w:tc>
+          <w:tcPr>
+            <w:tcW w:type="dxa" w:w="1040"/>
+          </w:tcPr>
+          <w:p>
+            <w:pPr>
+              <w:jc w:val="left"/>
+            </w:pPr>
+            <w:r>
+              <w:rPr>
+                <w:rFonts w:ascii="PingFangTC-Regular" w:hAnsi="PingFangTC-Regular" w:eastAsia="PingFangTC-Regular" w:cs="PingFangTC-Regular"/>
+                <w:b w:val="0"/>
+                <w:sz w:val="20"/>
+              </w:rPr>
+            </w:r>
+          </w:p>
+        </w:tc>
+      </w:tr>
+      <w:tr>
+        <w:tc>
+          <w:tcPr>
+            <w:tcW w:type="dxa" w:w="1040"/>
+          </w:tcPr>
+          <w:p>
+            <w:pPr>
+              <w:jc w:val="left"/>
+            </w:pPr>
+            <w:r>
+              <w:rPr>
+                <w:rFonts w:ascii="PingFangTC-Regular" w:hAnsi="PingFangTC-Regular" w:eastAsia="PingFangTC-Regular" w:cs="PingFangTC-Regular"/>
+                <w:b w:val="0"/>
+                <w:sz w:val="20"/>
+              </w:rPr>
+              <w:t>D-012</w:t>
+            </w:r>
+          </w:p>
+        </w:tc>
+        <w:tc>
+          <w:tcPr>
+            <w:tcW w:type="dxa" w:w="1040"/>
+          </w:tcPr>
+          <w:p>
+            <w:pPr>
+              <w:jc w:val="left"/>
+            </w:pPr>
+            <w:r>
+              <w:rPr>
+                <w:rFonts w:ascii="PingFangTC-Regular" w:hAnsi="PingFangTC-Regular" w:eastAsia="PingFangTC-Regular" w:cs="PingFangTC-Regular"/>
+                <w:b w:val="0"/>
+                <w:sz w:val="20"/>
+              </w:rPr>
+              <w:t>2026-07-24</w:t>
+            </w:r>
+          </w:p>
+        </w:tc>
+        <w:tc>
+          <w:tcPr>
+            <w:tcW w:type="dxa" w:w="1040"/>
+          </w:tcPr>
+          <w:p>
+            <w:pPr>
+              <w:jc w:val="left"/>
+            </w:pPr>
+            <w:r>
+              <w:rPr>
+                <w:rFonts w:ascii="PingFangTC-Regular" w:hAnsi="PingFangTC-Regular" w:eastAsia="PingFangTC-Regular" w:cs="PingFangTC-Regular"/>
+                <w:b w:val="0"/>
+                <w:sz w:val="20"/>
+              </w:rPr>
+              <w:t>待執行</w:t>
+            </w:r>
+          </w:p>
+        </w:tc>
+        <w:tc>
+          <w:tcPr>
+            <w:tcW w:type="dxa" w:w="1040"/>
+          </w:tcPr>
+          <w:p>
+            <w:pPr>
+              <w:jc w:val="left"/>
+            </w:pPr>
+            <w:r>
+              <w:rPr>
+                <w:rFonts w:ascii="PingFangTC-Regular" w:hAnsi="PingFangTC-Regular" w:eastAsia="PingFangTC-Regular" w:cs="PingFangTC-Regular"/>
+                <w:b w:val="0"/>
+                <w:sz w:val="20"/>
+              </w:rPr>
+              <w:t>回測</w:t>
+            </w:r>
+          </w:p>
+        </w:tc>
+        <w:tc>
+          <w:tcPr>
+            <w:tcW w:type="dxa" w:w="1040"/>
+          </w:tcPr>
+          <w:p>
+            <w:pPr>
+              <w:jc w:val="left"/>
+            </w:pPr>
+            <w:r>
+              <w:rPr>
+                <w:rFonts w:ascii="PingFangTC-Regular" w:hAnsi="PingFangTC-Regular" w:eastAsia="PingFangTC-Regular" w:cs="PingFangTC-Regular"/>
+                <w:b w:val="0"/>
+                <w:sz w:val="20"/>
+              </w:rPr>
+              <w:t>分層隨機歷史回測與多來源資料方向</w:t>
+            </w:r>
+          </w:p>
+        </w:tc>
+        <w:tc>
+          <w:tcPr>
+            <w:tcW w:type="dxa" w:w="1040"/>
+          </w:tcPr>
+          <w:p>
+            <w:pPr>
+              <w:jc w:val="left"/>
+            </w:pPr>
+            <w:r>
+              <w:rPr>
+                <w:rFonts w:ascii="PingFangTC-Regular" w:hAnsi="PingFangTC-Regular" w:eastAsia="PingFangTC-Regular" w:cs="PingFangTC-Regular"/>
+                <w:b w:val="0"/>
+                <w:sz w:val="20"/>
+              </w:rPr>
+              <w:t>建立以分層隨機歷史日期為主的回測資料集，納入消息、情緒、技術、基本面與市場反應；同一事件須要求獨立來源確認。</w:t>
+            </w:r>
+          </w:p>
+        </w:tc>
+        <w:tc>
+          <w:tcPr>
+            <w:tcW w:type="dxa" w:w="1040"/>
+          </w:tcPr>
+          <w:p>
+            <w:pPr>
+              <w:jc w:val="left"/>
+            </w:pPr>
+            <w:r>
+              <w:rPr>
+                <w:rFonts w:ascii="PingFangTC-Regular" w:hAnsi="PingFangTC-Regular" w:eastAsia="PingFangTC-Regular" w:cs="PingFangTC-Regular"/>
+                <w:b w:val="0"/>
+                <w:sz w:val="20"/>
+              </w:rPr>
+              <w:t>避免近年多頭偏誤與同一媒體重複報導污染，同時保留時間點正確性與資料覆蓋率。</w:t>
+            </w:r>
+          </w:p>
+        </w:tc>
+        <w:tc>
+          <w:tcPr>
+            <w:tcW w:type="dxa" w:w="1040"/>
+          </w:tcPr>
+          <w:p>
+            <w:pPr>
+              <w:jc w:val="left"/>
+            </w:pPr>
+            <w:r>
+              <w:rPr>
+                <w:rFonts w:ascii="PingFangTC-Regular" w:hAnsi="PingFangTC-Regular" w:eastAsia="PingFangTC-Regular" w:cs="PingFangTC-Regular"/>
+                <w:b w:val="0"/>
+                <w:sz w:val="20"/>
+              </w:rPr>
+              <w:t>KG 歷史回測、資料來源、技術面、基本面、來源治理</w:t>
+            </w:r>
+          </w:p>
+        </w:tc>
+        <w:tc>
+          <w:tcPr>
+            <w:tcW w:type="dxa" w:w="1040"/>
+          </w:tcPr>
+          <w:p>
+            <w:pPr>
+              <w:jc w:val="left"/>
+            </w:pPr>
+            <w:r>
+              <w:rPr>
+                <w:rFonts w:ascii="PingFangTC-Regular" w:hAnsi="PingFangTC-Regular" w:eastAsia="PingFangTC-Regular" w:cs="PingFangTC-Regular"/>
+                <w:b w:val="0"/>
+                <w:sz w:val="20"/>
+              </w:rPr>
+            </w:r>
+          </w:p>
+        </w:tc>
+      </w:tr>
     </w:tbl>
     <w:p>
       <w:pPr>
@@ -4766,6 +5498,228 @@
           </w:p>
         </w:tc>
       </w:tr>
+      <w:tr>
+        <w:tc>
+          <w:tcPr>
+            <w:tcW w:type="dxa" w:w="2340"/>
+          </w:tcPr>
+          <w:p>
+            <w:pPr>
+              <w:jc w:val="left"/>
+            </w:pPr>
+            <w:r>
+              <w:rPr>
+                <w:rFonts w:ascii="PingFangTC-Regular" w:hAnsi="PingFangTC-Regular" w:eastAsia="PingFangTC-Regular" w:cs="PingFangTC-Regular"/>
+                <w:b w:val="0"/>
+                <w:sz w:val="20"/>
+              </w:rPr>
+              <w:t>2026-07-24</w:t>
+            </w:r>
+          </w:p>
+        </w:tc>
+        <w:tc>
+          <w:tcPr>
+            <w:tcW w:type="dxa" w:w="2340"/>
+          </w:tcPr>
+          <w:p>
+            <w:pPr>
+              <w:jc w:val="left"/>
+            </w:pPr>
+            <w:r>
+              <w:rPr>
+                <w:rFonts w:ascii="PingFangTC-Regular" w:hAnsi="PingFangTC-Regular" w:eastAsia="PingFangTC-Regular" w:cs="PingFangTC-Regular"/>
+                <w:b w:val="0"/>
+                <w:sz w:val="20"/>
+              </w:rPr>
+              <w:t>KG 預測 V2 多因子趨勢觀察</w:t>
+            </w:r>
+          </w:p>
+        </w:tc>
+        <w:tc>
+          <w:tcPr>
+            <w:tcW w:type="dxa" w:w="2340"/>
+          </w:tcPr>
+          <w:p>
+            <w:pPr>
+              <w:jc w:val="left"/>
+            </w:pPr>
+            <w:r>
+              <w:rPr>
+                <w:rFonts w:ascii="PingFangTC-Regular" w:hAnsi="PingFangTC-Regular" w:eastAsia="PingFangTC-Regular" w:cs="PingFangTC-Regular"/>
+                <w:b w:val="0"/>
+                <w:sz w:val="20"/>
+              </w:rPr>
+              <w:t>降低單一來源與二元命中標籤造成的假確定性，保留可回測的原始數值。</w:t>
+            </w:r>
+          </w:p>
+        </w:tc>
+        <w:tc>
+          <w:tcPr>
+            <w:tcW w:type="dxa" w:w="2340"/>
+          </w:tcPr>
+          <w:p>
+            <w:pPr>
+              <w:jc w:val="left"/>
+            </w:pPr>
+            <w:r>
+              <w:rPr>
+                <w:rFonts w:ascii="PingFangTC-Regular" w:hAnsi="PingFangTC-Regular" w:eastAsia="PingFangTC-Regular" w:cs="PingFangTC-Regular"/>
+                <w:b w:val="0"/>
+                <w:sz w:val="20"/>
+              </w:rPr>
+              <w:t>Codex 已確認決策</w:t>
+            </w:r>
+          </w:p>
+        </w:tc>
+      </w:tr>
+      <w:tr>
+        <w:tc>
+          <w:tcPr>
+            <w:tcW w:type="dxa" w:w="2340"/>
+          </w:tcPr>
+          <w:p>
+            <w:pPr>
+              <w:jc w:val="left"/>
+            </w:pPr>
+            <w:r>
+              <w:rPr>
+                <w:rFonts w:ascii="PingFangTC-Regular" w:hAnsi="PingFangTC-Regular" w:eastAsia="PingFangTC-Regular" w:cs="PingFangTC-Regular"/>
+                <w:b w:val="0"/>
+                <w:sz w:val="20"/>
+              </w:rPr>
+              <w:t>2026-07-24</w:t>
+            </w:r>
+          </w:p>
+        </w:tc>
+        <w:tc>
+          <w:tcPr>
+            <w:tcW w:type="dxa" w:w="2340"/>
+          </w:tcPr>
+          <w:p>
+            <w:pPr>
+              <w:jc w:val="left"/>
+            </w:pPr>
+            <w:r>
+              <w:rPr>
+                <w:rFonts w:ascii="PingFangTC-Regular" w:hAnsi="PingFangTC-Regular" w:eastAsia="PingFangTC-Regular" w:cs="PingFangTC-Regular"/>
+                <w:b w:val="0"/>
+                <w:sz w:val="20"/>
+              </w:rPr>
+              <w:t>專案記憶受控寫入流程</w:t>
+            </w:r>
+          </w:p>
+        </w:tc>
+        <w:tc>
+          <w:tcPr>
+            <w:tcW w:type="dxa" w:w="2340"/>
+          </w:tcPr>
+          <w:p>
+            <w:pPr>
+              <w:jc w:val="left"/>
+            </w:pPr>
+            <w:r>
+              <w:rPr>
+                <w:rFonts w:ascii="PingFangTC-Regular" w:hAnsi="PingFangTC-Regular" w:eastAsia="PingFangTC-Regular" w:cs="PingFangTC-Regular"/>
+                <w:b w:val="0"/>
+                <w:sz w:val="20"/>
+              </w:rPr>
+              <w:t>GitHub Actions 能重建 Word，但無法理解私人聊天內容；必須避免未確認討論被誤寫為既定規則。</w:t>
+            </w:r>
+          </w:p>
+        </w:tc>
+        <w:tc>
+          <w:tcPr>
+            <w:tcW w:type="dxa" w:w="2340"/>
+          </w:tcPr>
+          <w:p>
+            <w:pPr>
+              <w:jc w:val="left"/>
+            </w:pPr>
+            <w:r>
+              <w:rPr>
+                <w:rFonts w:ascii="PingFangTC-Regular" w:hAnsi="PingFangTC-Regular" w:eastAsia="PingFangTC-Regular" w:cs="PingFangTC-Regular"/>
+                <w:b w:val="0"/>
+                <w:sz w:val="20"/>
+              </w:rPr>
+              <w:t>Codex 已確認決策</w:t>
+            </w:r>
+          </w:p>
+        </w:tc>
+      </w:tr>
+      <w:tr>
+        <w:tc>
+          <w:tcPr>
+            <w:tcW w:type="dxa" w:w="2340"/>
+          </w:tcPr>
+          <w:p>
+            <w:pPr>
+              <w:jc w:val="left"/>
+            </w:pPr>
+            <w:r>
+              <w:rPr>
+                <w:rFonts w:ascii="PingFangTC-Regular" w:hAnsi="PingFangTC-Regular" w:eastAsia="PingFangTC-Regular" w:cs="PingFangTC-Regular"/>
+                <w:b w:val="0"/>
+                <w:sz w:val="20"/>
+              </w:rPr>
+              <w:t>2026-07-24</w:t>
+            </w:r>
+          </w:p>
+        </w:tc>
+        <w:tc>
+          <w:tcPr>
+            <w:tcW w:type="dxa" w:w="2340"/>
+          </w:tcPr>
+          <w:p>
+            <w:pPr>
+              <w:jc w:val="left"/>
+            </w:pPr>
+            <w:r>
+              <w:rPr>
+                <w:rFonts w:ascii="PingFangTC-Regular" w:hAnsi="PingFangTC-Regular" w:eastAsia="PingFangTC-Regular" w:cs="PingFangTC-Regular"/>
+                <w:b w:val="0"/>
+                <w:sz w:val="20"/>
+              </w:rPr>
+              <w:t>分層隨機歷史回測與多來源資料方向</w:t>
+            </w:r>
+          </w:p>
+        </w:tc>
+        <w:tc>
+          <w:tcPr>
+            <w:tcW w:type="dxa" w:w="2340"/>
+          </w:tcPr>
+          <w:p>
+            <w:pPr>
+              <w:jc w:val="left"/>
+            </w:pPr>
+            <w:r>
+              <w:rPr>
+                <w:rFonts w:ascii="PingFangTC-Regular" w:hAnsi="PingFangTC-Regular" w:eastAsia="PingFangTC-Regular" w:cs="PingFangTC-Regular"/>
+                <w:b w:val="0"/>
+                <w:sz w:val="20"/>
+              </w:rPr>
+              <w:t>避免近年多頭偏誤與同一媒體重複報導污染，同時保留時間點正確性與資料覆蓋率。</w:t>
+            </w:r>
+          </w:p>
+        </w:tc>
+        <w:tc>
+          <w:tcPr>
+            <w:tcW w:type="dxa" w:w="2340"/>
+          </w:tcPr>
+          <w:p>
+            <w:pPr>
+              <w:jc w:val="left"/>
+            </w:pPr>
+            <w:r>
+              <w:rPr>
+                <w:rFonts w:ascii="PingFangTC-Regular" w:hAnsi="PingFangTC-Regular" w:eastAsia="PingFangTC-Regular" w:cs="PingFangTC-Regular"/>
+                <w:b w:val="0"/>
+                <w:sz w:val="20"/>
+              </w:rPr>
+              <w:t>Codex 已確認決策</w:t>
+            </w:r>
+          </w:p>
+        </w:tc>
+      </w:tr>
     </w:tbl>
     <w:p>
       <w:pPr>

</xml_diff>

<commit_message>
Add stratified historical research baseline
</commit_message>
<xml_diff>
--- a/data/觀察版資料/13_專案記憶/專案記憶與討論摘要.docx
+++ b/data/觀察版資料/13_專案記憶/專案記憶與討論摘要.docx
@@ -26,7 +26,7 @@
           <w:b w:val="0"/>
           <w:sz w:val="20"/>
         </w:rPr>
-        <w:t>產生時間：2026-07-24 06:32 UTC｜來源：專案記憶資料夾</w:t>
+        <w:t>產生時間：2026-07-24 06:39 UTC｜來源：專案記憶資料夾</w:t>
       </w:r>
     </w:p>
     <w:p>
@@ -156,7 +156,7 @@
                 <w:b w:val="0"/>
                 <w:sz w:val="20"/>
               </w:rPr>
-              <w:t>12</w:t>
+              <w:t>14</w:t>
             </w:r>
           </w:p>
         </w:tc>
@@ -212,7 +212,7 @@
                 <w:b w:val="0"/>
                 <w:sz w:val="20"/>
               </w:rPr>
-              <w:t>11</w:t>
+              <w:t>13</w:t>
             </w:r>
           </w:p>
         </w:tc>
@@ -703,7 +703,7 @@
                 <w:b w:val="0"/>
                 <w:sz w:val="20"/>
               </w:rPr>
-              <w:t>2026-07-17</w:t>
+              <w:t>2026-07-24</w:t>
             </w:r>
           </w:p>
         </w:tc>
@@ -721,7 +721,7 @@
                 <w:b w:val="0"/>
                 <w:sz w:val="20"/>
               </w:rPr>
-              <w:t>增加最新掃描時間與掃描結果</w:t>
+              <w:t>分層歷史市場樣本基線已建立</w:t>
             </w:r>
           </w:p>
         </w:tc>
@@ -777,7 +777,7 @@
                 <w:b w:val="0"/>
                 <w:sz w:val="20"/>
               </w:rPr>
-              <w:t>2026-07-17</w:t>
+              <w:t>2026-07-24</w:t>
             </w:r>
           </w:p>
         </w:tc>
@@ -795,7 +795,7 @@
                 <w:b w:val="0"/>
                 <w:sz w:val="20"/>
               </w:rPr>
-              <w:t>分離訓練特徵與日常監控特徵並加入即時推論</w:t>
+              <w:t>KG 新聞出版者與跨來源識別修正</w:t>
             </w:r>
           </w:p>
         </w:tc>
@@ -1073,7 +1073,7 @@
                 <w:b w:val="0"/>
                 <w:sz w:val="20"/>
               </w:rPr>
-              <w:t>2026-07-17</w:t>
+              <w:t>2026-07-24</w:t>
             </w:r>
           </w:p>
         </w:tc>
@@ -1091,7 +1091,7 @@
                 <w:b w:val="0"/>
                 <w:sz w:val="20"/>
               </w:rPr>
-              <w:t>記錄資料健康檢查增加最新掃描時間</w:t>
+              <w:t>分層歷史市場樣本基線已建立</w:t>
             </w:r>
           </w:p>
         </w:tc>
@@ -1109,7 +1109,7 @@
                 <w:b w:val="0"/>
                 <w:sz w:val="20"/>
               </w:rPr>
-              <w:t>使用者確認</w:t>
+              <w:t>Codex 已確認決策</w:t>
             </w:r>
           </w:p>
         </w:tc>
@@ -1147,7 +1147,7 @@
                 <w:b w:val="0"/>
                 <w:sz w:val="20"/>
               </w:rPr>
-              <w:t>2026-07-17</w:t>
+              <w:t>2026-07-24</w:t>
             </w:r>
           </w:p>
         </w:tc>
@@ -1165,7 +1165,7 @@
                 <w:b w:val="0"/>
                 <w:sz w:val="20"/>
               </w:rPr>
-              <w:t>完成資料健康掃描欄位與 LSTM 訓練/監控分層</w:t>
+              <w:t>KG 新聞出版者與跨來源識別修正</w:t>
             </w:r>
           </w:p>
         </w:tc>
@@ -1183,7 +1183,7 @@
                 <w:b w:val="0"/>
                 <w:sz w:val="20"/>
               </w:rPr>
-              <w:t>使用者確認</w:t>
+              <w:t>Codex 已確認決策</w:t>
             </w:r>
           </w:p>
         </w:tc>
@@ -1750,6 +1750,33 @@
           <w:sz w:val="22"/>
         </w:rPr>
         <w:t>長期回測採 point-in-time 原則：只使用當日以前可得的事實、新聞、技術與基本面資料，並以後續實際報酬與回撤驗證。</w:t>
+      </w:r>
+    </w:p>
+    <w:p>
+      <w:pPr>
+        <w:spacing w:before="200" w:after="120"/>
+      </w:pPr>
+      <w:r>
+        <w:rPr>
+          <w:rFonts w:ascii="PingFangTC-Regular" w:hAnsi="PingFangTC-Regular" w:eastAsia="PingFangTC-Regular" w:cs="PingFangTC-Regular"/>
+          <w:b w:val="0"/>
+          <w:sz w:val="26"/>
+        </w:rPr>
+        <w:t>2026-07-24｜KG 新聞出版者與跨來源識別修正</w:t>
+      </w:r>
+    </w:p>
+    <w:p>
+      <w:pPr>
+        <w:pStyle w:val="ListBullet"/>
+        <w:spacing w:after="60" w:line="276" w:lineRule="auto"/>
+      </w:pPr>
+      <w:r>
+        <w:rPr>
+          <w:rFonts w:ascii="PingFangTC-Regular" w:hAnsi="PingFangTC-Regular" w:eastAsia="PingFangTC-Regular" w:cs="PingFangTC-Regular"/>
+          <w:b w:val="0"/>
+          <w:sz w:val="22"/>
+        </w:rPr>
+        <w:t>跨來源確認以原始出版者或官方來源為單位，不以 RSS 聚合站、轉載頁數或 Google 轉址計數。</w:t>
       </w:r>
     </w:p>
     <w:p>
@@ -2452,6 +2479,60 @@
     </w:p>
     <w:p>
       <w:pPr>
+        <w:spacing w:before="200" w:after="120"/>
+      </w:pPr>
+      <w:r>
+        <w:rPr>
+          <w:rFonts w:ascii="PingFangTC-Regular" w:hAnsi="PingFangTC-Regular" w:eastAsia="PingFangTC-Regular" w:cs="PingFangTC-Regular"/>
+          <w:b w:val="0"/>
+          <w:sz w:val="26"/>
+        </w:rPr>
+        <w:t>2026-07-24｜分層歷史市場樣本基線已建立</w:t>
+      </w:r>
+    </w:p>
+    <w:p>
+      <w:pPr>
+        <w:pStyle w:val="ListBullet"/>
+        <w:spacing w:after="60" w:line="276" w:lineRule="auto"/>
+      </w:pPr>
+      <w:r>
+        <w:rPr>
+          <w:rFonts w:ascii="PingFangTC-Regular" w:hAnsi="PingFangTC-Regular" w:eastAsia="PingFangTC-Regular" w:cs="PingFangTC-Regular"/>
+          <w:b w:val="0"/>
+          <w:sz w:val="22"/>
+        </w:rPr>
+        <w:t>樣本依五種市場狀態固定分層；完整 KG 與基本面資料不足時會顯示覆蓋缺口，不以缺失資料產生結論。</w:t>
+      </w:r>
+    </w:p>
+    <w:p>
+      <w:pPr>
+        <w:spacing w:before="200" w:after="120"/>
+      </w:pPr>
+      <w:r>
+        <w:rPr>
+          <w:rFonts w:ascii="PingFangTC-Regular" w:hAnsi="PingFangTC-Regular" w:eastAsia="PingFangTC-Regular" w:cs="PingFangTC-Regular"/>
+          <w:b w:val="0"/>
+          <w:sz w:val="26"/>
+        </w:rPr>
+        <w:t>2026-07-24｜KG 新聞出版者與跨來源識別修正</w:t>
+      </w:r>
+    </w:p>
+    <w:p>
+      <w:pPr>
+        <w:pStyle w:val="ListBullet"/>
+        <w:spacing w:after="60" w:line="276" w:lineRule="auto"/>
+      </w:pPr>
+      <w:r>
+        <w:rPr>
+          <w:rFonts w:ascii="PingFangTC-Regular" w:hAnsi="PingFangTC-Regular" w:eastAsia="PingFangTC-Regular" w:cs="PingFangTC-Regular"/>
+          <w:b w:val="0"/>
+          <w:sz w:val="22"/>
+        </w:rPr>
+        <w:t>測試已可辨識 Bloomberg、CNBC、Reuters 類媒體等不同出版者網域；後續正式更新將依真正出版者進行來源去重與信心計算。</w:t>
+      </w:r>
+    </w:p>
+    <w:p>
+      <w:pPr>
         <w:spacing w:before="280" w:after="120"/>
       </w:pPr>
       <w:r>
@@ -2803,6 +2884,60 @@
           <w:sz w:val="22"/>
         </w:rPr>
         <w:t>待執行：先盤點可取得的歷史價格、官方事件、基本面與多來源新聞覆蓋，再建立獨立回測資料集，不混入日常正式預測。</w:t>
+      </w:r>
+    </w:p>
+    <w:p>
+      <w:pPr>
+        <w:spacing w:before="200" w:after="120"/>
+      </w:pPr>
+      <w:r>
+        <w:rPr>
+          <w:rFonts w:ascii="PingFangTC-Regular" w:hAnsi="PingFangTC-Regular" w:eastAsia="PingFangTC-Regular" w:cs="PingFangTC-Regular"/>
+          <w:b w:val="0"/>
+          <w:sz w:val="26"/>
+        </w:rPr>
+        <w:t>2026-07-24｜分層歷史市場樣本基線已建立</w:t>
+      </w:r>
+    </w:p>
+    <w:p>
+      <w:pPr>
+        <w:pStyle w:val="ListBullet"/>
+        <w:spacing w:after="60" w:line="276" w:lineRule="auto"/>
+      </w:pPr>
+      <w:r>
+        <w:rPr>
+          <w:rFonts w:ascii="PingFangTC-Regular" w:hAnsi="PingFangTC-Regular" w:eastAsia="PingFangTC-Regular" w:cs="PingFangTC-Regular"/>
+          <w:b w:val="0"/>
+          <w:sz w:val="22"/>
+        </w:rPr>
+        <w:t>已執行：500 個市場技術基線樣本已建立並自動接入六小時更新。待執行：歷史多來源事件與 point-in-time 基本面回補。</w:t>
+      </w:r>
+    </w:p>
+    <w:p>
+      <w:pPr>
+        <w:spacing w:before="200" w:after="120"/>
+      </w:pPr>
+      <w:r>
+        <w:rPr>
+          <w:rFonts w:ascii="PingFangTC-Regular" w:hAnsi="PingFangTC-Regular" w:eastAsia="PingFangTC-Regular" w:cs="PingFangTC-Regular"/>
+          <w:b w:val="0"/>
+          <w:sz w:val="26"/>
+        </w:rPr>
+        <w:t>2026-07-24｜KG 新聞出版者與跨來源識別修正</w:t>
+      </w:r>
+    </w:p>
+    <w:p>
+      <w:pPr>
+        <w:pStyle w:val="ListBullet"/>
+        <w:spacing w:after="60" w:line="276" w:lineRule="auto"/>
+      </w:pPr>
+      <w:r>
+        <w:rPr>
+          <w:rFonts w:ascii="PingFangTC-Regular" w:hAnsi="PingFangTC-Regular" w:eastAsia="PingFangTC-Regular" w:cs="PingFangTC-Regular"/>
+          <w:b w:val="0"/>
+          <w:sz w:val="22"/>
+        </w:rPr>
+        <w:t>已執行：新聞資料新增 source_url；KG Fact Layer 新增 publisher_url 並優先使用出版者網域。等待下一次雲端排程寫入正式資料。</w:t>
       </w:r>
     </w:p>
     <w:p>
@@ -4953,6 +5088,332 @@
           </w:p>
         </w:tc>
       </w:tr>
+      <w:tr>
+        <w:tc>
+          <w:tcPr>
+            <w:tcW w:type="dxa" w:w="1040"/>
+          </w:tcPr>
+          <w:p>
+            <w:pPr>
+              <w:jc w:val="left"/>
+            </w:pPr>
+            <w:r>
+              <w:rPr>
+                <w:rFonts w:ascii="PingFangTC-Regular" w:hAnsi="PingFangTC-Regular" w:eastAsia="PingFangTC-Regular" w:cs="PingFangTC-Regular"/>
+                <w:b w:val="0"/>
+                <w:sz w:val="20"/>
+              </w:rPr>
+              <w:t>D-013</w:t>
+            </w:r>
+          </w:p>
+        </w:tc>
+        <w:tc>
+          <w:tcPr>
+            <w:tcW w:type="dxa" w:w="1040"/>
+          </w:tcPr>
+          <w:p>
+            <w:pPr>
+              <w:jc w:val="left"/>
+            </w:pPr>
+            <w:r>
+              <w:rPr>
+                <w:rFonts w:ascii="PingFangTC-Regular" w:hAnsi="PingFangTC-Regular" w:eastAsia="PingFangTC-Regular" w:cs="PingFangTC-Regular"/>
+                <w:b w:val="0"/>
+                <w:sz w:val="20"/>
+              </w:rPr>
+              <w:t>2026-07-24</w:t>
+            </w:r>
+          </w:p>
+        </w:tc>
+        <w:tc>
+          <w:tcPr>
+            <w:tcW w:type="dxa" w:w="1040"/>
+          </w:tcPr>
+          <w:p>
+            <w:pPr>
+              <w:jc w:val="left"/>
+            </w:pPr>
+            <w:r>
+              <w:rPr>
+                <w:rFonts w:ascii="PingFangTC-Regular" w:hAnsi="PingFangTC-Regular" w:eastAsia="PingFangTC-Regular" w:cs="PingFangTC-Regular"/>
+                <w:b w:val="0"/>
+                <w:sz w:val="20"/>
+              </w:rPr>
+              <w:t>已執行</w:t>
+            </w:r>
+          </w:p>
+        </w:tc>
+        <w:tc>
+          <w:tcPr>
+            <w:tcW w:type="dxa" w:w="1040"/>
+          </w:tcPr>
+          <w:p>
+            <w:pPr>
+              <w:jc w:val="left"/>
+            </w:pPr>
+            <w:r>
+              <w:rPr>
+                <w:rFonts w:ascii="PingFangTC-Regular" w:hAnsi="PingFangTC-Regular" w:eastAsia="PingFangTC-Regular" w:cs="PingFangTC-Regular"/>
+                <w:b w:val="0"/>
+                <w:sz w:val="20"/>
+              </w:rPr>
+              <w:t>回測</w:t>
+            </w:r>
+          </w:p>
+        </w:tc>
+        <w:tc>
+          <w:tcPr>
+            <w:tcW w:type="dxa" w:w="1040"/>
+          </w:tcPr>
+          <w:p>
+            <w:pPr>
+              <w:jc w:val="left"/>
+            </w:pPr>
+            <w:r>
+              <w:rPr>
+                <w:rFonts w:ascii="PingFangTC-Regular" w:hAnsi="PingFangTC-Regular" w:eastAsia="PingFangTC-Regular" w:cs="PingFangTC-Regular"/>
+                <w:b w:val="0"/>
+                <w:sz w:val="20"/>
+              </w:rPr>
+              <w:t>分層歷史市場樣本基線已建立</w:t>
+            </w:r>
+          </w:p>
+        </w:tc>
+        <w:tc>
+          <w:tcPr>
+            <w:tcW w:type="dxa" w:w="1040"/>
+          </w:tcPr>
+          <w:p>
+            <w:pPr>
+              <w:jc w:val="left"/>
+            </w:pPr>
+            <w:r>
+              <w:rPr>
+                <w:rFonts w:ascii="PingFangTC-Regular" w:hAnsi="PingFangTC-Regular" w:eastAsia="PingFangTC-Regular" w:cs="PingFangTC-Regular"/>
+                <w:b w:val="0"/>
+                <w:sz w:val="20"/>
+              </w:rPr>
+              <w:t>建立固定 seed 的 500 個分層歷史市場樣本，納入當時技術、量能、VIX、HYG 與後續 1D/5D/20D 實際報酬及回撤。</w:t>
+            </w:r>
+          </w:p>
+        </w:tc>
+        <w:tc>
+          <w:tcPr>
+            <w:tcW w:type="dxa" w:w="1040"/>
+          </w:tcPr>
+          <w:p>
+            <w:pPr>
+              <w:jc w:val="left"/>
+            </w:pPr>
+            <w:r>
+              <w:rPr>
+                <w:rFonts w:ascii="PingFangTC-Regular" w:hAnsi="PingFangTC-Regular" w:eastAsia="PingFangTC-Regular" w:cs="PingFangTC-Regular"/>
+                <w:b w:val="0"/>
+                <w:sz w:val="20"/>
+              </w:rPr>
+              <w:t>先建立不含未來洩漏的市場技術基線，再逐步補齊多來源 KG 新聞與 point-in-time 基本面。</w:t>
+            </w:r>
+          </w:p>
+        </w:tc>
+        <w:tc>
+          <w:tcPr>
+            <w:tcW w:type="dxa" w:w="1040"/>
+          </w:tcPr>
+          <w:p>
+            <w:pPr>
+              <w:jc w:val="left"/>
+            </w:pPr>
+            <w:r>
+              <w:rPr>
+                <w:rFonts w:ascii="PingFangTC-Regular" w:hAnsi="PingFangTC-Regular" w:eastAsia="PingFangTC-Regular" w:cs="PingFangTC-Regular"/>
+                <w:b w:val="0"/>
+                <w:sz w:val="20"/>
+              </w:rPr>
+              <w:t>歷史回測、量化數據中心、資料治理</w:t>
+            </w:r>
+          </w:p>
+        </w:tc>
+        <w:tc>
+          <w:tcPr>
+            <w:tcW w:type="dxa" w:w="1040"/>
+          </w:tcPr>
+          <w:p>
+            <w:pPr>
+              <w:jc w:val="left"/>
+            </w:pPr>
+            <w:r>
+              <w:rPr>
+                <w:rFonts w:ascii="PingFangTC-Regular" w:hAnsi="PingFangTC-Regular" w:eastAsia="PingFangTC-Regular" w:cs="PingFangTC-Regular"/>
+                <w:b w:val="0"/>
+                <w:sz w:val="20"/>
+              </w:rPr>
+            </w:r>
+          </w:p>
+        </w:tc>
+      </w:tr>
+      <w:tr>
+        <w:tc>
+          <w:tcPr>
+            <w:tcW w:type="dxa" w:w="1040"/>
+          </w:tcPr>
+          <w:p>
+            <w:pPr>
+              <w:jc w:val="left"/>
+            </w:pPr>
+            <w:r>
+              <w:rPr>
+                <w:rFonts w:ascii="PingFangTC-Regular" w:hAnsi="PingFangTC-Regular" w:eastAsia="PingFangTC-Regular" w:cs="PingFangTC-Regular"/>
+                <w:b w:val="0"/>
+                <w:sz w:val="20"/>
+              </w:rPr>
+              <w:t>D-014</w:t>
+            </w:r>
+          </w:p>
+        </w:tc>
+        <w:tc>
+          <w:tcPr>
+            <w:tcW w:type="dxa" w:w="1040"/>
+          </w:tcPr>
+          <w:p>
+            <w:pPr>
+              <w:jc w:val="left"/>
+            </w:pPr>
+            <w:r>
+              <w:rPr>
+                <w:rFonts w:ascii="PingFangTC-Regular" w:hAnsi="PingFangTC-Regular" w:eastAsia="PingFangTC-Regular" w:cs="PingFangTC-Regular"/>
+                <w:b w:val="0"/>
+                <w:sz w:val="20"/>
+              </w:rPr>
+              <w:t>2026-07-24</w:t>
+            </w:r>
+          </w:p>
+        </w:tc>
+        <w:tc>
+          <w:tcPr>
+            <w:tcW w:type="dxa" w:w="1040"/>
+          </w:tcPr>
+          <w:p>
+            <w:pPr>
+              <w:jc w:val="left"/>
+            </w:pPr>
+            <w:r>
+              <w:rPr>
+                <w:rFonts w:ascii="PingFangTC-Regular" w:hAnsi="PingFangTC-Regular" w:eastAsia="PingFangTC-Regular" w:cs="PingFangTC-Regular"/>
+                <w:b w:val="0"/>
+                <w:sz w:val="20"/>
+              </w:rPr>
+              <w:t>已執行</w:t>
+            </w:r>
+          </w:p>
+        </w:tc>
+        <w:tc>
+          <w:tcPr>
+            <w:tcW w:type="dxa" w:w="1040"/>
+          </w:tcPr>
+          <w:p>
+            <w:pPr>
+              <w:jc w:val="left"/>
+            </w:pPr>
+            <w:r>
+              <w:rPr>
+                <w:rFonts w:ascii="PingFangTC-Regular" w:hAnsi="PingFangTC-Regular" w:eastAsia="PingFangTC-Regular" w:cs="PingFangTC-Regular"/>
+                <w:b w:val="0"/>
+                <w:sz w:val="20"/>
+              </w:rPr>
+              <w:t>資料治理</w:t>
+            </w:r>
+          </w:p>
+        </w:tc>
+        <w:tc>
+          <w:tcPr>
+            <w:tcW w:type="dxa" w:w="1040"/>
+          </w:tcPr>
+          <w:p>
+            <w:pPr>
+              <w:jc w:val="left"/>
+            </w:pPr>
+            <w:r>
+              <w:rPr>
+                <w:rFonts w:ascii="PingFangTC-Regular" w:hAnsi="PingFangTC-Regular" w:eastAsia="PingFangTC-Regular" w:cs="PingFangTC-Regular"/>
+                <w:b w:val="0"/>
+                <w:sz w:val="20"/>
+              </w:rPr>
+              <w:t>KG 新聞出版者與跨來源識別修正</w:t>
+            </w:r>
+          </w:p>
+        </w:tc>
+        <w:tc>
+          <w:tcPr>
+            <w:tcW w:type="dxa" w:w="1040"/>
+          </w:tcPr>
+          <w:p>
+            <w:pPr>
+              <w:jc w:val="left"/>
+            </w:pPr>
+            <w:r>
+              <w:rPr>
+                <w:rFonts w:ascii="PingFangTC-Regular" w:hAnsi="PingFangTC-Regular" w:eastAsia="PingFangTC-Regular" w:cs="PingFangTC-Regular"/>
+                <w:b w:val="0"/>
+                <w:sz w:val="20"/>
+              </w:rPr>
+              <w:t>Google News RSS 需讀取原始出版者網址與網域，不可把 Google 轉址當成唯一來源；KG 跨來源確認依出版者網域計算。</w:t>
+            </w:r>
+          </w:p>
+        </w:tc>
+        <w:tc>
+          <w:tcPr>
+            <w:tcW w:type="dxa" w:w="1040"/>
+          </w:tcPr>
+          <w:p>
+            <w:pPr>
+              <w:jc w:val="left"/>
+            </w:pPr>
+            <w:r>
+              <w:rPr>
+                <w:rFonts w:ascii="PingFangTC-Regular" w:hAnsi="PingFangTC-Regular" w:eastAsia="PingFangTC-Regular" w:cs="PingFangTC-Regular"/>
+                <w:b w:val="0"/>
+                <w:sz w:val="20"/>
+              </w:rPr>
+              <w:t>避免不同媒體被誤判為單一 Google 來源，也避免同一家轉載被虛增為多重證據。</w:t>
+            </w:r>
+          </w:p>
+        </w:tc>
+        <w:tc>
+          <w:tcPr>
+            <w:tcW w:type="dxa" w:w="1040"/>
+          </w:tcPr>
+          <w:p>
+            <w:pPr>
+              <w:jc w:val="left"/>
+            </w:pPr>
+            <w:r>
+              <w:rPr>
+                <w:rFonts w:ascii="PingFangTC-Regular" w:hAnsi="PingFangTC-Regular" w:eastAsia="PingFangTC-Regular" w:cs="PingFangTC-Regular"/>
+                <w:b w:val="0"/>
+                <w:sz w:val="20"/>
+              </w:rPr>
+              <w:t>新聞抓取、新聞品質、金融知識圖譜、KG V2 信心</w:t>
+            </w:r>
+          </w:p>
+        </w:tc>
+        <w:tc>
+          <w:tcPr>
+            <w:tcW w:type="dxa" w:w="1040"/>
+          </w:tcPr>
+          <w:p>
+            <w:pPr>
+              <w:jc w:val="left"/>
+            </w:pPr>
+            <w:r>
+              <w:rPr>
+                <w:rFonts w:ascii="PingFangTC-Regular" w:hAnsi="PingFangTC-Regular" w:eastAsia="PingFangTC-Regular" w:cs="PingFangTC-Regular"/>
+                <w:b w:val="0"/>
+                <w:sz w:val="20"/>
+              </w:rPr>
+            </w:r>
+          </w:p>
+        </w:tc>
+      </w:tr>
     </w:tbl>
     <w:p>
       <w:pPr>
@@ -5720,6 +6181,154 @@
           </w:p>
         </w:tc>
       </w:tr>
+      <w:tr>
+        <w:tc>
+          <w:tcPr>
+            <w:tcW w:type="dxa" w:w="2340"/>
+          </w:tcPr>
+          <w:p>
+            <w:pPr>
+              <w:jc w:val="left"/>
+            </w:pPr>
+            <w:r>
+              <w:rPr>
+                <w:rFonts w:ascii="PingFangTC-Regular" w:hAnsi="PingFangTC-Regular" w:eastAsia="PingFangTC-Regular" w:cs="PingFangTC-Regular"/>
+                <w:b w:val="0"/>
+                <w:sz w:val="20"/>
+              </w:rPr>
+              <w:t>2026-07-24</w:t>
+            </w:r>
+          </w:p>
+        </w:tc>
+        <w:tc>
+          <w:tcPr>
+            <w:tcW w:type="dxa" w:w="2340"/>
+          </w:tcPr>
+          <w:p>
+            <w:pPr>
+              <w:jc w:val="left"/>
+            </w:pPr>
+            <w:r>
+              <w:rPr>
+                <w:rFonts w:ascii="PingFangTC-Regular" w:hAnsi="PingFangTC-Regular" w:eastAsia="PingFangTC-Regular" w:cs="PingFangTC-Regular"/>
+                <w:b w:val="0"/>
+                <w:sz w:val="20"/>
+              </w:rPr>
+              <w:t>分層歷史市場樣本基線已建立</w:t>
+            </w:r>
+          </w:p>
+        </w:tc>
+        <w:tc>
+          <w:tcPr>
+            <w:tcW w:type="dxa" w:w="2340"/>
+          </w:tcPr>
+          <w:p>
+            <w:pPr>
+              <w:jc w:val="left"/>
+            </w:pPr>
+            <w:r>
+              <w:rPr>
+                <w:rFonts w:ascii="PingFangTC-Regular" w:hAnsi="PingFangTC-Regular" w:eastAsia="PingFangTC-Regular" w:cs="PingFangTC-Regular"/>
+                <w:b w:val="0"/>
+                <w:sz w:val="20"/>
+              </w:rPr>
+              <w:t>先建立不含未來洩漏的市場技術基線，再逐步補齊多來源 KG 新聞與 point-in-time 基本面。</w:t>
+            </w:r>
+          </w:p>
+        </w:tc>
+        <w:tc>
+          <w:tcPr>
+            <w:tcW w:type="dxa" w:w="2340"/>
+          </w:tcPr>
+          <w:p>
+            <w:pPr>
+              <w:jc w:val="left"/>
+            </w:pPr>
+            <w:r>
+              <w:rPr>
+                <w:rFonts w:ascii="PingFangTC-Regular" w:hAnsi="PingFangTC-Regular" w:eastAsia="PingFangTC-Regular" w:cs="PingFangTC-Regular"/>
+                <w:b w:val="0"/>
+                <w:sz w:val="20"/>
+              </w:rPr>
+              <w:t>Codex 已確認決策</w:t>
+            </w:r>
+          </w:p>
+        </w:tc>
+      </w:tr>
+      <w:tr>
+        <w:tc>
+          <w:tcPr>
+            <w:tcW w:type="dxa" w:w="2340"/>
+          </w:tcPr>
+          <w:p>
+            <w:pPr>
+              <w:jc w:val="left"/>
+            </w:pPr>
+            <w:r>
+              <w:rPr>
+                <w:rFonts w:ascii="PingFangTC-Regular" w:hAnsi="PingFangTC-Regular" w:eastAsia="PingFangTC-Regular" w:cs="PingFangTC-Regular"/>
+                <w:b w:val="0"/>
+                <w:sz w:val="20"/>
+              </w:rPr>
+              <w:t>2026-07-24</w:t>
+            </w:r>
+          </w:p>
+        </w:tc>
+        <w:tc>
+          <w:tcPr>
+            <w:tcW w:type="dxa" w:w="2340"/>
+          </w:tcPr>
+          <w:p>
+            <w:pPr>
+              <w:jc w:val="left"/>
+            </w:pPr>
+            <w:r>
+              <w:rPr>
+                <w:rFonts w:ascii="PingFangTC-Regular" w:hAnsi="PingFangTC-Regular" w:eastAsia="PingFangTC-Regular" w:cs="PingFangTC-Regular"/>
+                <w:b w:val="0"/>
+                <w:sz w:val="20"/>
+              </w:rPr>
+              <w:t>KG 新聞出版者與跨來源識別修正</w:t>
+            </w:r>
+          </w:p>
+        </w:tc>
+        <w:tc>
+          <w:tcPr>
+            <w:tcW w:type="dxa" w:w="2340"/>
+          </w:tcPr>
+          <w:p>
+            <w:pPr>
+              <w:jc w:val="left"/>
+            </w:pPr>
+            <w:r>
+              <w:rPr>
+                <w:rFonts w:ascii="PingFangTC-Regular" w:hAnsi="PingFangTC-Regular" w:eastAsia="PingFangTC-Regular" w:cs="PingFangTC-Regular"/>
+                <w:b w:val="0"/>
+                <w:sz w:val="20"/>
+              </w:rPr>
+              <w:t>避免不同媒體被誤判為單一 Google 來源，也避免同一家轉載被虛增為多重證據。</w:t>
+            </w:r>
+          </w:p>
+        </w:tc>
+        <w:tc>
+          <w:tcPr>
+            <w:tcW w:type="dxa" w:w="2340"/>
+          </w:tcPr>
+          <w:p>
+            <w:pPr>
+              <w:jc w:val="left"/>
+            </w:pPr>
+            <w:r>
+              <w:rPr>
+                <w:rFonts w:ascii="PingFangTC-Regular" w:hAnsi="PingFangTC-Regular" w:eastAsia="PingFangTC-Regular" w:cs="PingFangTC-Regular"/>
+                <w:b w:val="0"/>
+                <w:sz w:val="20"/>
+              </w:rPr>
+              <w:t>Codex 已確認決策</w:t>
+            </w:r>
+          </w:p>
+        </w:tc>
+      </w:tr>
     </w:tbl>
     <w:p>
       <w:pPr>

</xml_diff>

<commit_message>
Add SEC point-in-time fundamentals to research baseline
</commit_message>
<xml_diff>
--- a/data/觀察版資料/13_專案記憶/專案記憶與討論摘要.docx
+++ b/data/觀察版資料/13_專案記憶/專案記憶與討論摘要.docx
@@ -26,7 +26,7 @@
           <w:b w:val="0"/>
           <w:sz w:val="20"/>
         </w:rPr>
-        <w:t>產生時間：2026-07-24 06:39 UTC｜來源：專案記憶資料夾</w:t>
+        <w:t>產生時間：2026-07-24 06:57 UTC｜來源：專案記憶資料夾</w:t>
       </w:r>
     </w:p>
     <w:p>
@@ -156,7 +156,7 @@
                 <w:b w:val="0"/>
                 <w:sz w:val="20"/>
               </w:rPr>
-              <w:t>14</w:t>
+              <w:t>15</w:t>
             </w:r>
           </w:p>
         </w:tc>
@@ -212,7 +212,7 @@
                 <w:b w:val="0"/>
                 <w:sz w:val="20"/>
               </w:rPr>
-              <w:t>13</w:t>
+              <w:t>14</w:t>
             </w:r>
           </w:p>
         </w:tc>
@@ -1781,6 +1781,33 @@
     </w:p>
     <w:p>
       <w:pPr>
+        <w:spacing w:before="200" w:after="120"/>
+      </w:pPr>
+      <w:r>
+        <w:rPr>
+          <w:rFonts w:ascii="PingFangTC-Regular" w:hAnsi="PingFangTC-Regular" w:eastAsia="PingFangTC-Regular" w:cs="PingFangTC-Regular"/>
+          <w:b w:val="0"/>
+          <w:sz w:val="26"/>
+        </w:rPr>
+        <w:t>2026-07-24｜SEC point-in-time 基本面歷史資料</w:t>
+      </w:r>
+    </w:p>
+    <w:p>
+      <w:pPr>
+        <w:pStyle w:val="ListBullet"/>
+        <w:spacing w:after="60" w:line="276" w:lineRule="auto"/>
+      </w:pPr>
+      <w:r>
+        <w:rPr>
+          <w:rFonts w:ascii="PingFangTC-Regular" w:hAnsi="PingFangTC-Regular" w:eastAsia="PingFangTC-Regular" w:cs="PingFangTC-Regular"/>
+          <w:b w:val="0"/>
+          <w:sz w:val="22"/>
+        </w:rPr>
+        <w:t>基本面研究遵守 point-in-time 原則，以 filed_at 作為可用時間。歷史資料不足是正式資料品質狀態，不可用後來財報補寫過去。</w:t>
+      </w:r>
+    </w:p>
+    <w:p>
+      <w:pPr>
         <w:spacing w:before="280" w:after="120"/>
       </w:pPr>
       <w:r>
@@ -2533,6 +2560,33 @@
     </w:p>
     <w:p>
       <w:pPr>
+        <w:spacing w:before="200" w:after="120"/>
+      </w:pPr>
+      <w:r>
+        <w:rPr>
+          <w:rFonts w:ascii="PingFangTC-Regular" w:hAnsi="PingFangTC-Regular" w:eastAsia="PingFangTC-Regular" w:cs="PingFangTC-Regular"/>
+          <w:b w:val="0"/>
+          <w:sz w:val="26"/>
+        </w:rPr>
+        <w:t>2026-07-24｜SEC point-in-time 基本面歷史資料</w:t>
+      </w:r>
+    </w:p>
+    <w:p>
+      <w:pPr>
+        <w:pStyle w:val="ListBullet"/>
+        <w:spacing w:after="60" w:line="276" w:lineRule="auto"/>
+      </w:pPr>
+      <w:r>
+        <w:rPr>
+          <w:rFonts w:ascii="PingFangTC-Regular" w:hAnsi="PingFangTC-Regular" w:eastAsia="PingFangTC-Regular" w:cs="PingFangTC-Regular"/>
+          <w:b w:val="0"/>
+          <w:sz w:val="22"/>
+        </w:rPr>
+        <w:t>已取得 8 檔核心科技股的 SEC 基本面觀測；完整覆蓋與資料不足樣本必須分開顯示，不能以缺失資料推論。</w:t>
+      </w:r>
+    </w:p>
+    <w:p>
+      <w:pPr>
         <w:spacing w:before="280" w:after="120"/>
       </w:pPr>
       <w:r>
@@ -2938,6 +2992,33 @@
           <w:sz w:val="22"/>
         </w:rPr>
         <w:t>已執行：新聞資料新增 source_url；KG Fact Layer 新增 publisher_url 並優先使用出版者網域。等待下一次雲端排程寫入正式資料。</w:t>
+      </w:r>
+    </w:p>
+    <w:p>
+      <w:pPr>
+        <w:spacing w:before="200" w:after="120"/>
+      </w:pPr>
+      <w:r>
+        <w:rPr>
+          <w:rFonts w:ascii="PingFangTC-Regular" w:hAnsi="PingFangTC-Regular" w:eastAsia="PingFangTC-Regular" w:cs="PingFangTC-Regular"/>
+          <w:b w:val="0"/>
+          <w:sz w:val="26"/>
+        </w:rPr>
+        <w:t>2026-07-24｜SEC point-in-time 基本面歷史資料</w:t>
+      </w:r>
+    </w:p>
+    <w:p>
+      <w:pPr>
+        <w:pStyle w:val="ListBullet"/>
+        <w:spacing w:after="60" w:line="276" w:lineRule="auto"/>
+      </w:pPr>
+      <w:r>
+        <w:rPr>
+          <w:rFonts w:ascii="PingFangTC-Regular" w:hAnsi="PingFangTC-Regular" w:eastAsia="PingFangTC-Regular" w:cs="PingFangTC-Regular"/>
+          <w:b w:val="0"/>
+          <w:sz w:val="22"/>
+        </w:rPr>
+        <w:t>已執行：SEC 基本面快取每天更新一次；500 個分層樣本目前有 239 個完整官方基本面覆蓋、5 個部分可用、256 個資料不足。</w:t>
       </w:r>
     </w:p>
     <w:p>
@@ -5414,6 +5495,169 @@
           </w:p>
         </w:tc>
       </w:tr>
+      <w:tr>
+        <w:tc>
+          <w:tcPr>
+            <w:tcW w:type="dxa" w:w="1040"/>
+          </w:tcPr>
+          <w:p>
+            <w:pPr>
+              <w:jc w:val="left"/>
+            </w:pPr>
+            <w:r>
+              <w:rPr>
+                <w:rFonts w:ascii="PingFangTC-Regular" w:hAnsi="PingFangTC-Regular" w:eastAsia="PingFangTC-Regular" w:cs="PingFangTC-Regular"/>
+                <w:b w:val="0"/>
+                <w:sz w:val="20"/>
+              </w:rPr>
+              <w:t>D-015</w:t>
+            </w:r>
+          </w:p>
+        </w:tc>
+        <w:tc>
+          <w:tcPr>
+            <w:tcW w:type="dxa" w:w="1040"/>
+          </w:tcPr>
+          <w:p>
+            <w:pPr>
+              <w:jc w:val="left"/>
+            </w:pPr>
+            <w:r>
+              <w:rPr>
+                <w:rFonts w:ascii="PingFangTC-Regular" w:hAnsi="PingFangTC-Regular" w:eastAsia="PingFangTC-Regular" w:cs="PingFangTC-Regular"/>
+                <w:b w:val="0"/>
+                <w:sz w:val="20"/>
+              </w:rPr>
+              <w:t>2026-07-24</w:t>
+            </w:r>
+          </w:p>
+        </w:tc>
+        <w:tc>
+          <w:tcPr>
+            <w:tcW w:type="dxa" w:w="1040"/>
+          </w:tcPr>
+          <w:p>
+            <w:pPr>
+              <w:jc w:val="left"/>
+            </w:pPr>
+            <w:r>
+              <w:rPr>
+                <w:rFonts w:ascii="PingFangTC-Regular" w:hAnsi="PingFangTC-Regular" w:eastAsia="PingFangTC-Regular" w:cs="PingFangTC-Regular"/>
+                <w:b w:val="0"/>
+                <w:sz w:val="20"/>
+              </w:rPr>
+              <w:t>已執行</w:t>
+            </w:r>
+          </w:p>
+        </w:tc>
+        <w:tc>
+          <w:tcPr>
+            <w:tcW w:type="dxa" w:w="1040"/>
+          </w:tcPr>
+          <w:p>
+            <w:pPr>
+              <w:jc w:val="left"/>
+            </w:pPr>
+            <w:r>
+              <w:rPr>
+                <w:rFonts w:ascii="PingFangTC-Regular" w:hAnsi="PingFangTC-Regular" w:eastAsia="PingFangTC-Regular" w:cs="PingFangTC-Regular"/>
+                <w:b w:val="0"/>
+                <w:sz w:val="20"/>
+              </w:rPr>
+              <w:t>基本面</w:t>
+            </w:r>
+          </w:p>
+        </w:tc>
+        <w:tc>
+          <w:tcPr>
+            <w:tcW w:type="dxa" w:w="1040"/>
+          </w:tcPr>
+          <w:p>
+            <w:pPr>
+              <w:jc w:val="left"/>
+            </w:pPr>
+            <w:r>
+              <w:rPr>
+                <w:rFonts w:ascii="PingFangTC-Regular" w:hAnsi="PingFangTC-Regular" w:eastAsia="PingFangTC-Regular" w:cs="PingFangTC-Regular"/>
+                <w:b w:val="0"/>
+                <w:sz w:val="20"/>
+              </w:rPr>
+              <w:t>SEC point-in-time 基本面歷史資料</w:t>
+            </w:r>
+          </w:p>
+        </w:tc>
+        <w:tc>
+          <w:tcPr>
+            <w:tcW w:type="dxa" w:w="1040"/>
+          </w:tcPr>
+          <w:p>
+            <w:pPr>
+              <w:jc w:val="left"/>
+            </w:pPr>
+            <w:r>
+              <w:rPr>
+                <w:rFonts w:ascii="PingFangTC-Regular" w:hAnsi="PingFangTC-Regular" w:eastAsia="PingFangTC-Regular" w:cs="PingFangTC-Regular"/>
+                <w:b w:val="0"/>
+                <w:sz w:val="20"/>
+              </w:rPr>
+              <w:t>以 SEC Company Facts 的 filing date 保存核心科技股營收、現金流、資產、負債、EPS 與資本支出，並回填分層歷史樣本的基本面覆蓋率。</w:t>
+            </w:r>
+          </w:p>
+        </w:tc>
+        <w:tc>
+          <w:tcPr>
+            <w:tcW w:type="dxa" w:w="1040"/>
+          </w:tcPr>
+          <w:p>
+            <w:pPr>
+              <w:jc w:val="left"/>
+            </w:pPr>
+            <w:r>
+              <w:rPr>
+                <w:rFonts w:ascii="PingFangTC-Regular" w:hAnsi="PingFangTC-Regular" w:eastAsia="PingFangTC-Regular" w:cs="PingFangTC-Regular"/>
+                <w:b w:val="0"/>
+                <w:sz w:val="20"/>
+              </w:rPr>
+              <w:t>讓歷史回測只使用當時已公開的官方基本面，避免未來資訊洩漏。</w:t>
+            </w:r>
+          </w:p>
+        </w:tc>
+        <w:tc>
+          <w:tcPr>
+            <w:tcW w:type="dxa" w:w="1040"/>
+          </w:tcPr>
+          <w:p>
+            <w:pPr>
+              <w:jc w:val="left"/>
+            </w:pPr>
+            <w:r>
+              <w:rPr>
+                <w:rFonts w:ascii="PingFangTC-Regular" w:hAnsi="PingFangTC-Regular" w:eastAsia="PingFangTC-Regular" w:cs="PingFangTC-Regular"/>
+                <w:b w:val="0"/>
+                <w:sz w:val="20"/>
+              </w:rPr>
+              <w:t>基本面資料層、分層歷史樣本、金融知識圖譜、量化數據中心</w:t>
+            </w:r>
+          </w:p>
+        </w:tc>
+        <w:tc>
+          <w:tcPr>
+            <w:tcW w:type="dxa" w:w="1040"/>
+          </w:tcPr>
+          <w:p>
+            <w:pPr>
+              <w:jc w:val="left"/>
+            </w:pPr>
+            <w:r>
+              <w:rPr>
+                <w:rFonts w:ascii="PingFangTC-Regular" w:hAnsi="PingFangTC-Regular" w:eastAsia="PingFangTC-Regular" w:cs="PingFangTC-Regular"/>
+                <w:b w:val="0"/>
+                <w:sz w:val="20"/>
+              </w:rPr>
+            </w:r>
+          </w:p>
+        </w:tc>
+      </w:tr>
     </w:tbl>
     <w:p>
       <w:pPr>
@@ -6329,6 +6573,80 @@
           </w:p>
         </w:tc>
       </w:tr>
+      <w:tr>
+        <w:tc>
+          <w:tcPr>
+            <w:tcW w:type="dxa" w:w="2340"/>
+          </w:tcPr>
+          <w:p>
+            <w:pPr>
+              <w:jc w:val="left"/>
+            </w:pPr>
+            <w:r>
+              <w:rPr>
+                <w:rFonts w:ascii="PingFangTC-Regular" w:hAnsi="PingFangTC-Regular" w:eastAsia="PingFangTC-Regular" w:cs="PingFangTC-Regular"/>
+                <w:b w:val="0"/>
+                <w:sz w:val="20"/>
+              </w:rPr>
+              <w:t>2026-07-24</w:t>
+            </w:r>
+          </w:p>
+        </w:tc>
+        <w:tc>
+          <w:tcPr>
+            <w:tcW w:type="dxa" w:w="2340"/>
+          </w:tcPr>
+          <w:p>
+            <w:pPr>
+              <w:jc w:val="left"/>
+            </w:pPr>
+            <w:r>
+              <w:rPr>
+                <w:rFonts w:ascii="PingFangTC-Regular" w:hAnsi="PingFangTC-Regular" w:eastAsia="PingFangTC-Regular" w:cs="PingFangTC-Regular"/>
+                <w:b w:val="0"/>
+                <w:sz w:val="20"/>
+              </w:rPr>
+              <w:t>SEC point-in-time 基本面歷史資料</w:t>
+            </w:r>
+          </w:p>
+        </w:tc>
+        <w:tc>
+          <w:tcPr>
+            <w:tcW w:type="dxa" w:w="2340"/>
+          </w:tcPr>
+          <w:p>
+            <w:pPr>
+              <w:jc w:val="left"/>
+            </w:pPr>
+            <w:r>
+              <w:rPr>
+                <w:rFonts w:ascii="PingFangTC-Regular" w:hAnsi="PingFangTC-Regular" w:eastAsia="PingFangTC-Regular" w:cs="PingFangTC-Regular"/>
+                <w:b w:val="0"/>
+                <w:sz w:val="20"/>
+              </w:rPr>
+              <w:t>讓歷史回測只使用當時已公開的官方基本面，避免未來資訊洩漏。</w:t>
+            </w:r>
+          </w:p>
+        </w:tc>
+        <w:tc>
+          <w:tcPr>
+            <w:tcW w:type="dxa" w:w="2340"/>
+          </w:tcPr>
+          <w:p>
+            <w:pPr>
+              <w:jc w:val="left"/>
+            </w:pPr>
+            <w:r>
+              <w:rPr>
+                <w:rFonts w:ascii="PingFangTC-Regular" w:hAnsi="PingFangTC-Regular" w:eastAsia="PingFangTC-Regular" w:cs="PingFangTC-Regular"/>
+                <w:b w:val="0"/>
+                <w:sz w:val="20"/>
+              </w:rPr>
+              <w:t>Codex 已確認決策</w:t>
+            </w:r>
+          </w:p>
+        </w:tc>
+      </w:tr>
     </w:tbl>
     <w:p>
       <w:pPr>

</xml_diff>

<commit_message>
Add KG backtest readiness and factor reports
</commit_message>
<xml_diff>
--- a/data/觀察版資料/13_專案記憶/專案記憶與討論摘要.docx
+++ b/data/觀察版資料/13_專案記憶/專案記憶與討論摘要.docx
@@ -26,7 +26,7 @@
           <w:b w:val="0"/>
           <w:sz w:val="20"/>
         </w:rPr>
-        <w:t>產生時間：2026-07-26 08:29 UTC｜來源：專案記憶資料夾</w:t>
+        <w:t>產生時間：2026-07-26 09:08 UTC｜來源：專案記憶資料夾</w:t>
       </w:r>
     </w:p>
     <w:p>
@@ -156,7 +156,7 @@
                 <w:b w:val="0"/>
                 <w:sz w:val="20"/>
               </w:rPr>
-              <w:t>15</w:t>
+              <w:t>17</w:t>
             </w:r>
           </w:p>
         </w:tc>
@@ -212,7 +212,7 @@
                 <w:b w:val="0"/>
                 <w:sz w:val="20"/>
               </w:rPr>
-              <w:t>14</w:t>
+              <w:t>16</w:t>
             </w:r>
           </w:p>
         </w:tc>
@@ -324,7 +324,7 @@
                 <w:b w:val="0"/>
                 <w:sz w:val="20"/>
               </w:rPr>
-              <w:t>2026-07-24</w:t>
+              <w:t>2026-07-26</w:t>
             </w:r>
           </w:p>
         </w:tc>
@@ -481,6 +481,154 @@
                 <w:b w:val="0"/>
                 <w:sz w:val="20"/>
               </w:rPr>
+              <w:t>2026-07-26</w:t>
+            </w:r>
+          </w:p>
+        </w:tc>
+        <w:tc>
+          <w:tcPr>
+            <w:tcW w:type="dxa" w:w="2340"/>
+          </w:tcPr>
+          <w:p>
+            <w:pPr>
+              <w:jc w:val="left"/>
+            </w:pPr>
+            <w:r>
+              <w:rPr>
+                <w:rFonts w:ascii="PingFangTC-Regular" w:hAnsi="PingFangTC-Regular" w:eastAsia="PingFangTC-Regular" w:cs="PingFangTC-Regular"/>
+                <w:b w:val="0"/>
+                <w:sz w:val="20"/>
+              </w:rPr>
+              <w:t>LSTM 基準比較與機率校準</w:t>
+            </w:r>
+          </w:p>
+        </w:tc>
+        <w:tc>
+          <w:tcPr>
+            <w:tcW w:type="dxa" w:w="2340"/>
+          </w:tcPr>
+          <w:p>
+            <w:pPr>
+              <w:jc w:val="left"/>
+            </w:pPr>
+            <w:r>
+              <w:rPr>
+                <w:rFonts w:ascii="PingFangTC-Regular" w:hAnsi="PingFangTC-Regular" w:eastAsia="PingFangTC-Regular" w:cs="PingFangTC-Regular"/>
+                <w:b w:val="0"/>
+                <w:sz w:val="20"/>
+              </w:rPr>
+              <w:t>已執行</w:t>
+            </w:r>
+          </w:p>
+        </w:tc>
+      </w:tr>
+      <w:tr>
+        <w:tc>
+          <w:tcPr>
+            <w:tcW w:type="dxa" w:w="2340"/>
+          </w:tcPr>
+          <w:p>
+            <w:pPr>
+              <w:jc w:val="left"/>
+            </w:pPr>
+            <w:r>
+              <w:rPr>
+                <w:rFonts w:ascii="PingFangTC-Regular" w:hAnsi="PingFangTC-Regular" w:eastAsia="PingFangTC-Regular" w:cs="PingFangTC-Regular"/>
+                <w:b w:val="0"/>
+                <w:sz w:val="20"/>
+              </w:rPr>
+              <w:t>決策</w:t>
+            </w:r>
+          </w:p>
+        </w:tc>
+        <w:tc>
+          <w:tcPr>
+            <w:tcW w:type="dxa" w:w="2340"/>
+          </w:tcPr>
+          <w:p>
+            <w:pPr>
+              <w:jc w:val="left"/>
+            </w:pPr>
+            <w:r>
+              <w:rPr>
+                <w:rFonts w:ascii="PingFangTC-Regular" w:hAnsi="PingFangTC-Regular" w:eastAsia="PingFangTC-Regular" w:cs="PingFangTC-Regular"/>
+                <w:b w:val="0"/>
+                <w:sz w:val="20"/>
+              </w:rPr>
+              <w:t>2026-07-26</w:t>
+            </w:r>
+          </w:p>
+        </w:tc>
+        <w:tc>
+          <w:tcPr>
+            <w:tcW w:type="dxa" w:w="2340"/>
+          </w:tcPr>
+          <w:p>
+            <w:pPr>
+              <w:jc w:val="left"/>
+            </w:pPr>
+            <w:r>
+              <w:rPr>
+                <w:rFonts w:ascii="PingFangTC-Regular" w:hAnsi="PingFangTC-Regular" w:eastAsia="PingFangTC-Regular" w:cs="PingFangTC-Regular"/>
+                <w:b w:val="0"/>
+                <w:sz w:val="20"/>
+              </w:rPr>
+              <w:t>KG 歷史回測資格與因子有效性報告</w:t>
+            </w:r>
+          </w:p>
+        </w:tc>
+        <w:tc>
+          <w:tcPr>
+            <w:tcW w:type="dxa" w:w="2340"/>
+          </w:tcPr>
+          <w:p>
+            <w:pPr>
+              <w:jc w:val="left"/>
+            </w:pPr>
+            <w:r>
+              <w:rPr>
+                <w:rFonts w:ascii="PingFangTC-Regular" w:hAnsi="PingFangTC-Regular" w:eastAsia="PingFangTC-Regular" w:cs="PingFangTC-Regular"/>
+                <w:b w:val="0"/>
+                <w:sz w:val="20"/>
+              </w:rPr>
+              <w:t>已執行</w:t>
+            </w:r>
+          </w:p>
+        </w:tc>
+      </w:tr>
+      <w:tr>
+        <w:tc>
+          <w:tcPr>
+            <w:tcW w:type="dxa" w:w="2340"/>
+          </w:tcPr>
+          <w:p>
+            <w:pPr>
+              <w:jc w:val="left"/>
+            </w:pPr>
+            <w:r>
+              <w:rPr>
+                <w:rFonts w:ascii="PingFangTC-Regular" w:hAnsi="PingFangTC-Regular" w:eastAsia="PingFangTC-Regular" w:cs="PingFangTC-Regular"/>
+                <w:b w:val="0"/>
+                <w:sz w:val="20"/>
+              </w:rPr>
+              <w:t>決策</w:t>
+            </w:r>
+          </w:p>
+        </w:tc>
+        <w:tc>
+          <w:tcPr>
+            <w:tcW w:type="dxa" w:w="2340"/>
+          </w:tcPr>
+          <w:p>
+            <w:pPr>
+              <w:jc w:val="left"/>
+            </w:pPr>
+            <w:r>
+              <w:rPr>
+                <w:rFonts w:ascii="PingFangTC-Regular" w:hAnsi="PingFangTC-Regular" w:eastAsia="PingFangTC-Regular" w:cs="PingFangTC-Regular"/>
+                <w:b w:val="0"/>
+                <w:sz w:val="20"/>
+              </w:rPr>
               <w:t>2026-07-24</w:t>
             </w:r>
           </w:p>
@@ -573,155 +721,7 @@
                 <w:b w:val="0"/>
                 <w:sz w:val="20"/>
               </w:rPr>
-              <w:t>專案記憶受控寫入流程</w:t>
-            </w:r>
-          </w:p>
-        </w:tc>
-        <w:tc>
-          <w:tcPr>
-            <w:tcW w:type="dxa" w:w="2340"/>
-          </w:tcPr>
-          <w:p>
-            <w:pPr>
-              <w:jc w:val="left"/>
-            </w:pPr>
-            <w:r>
-              <w:rPr>
-                <w:rFonts w:ascii="PingFangTC-Regular" w:hAnsi="PingFangTC-Regular" w:eastAsia="PingFangTC-Regular" w:cs="PingFangTC-Regular"/>
-                <w:b w:val="0"/>
-                <w:sz w:val="20"/>
-              </w:rPr>
-              <w:t>已執行</w:t>
-            </w:r>
-          </w:p>
-        </w:tc>
-      </w:tr>
-      <w:tr>
-        <w:tc>
-          <w:tcPr>
-            <w:tcW w:type="dxa" w:w="2340"/>
-          </w:tcPr>
-          <w:p>
-            <w:pPr>
-              <w:jc w:val="left"/>
-            </w:pPr>
-            <w:r>
-              <w:rPr>
-                <w:rFonts w:ascii="PingFangTC-Regular" w:hAnsi="PingFangTC-Regular" w:eastAsia="PingFangTC-Regular" w:cs="PingFangTC-Regular"/>
-                <w:b w:val="0"/>
-                <w:sz w:val="20"/>
-              </w:rPr>
-              <w:t>決策</w:t>
-            </w:r>
-          </w:p>
-        </w:tc>
-        <w:tc>
-          <w:tcPr>
-            <w:tcW w:type="dxa" w:w="2340"/>
-          </w:tcPr>
-          <w:p>
-            <w:pPr>
-              <w:jc w:val="left"/>
-            </w:pPr>
-            <w:r>
-              <w:rPr>
-                <w:rFonts w:ascii="PingFangTC-Regular" w:hAnsi="PingFangTC-Regular" w:eastAsia="PingFangTC-Regular" w:cs="PingFangTC-Regular"/>
-                <w:b w:val="0"/>
-                <w:sz w:val="20"/>
-              </w:rPr>
-              <w:t>2026-07-24</w:t>
-            </w:r>
-          </w:p>
-        </w:tc>
-        <w:tc>
-          <w:tcPr>
-            <w:tcW w:type="dxa" w:w="2340"/>
-          </w:tcPr>
-          <w:p>
-            <w:pPr>
-              <w:jc w:val="left"/>
-            </w:pPr>
-            <w:r>
-              <w:rPr>
-                <w:rFonts w:ascii="PingFangTC-Regular" w:hAnsi="PingFangTC-Regular" w:eastAsia="PingFangTC-Regular" w:cs="PingFangTC-Regular"/>
-                <w:b w:val="0"/>
-                <w:sz w:val="20"/>
-              </w:rPr>
-              <w:t>分層隨機歷史回測與多來源資料方向</w:t>
-            </w:r>
-          </w:p>
-        </w:tc>
-        <w:tc>
-          <w:tcPr>
-            <w:tcW w:type="dxa" w:w="2340"/>
-          </w:tcPr>
-          <w:p>
-            <w:pPr>
-              <w:jc w:val="left"/>
-            </w:pPr>
-            <w:r>
-              <w:rPr>
-                <w:rFonts w:ascii="PingFangTC-Regular" w:hAnsi="PingFangTC-Regular" w:eastAsia="PingFangTC-Regular" w:cs="PingFangTC-Regular"/>
-                <w:b w:val="0"/>
-                <w:sz w:val="20"/>
-              </w:rPr>
-              <w:t>待執行</w:t>
-            </w:r>
-          </w:p>
-        </w:tc>
-      </w:tr>
-      <w:tr>
-        <w:tc>
-          <w:tcPr>
-            <w:tcW w:type="dxa" w:w="2340"/>
-          </w:tcPr>
-          <w:p>
-            <w:pPr>
-              <w:jc w:val="left"/>
-            </w:pPr>
-            <w:r>
-              <w:rPr>
-                <w:rFonts w:ascii="PingFangTC-Regular" w:hAnsi="PingFangTC-Regular" w:eastAsia="PingFangTC-Regular" w:cs="PingFangTC-Regular"/>
-                <w:b w:val="0"/>
-                <w:sz w:val="20"/>
-              </w:rPr>
-              <w:t>決策</w:t>
-            </w:r>
-          </w:p>
-        </w:tc>
-        <w:tc>
-          <w:tcPr>
-            <w:tcW w:type="dxa" w:w="2340"/>
-          </w:tcPr>
-          <w:p>
-            <w:pPr>
-              <w:jc w:val="left"/>
-            </w:pPr>
-            <w:r>
-              <w:rPr>
-                <w:rFonts w:ascii="PingFangTC-Regular" w:hAnsi="PingFangTC-Regular" w:eastAsia="PingFangTC-Regular" w:cs="PingFangTC-Regular"/>
-                <w:b w:val="0"/>
-                <w:sz w:val="20"/>
-              </w:rPr>
-              <w:t>2026-07-24</w:t>
-            </w:r>
-          </w:p>
-        </w:tc>
-        <w:tc>
-          <w:tcPr>
-            <w:tcW w:type="dxa" w:w="2340"/>
-          </w:tcPr>
-          <w:p>
-            <w:pPr>
-              <w:jc w:val="left"/>
-            </w:pPr>
-            <w:r>
-              <w:rPr>
-                <w:rFonts w:ascii="PingFangTC-Regular" w:hAnsi="PingFangTC-Regular" w:eastAsia="PingFangTC-Regular" w:cs="PingFangTC-Regular"/>
-                <w:b w:val="0"/>
-                <w:sz w:val="20"/>
-              </w:rPr>
-              <w:t>分層歷史市場樣本基線已建立</w:t>
+              <w:t>SEC point-in-time 基本面歷史資料</w:t>
             </w:r>
           </w:p>
         </w:tc>
@@ -814,6 +814,154 @@
                 <w:sz w:val="20"/>
               </w:rPr>
               <w:t>已執行</w:t>
+            </w:r>
+          </w:p>
+        </w:tc>
+      </w:tr>
+      <w:tr>
+        <w:tc>
+          <w:tcPr>
+            <w:tcW w:type="dxa" w:w="2340"/>
+          </w:tcPr>
+          <w:p>
+            <w:pPr>
+              <w:jc w:val="left"/>
+            </w:pPr>
+            <w:r>
+              <w:rPr>
+                <w:rFonts w:ascii="PingFangTC-Regular" w:hAnsi="PingFangTC-Regular" w:eastAsia="PingFangTC-Regular" w:cs="PingFangTC-Regular"/>
+                <w:b w:val="0"/>
+                <w:sz w:val="20"/>
+              </w:rPr>
+              <w:t>記憶更新</w:t>
+            </w:r>
+          </w:p>
+        </w:tc>
+        <w:tc>
+          <w:tcPr>
+            <w:tcW w:type="dxa" w:w="2340"/>
+          </w:tcPr>
+          <w:p>
+            <w:pPr>
+              <w:jc w:val="left"/>
+            </w:pPr>
+            <w:r>
+              <w:rPr>
+                <w:rFonts w:ascii="PingFangTC-Regular" w:hAnsi="PingFangTC-Regular" w:eastAsia="PingFangTC-Regular" w:cs="PingFangTC-Regular"/>
+                <w:b w:val="0"/>
+                <w:sz w:val="20"/>
+              </w:rPr>
+              <w:t>2026-07-26</w:t>
+            </w:r>
+          </w:p>
+        </w:tc>
+        <w:tc>
+          <w:tcPr>
+            <w:tcW w:type="dxa" w:w="2340"/>
+          </w:tcPr>
+          <w:p>
+            <w:pPr>
+              <w:jc w:val="left"/>
+            </w:pPr>
+            <w:r>
+              <w:rPr>
+                <w:rFonts w:ascii="PingFangTC-Regular" w:hAnsi="PingFangTC-Regular" w:eastAsia="PingFangTC-Regular" w:cs="PingFangTC-Regular"/>
+                <w:b w:val="0"/>
+                <w:sz w:val="20"/>
+              </w:rPr>
+              <w:t>KG 歷史回測資格與因子有效性報告</w:t>
+            </w:r>
+          </w:p>
+        </w:tc>
+        <w:tc>
+          <w:tcPr>
+            <w:tcW w:type="dxa" w:w="2340"/>
+          </w:tcPr>
+          <w:p>
+            <w:pPr>
+              <w:jc w:val="left"/>
+            </w:pPr>
+            <w:r>
+              <w:rPr>
+                <w:rFonts w:ascii="PingFangTC-Regular" w:hAnsi="PingFangTC-Regular" w:eastAsia="PingFangTC-Regular" w:cs="PingFangTC-Regular"/>
+                <w:b w:val="0"/>
+                <w:sz w:val="20"/>
+              </w:rPr>
+              <w:t>Codex 已確認決策</w:t>
+            </w:r>
+          </w:p>
+        </w:tc>
+      </w:tr>
+      <w:tr>
+        <w:tc>
+          <w:tcPr>
+            <w:tcW w:type="dxa" w:w="2340"/>
+          </w:tcPr>
+          <w:p>
+            <w:pPr>
+              <w:jc w:val="left"/>
+            </w:pPr>
+            <w:r>
+              <w:rPr>
+                <w:rFonts w:ascii="PingFangTC-Regular" w:hAnsi="PingFangTC-Regular" w:eastAsia="PingFangTC-Regular" w:cs="PingFangTC-Regular"/>
+                <w:b w:val="0"/>
+                <w:sz w:val="20"/>
+              </w:rPr>
+              <w:t>記憶更新</w:t>
+            </w:r>
+          </w:p>
+        </w:tc>
+        <w:tc>
+          <w:tcPr>
+            <w:tcW w:type="dxa" w:w="2340"/>
+          </w:tcPr>
+          <w:p>
+            <w:pPr>
+              <w:jc w:val="left"/>
+            </w:pPr>
+            <w:r>
+              <w:rPr>
+                <w:rFonts w:ascii="PingFangTC-Regular" w:hAnsi="PingFangTC-Regular" w:eastAsia="PingFangTC-Regular" w:cs="PingFangTC-Regular"/>
+                <w:b w:val="0"/>
+                <w:sz w:val="20"/>
+              </w:rPr>
+              <w:t>2026-07-26</w:t>
+            </w:r>
+          </w:p>
+        </w:tc>
+        <w:tc>
+          <w:tcPr>
+            <w:tcW w:type="dxa" w:w="2340"/>
+          </w:tcPr>
+          <w:p>
+            <w:pPr>
+              <w:jc w:val="left"/>
+            </w:pPr>
+            <w:r>
+              <w:rPr>
+                <w:rFonts w:ascii="PingFangTC-Regular" w:hAnsi="PingFangTC-Regular" w:eastAsia="PingFangTC-Regular" w:cs="PingFangTC-Regular"/>
+                <w:b w:val="0"/>
+                <w:sz w:val="20"/>
+              </w:rPr>
+              <w:t>LSTM 基準比較與機率校準</w:t>
+            </w:r>
+          </w:p>
+        </w:tc>
+        <w:tc>
+          <w:tcPr>
+            <w:tcW w:type="dxa" w:w="2340"/>
+          </w:tcPr>
+          <w:p>
+            <w:pPr>
+              <w:jc w:val="left"/>
+            </w:pPr>
+            <w:r>
+              <w:rPr>
+                <w:rFonts w:ascii="PingFangTC-Regular" w:hAnsi="PingFangTC-Regular" w:eastAsia="PingFangTC-Regular" w:cs="PingFangTC-Regular"/>
+                <w:b w:val="0"/>
+                <w:sz w:val="20"/>
+              </w:rPr>
+              <w:t>Codex 已確認決策</w:t>
             </w:r>
           </w:p>
         </w:tc>
@@ -1018,154 +1166,6 @@
                 <w:sz w:val="20"/>
               </w:rPr>
               <w:t>分層隨機歷史回測與多來源資料方向</w:t>
-            </w:r>
-          </w:p>
-        </w:tc>
-        <w:tc>
-          <w:tcPr>
-            <w:tcW w:type="dxa" w:w="2340"/>
-          </w:tcPr>
-          <w:p>
-            <w:pPr>
-              <w:jc w:val="left"/>
-            </w:pPr>
-            <w:r>
-              <w:rPr>
-                <w:rFonts w:ascii="PingFangTC-Regular" w:hAnsi="PingFangTC-Regular" w:eastAsia="PingFangTC-Regular" w:cs="PingFangTC-Regular"/>
-                <w:b w:val="0"/>
-                <w:sz w:val="20"/>
-              </w:rPr>
-              <w:t>Codex 已確認決策</w:t>
-            </w:r>
-          </w:p>
-        </w:tc>
-      </w:tr>
-      <w:tr>
-        <w:tc>
-          <w:tcPr>
-            <w:tcW w:type="dxa" w:w="2340"/>
-          </w:tcPr>
-          <w:p>
-            <w:pPr>
-              <w:jc w:val="left"/>
-            </w:pPr>
-            <w:r>
-              <w:rPr>
-                <w:rFonts w:ascii="PingFangTC-Regular" w:hAnsi="PingFangTC-Regular" w:eastAsia="PingFangTC-Regular" w:cs="PingFangTC-Regular"/>
-                <w:b w:val="0"/>
-                <w:sz w:val="20"/>
-              </w:rPr>
-              <w:t>記憶更新</w:t>
-            </w:r>
-          </w:p>
-        </w:tc>
-        <w:tc>
-          <w:tcPr>
-            <w:tcW w:type="dxa" w:w="2340"/>
-          </w:tcPr>
-          <w:p>
-            <w:pPr>
-              <w:jc w:val="left"/>
-            </w:pPr>
-            <w:r>
-              <w:rPr>
-                <w:rFonts w:ascii="PingFangTC-Regular" w:hAnsi="PingFangTC-Regular" w:eastAsia="PingFangTC-Regular" w:cs="PingFangTC-Regular"/>
-                <w:b w:val="0"/>
-                <w:sz w:val="20"/>
-              </w:rPr>
-              <w:t>2026-07-24</w:t>
-            </w:r>
-          </w:p>
-        </w:tc>
-        <w:tc>
-          <w:tcPr>
-            <w:tcW w:type="dxa" w:w="2340"/>
-          </w:tcPr>
-          <w:p>
-            <w:pPr>
-              <w:jc w:val="left"/>
-            </w:pPr>
-            <w:r>
-              <w:rPr>
-                <w:rFonts w:ascii="PingFangTC-Regular" w:hAnsi="PingFangTC-Regular" w:eastAsia="PingFangTC-Regular" w:cs="PingFangTC-Regular"/>
-                <w:b w:val="0"/>
-                <w:sz w:val="20"/>
-              </w:rPr>
-              <w:t>分層歷史市場樣本基線已建立</w:t>
-            </w:r>
-          </w:p>
-        </w:tc>
-        <w:tc>
-          <w:tcPr>
-            <w:tcW w:type="dxa" w:w="2340"/>
-          </w:tcPr>
-          <w:p>
-            <w:pPr>
-              <w:jc w:val="left"/>
-            </w:pPr>
-            <w:r>
-              <w:rPr>
-                <w:rFonts w:ascii="PingFangTC-Regular" w:hAnsi="PingFangTC-Regular" w:eastAsia="PingFangTC-Regular" w:cs="PingFangTC-Regular"/>
-                <w:b w:val="0"/>
-                <w:sz w:val="20"/>
-              </w:rPr>
-              <w:t>Codex 已確認決策</w:t>
-            </w:r>
-          </w:p>
-        </w:tc>
-      </w:tr>
-      <w:tr>
-        <w:tc>
-          <w:tcPr>
-            <w:tcW w:type="dxa" w:w="2340"/>
-          </w:tcPr>
-          <w:p>
-            <w:pPr>
-              <w:jc w:val="left"/>
-            </w:pPr>
-            <w:r>
-              <w:rPr>
-                <w:rFonts w:ascii="PingFangTC-Regular" w:hAnsi="PingFangTC-Regular" w:eastAsia="PingFangTC-Regular" w:cs="PingFangTC-Regular"/>
-                <w:b w:val="0"/>
-                <w:sz w:val="20"/>
-              </w:rPr>
-              <w:t>記憶更新</w:t>
-            </w:r>
-          </w:p>
-        </w:tc>
-        <w:tc>
-          <w:tcPr>
-            <w:tcW w:type="dxa" w:w="2340"/>
-          </w:tcPr>
-          <w:p>
-            <w:pPr>
-              <w:jc w:val="left"/>
-            </w:pPr>
-            <w:r>
-              <w:rPr>
-                <w:rFonts w:ascii="PingFangTC-Regular" w:hAnsi="PingFangTC-Regular" w:eastAsia="PingFangTC-Regular" w:cs="PingFangTC-Regular"/>
-                <w:b w:val="0"/>
-                <w:sz w:val="20"/>
-              </w:rPr>
-              <w:t>2026-07-24</w:t>
-            </w:r>
-          </w:p>
-        </w:tc>
-        <w:tc>
-          <w:tcPr>
-            <w:tcW w:type="dxa" w:w="2340"/>
-          </w:tcPr>
-          <w:p>
-            <w:pPr>
-              <w:jc w:val="left"/>
-            </w:pPr>
-            <w:r>
-              <w:rPr>
-                <w:rFonts w:ascii="PingFangTC-Regular" w:hAnsi="PingFangTC-Regular" w:eastAsia="PingFangTC-Regular" w:cs="PingFangTC-Regular"/>
-                <w:b w:val="0"/>
-                <w:sz w:val="20"/>
-              </w:rPr>
-              <w:t>KG 新聞出版者與跨來源識別修正</w:t>
             </w:r>
           </w:p>
         </w:tc>
@@ -1804,6 +1804,60 @@
           <w:sz w:val="22"/>
         </w:rPr>
         <w:t>基本面研究遵守 point-in-time 原則，以 filed_at 作為可用時間。歷史資料不足是正式資料品質狀態，不可用後來財報補寫過去。</w:t>
+      </w:r>
+    </w:p>
+    <w:p>
+      <w:pPr>
+        <w:spacing w:before="200" w:after="120"/>
+      </w:pPr>
+      <w:r>
+        <w:rPr>
+          <w:rFonts w:ascii="PingFangTC-Regular" w:hAnsi="PingFangTC-Regular" w:eastAsia="PingFangTC-Regular" w:cs="PingFangTC-Regular"/>
+          <w:b w:val="0"/>
+          <w:sz w:val="26"/>
+        </w:rPr>
+        <w:t>2026-07-26｜KG 歷史回測資格與因子有效性報告</w:t>
+      </w:r>
+    </w:p>
+    <w:p>
+      <w:pPr>
+        <w:pStyle w:val="ListBullet"/>
+        <w:spacing w:after="60" w:line="276" w:lineRule="auto"/>
+      </w:pPr>
+      <w:r>
+        <w:rPr>
+          <w:rFonts w:ascii="PingFangTC-Regular" w:hAnsi="PingFangTC-Regular" w:eastAsia="PingFangTC-Regular" w:cs="PingFangTC-Regular"/>
+          <w:b w:val="0"/>
+          <w:sz w:val="22"/>
+        </w:rPr>
+        <w:t>KG 回測資格必須可追溯。市場技術分層結果只能描述關聯，不得直接被稱為因果或投資承諾。</w:t>
+      </w:r>
+    </w:p>
+    <w:p>
+      <w:pPr>
+        <w:spacing w:before="200" w:after="120"/>
+      </w:pPr>
+      <w:r>
+        <w:rPr>
+          <w:rFonts w:ascii="PingFangTC-Regular" w:hAnsi="PingFangTC-Regular" w:eastAsia="PingFangTC-Regular" w:cs="PingFangTC-Regular"/>
+          <w:b w:val="0"/>
+          <w:sz w:val="26"/>
+        </w:rPr>
+        <w:t>2026-07-26｜LSTM 基準比較與機率校準</w:t>
+      </w:r>
+    </w:p>
+    <w:p>
+      <w:pPr>
+        <w:pStyle w:val="ListBullet"/>
+        <w:spacing w:after="60" w:line="276" w:lineRule="auto"/>
+      </w:pPr>
+      <w:r>
+        <w:rPr>
+          <w:rFonts w:ascii="PingFangTC-Regular" w:hAnsi="PingFangTC-Regular" w:eastAsia="PingFangTC-Regular" w:cs="PingFangTC-Regular"/>
+          <w:b w:val="0"/>
+          <w:sz w:val="22"/>
+        </w:rPr>
+        <w:t>模型表現應同時呈現樣本數、基準比較、方向報酬與機率校準，不應用單一成功率作結論。</w:t>
       </w:r>
     </w:p>
     <w:p>
@@ -2587,6 +2641,60 @@
     </w:p>
     <w:p>
       <w:pPr>
+        <w:spacing w:before="200" w:after="120"/>
+      </w:pPr>
+      <w:r>
+        <w:rPr>
+          <w:rFonts w:ascii="PingFangTC-Regular" w:hAnsi="PingFangTC-Regular" w:eastAsia="PingFangTC-Regular" w:cs="PingFangTC-Regular"/>
+          <w:b w:val="0"/>
+          <w:sz w:val="26"/>
+        </w:rPr>
+        <w:t>2026-07-26｜KG 歷史回測資格與因子有效性報告</w:t>
+      </w:r>
+    </w:p>
+    <w:p>
+      <w:pPr>
+        <w:pStyle w:val="ListBullet"/>
+        <w:spacing w:after="60" w:line="276" w:lineRule="auto"/>
+      </w:pPr>
+      <w:r>
+        <w:rPr>
+          <w:rFonts w:ascii="PingFangTC-Regular" w:hAnsi="PingFangTC-Regular" w:eastAsia="PingFangTC-Regular" w:cs="PingFangTC-Regular"/>
+          <w:b w:val="0"/>
+          <w:sz w:val="22"/>
+        </w:rPr>
+        <w:t>使用 500 個固定分層歷史樣本先建立因子描述統計；歷史多來源新聞仍待可靠來源回補，不得以今日新聞倒灌。</w:t>
+      </w:r>
+    </w:p>
+    <w:p>
+      <w:pPr>
+        <w:spacing w:before="200" w:after="120"/>
+      </w:pPr>
+      <w:r>
+        <w:rPr>
+          <w:rFonts w:ascii="PingFangTC-Regular" w:hAnsi="PingFangTC-Regular" w:eastAsia="PingFangTC-Regular" w:cs="PingFangTC-Regular"/>
+          <w:b w:val="0"/>
+          <w:sz w:val="26"/>
+        </w:rPr>
+        <w:t>2026-07-26｜LSTM 基準比較與機率校準</w:t>
+      </w:r>
+    </w:p>
+    <w:p>
+      <w:pPr>
+        <w:pStyle w:val="ListBullet"/>
+        <w:spacing w:after="60" w:line="276" w:lineRule="auto"/>
+      </w:pPr>
+      <w:r>
+        <w:rPr>
+          <w:rFonts w:ascii="PingFangTC-Regular" w:hAnsi="PingFangTC-Regular" w:eastAsia="PingFangTC-Regular" w:cs="PingFangTC-Regular"/>
+          <w:b w:val="0"/>
+          <w:sz w:val="22"/>
+        </w:rPr>
+        <w:t>目前僅有 38 筆測試資料，低信心狀態必須保留；新增欄位不改寫歷史模型輸出。</w:t>
+      </w:r>
+    </w:p>
+    <w:p>
+      <w:pPr>
         <w:spacing w:before="280" w:after="120"/>
       </w:pPr>
       <w:r>
@@ -3019,6 +3127,60 @@
           <w:sz w:val="22"/>
         </w:rPr>
         <w:t>已執行：SEC 基本面快取每天更新一次；500 個分層樣本目前有 239 個完整官方基本面覆蓋、5 個部分可用、256 個資料不足。</w:t>
+      </w:r>
+    </w:p>
+    <w:p>
+      <w:pPr>
+        <w:spacing w:before="200" w:after="120"/>
+      </w:pPr>
+      <w:r>
+        <w:rPr>
+          <w:rFonts w:ascii="PingFangTC-Regular" w:hAnsi="PingFangTC-Regular" w:eastAsia="PingFangTC-Regular" w:cs="PingFangTC-Regular"/>
+          <w:b w:val="0"/>
+          <w:sz w:val="26"/>
+        </w:rPr>
+        <w:t>2026-07-26｜KG 歷史回測資格與因子有效性報告</w:t>
+      </w:r>
+    </w:p>
+    <w:p>
+      <w:pPr>
+        <w:pStyle w:val="ListBullet"/>
+        <w:spacing w:after="60" w:line="276" w:lineRule="auto"/>
+      </w:pPr>
+      <w:r>
+        <w:rPr>
+          <w:rFonts w:ascii="PingFangTC-Regular" w:hAnsi="PingFangTC-Regular" w:eastAsia="PingFangTC-Regular" w:cs="PingFangTC-Regular"/>
+          <w:b w:val="0"/>
+          <w:sz w:val="22"/>
+        </w:rPr>
+        <w:t>已建立回測資格與因子報告快取；下一階段是以速率受控的方式回補歷史多來源事件。</w:t>
+      </w:r>
+    </w:p>
+    <w:p>
+      <w:pPr>
+        <w:spacing w:before="200" w:after="120"/>
+      </w:pPr>
+      <w:r>
+        <w:rPr>
+          <w:rFonts w:ascii="PingFangTC-Regular" w:hAnsi="PingFangTC-Regular" w:eastAsia="PingFangTC-Regular" w:cs="PingFangTC-Regular"/>
+          <w:b w:val="0"/>
+          <w:sz w:val="26"/>
+        </w:rPr>
+        <w:t>2026-07-26｜LSTM 基準比較與機率校準</w:t>
+      </w:r>
+    </w:p>
+    <w:p>
+      <w:pPr>
+        <w:pStyle w:val="ListBullet"/>
+        <w:spacing w:after="60" w:line="276" w:lineRule="auto"/>
+      </w:pPr>
+      <w:r>
+        <w:rPr>
+          <w:rFonts w:ascii="PingFangTC-Regular" w:hAnsi="PingFangTC-Regular" w:eastAsia="PingFangTC-Regular" w:cs="PingFangTC-Regular"/>
+          <w:b w:val="0"/>
+          <w:sz w:val="22"/>
+        </w:rPr>
+        <w:t>LSTM 新評估已生成，資料洩漏檢查仍為 0；樣本數不足以調高模型信心。</w:t>
       </w:r>
     </w:p>
     <w:p>
@@ -5658,6 +5820,332 @@
           </w:p>
         </w:tc>
       </w:tr>
+      <w:tr>
+        <w:tc>
+          <w:tcPr>
+            <w:tcW w:type="dxa" w:w="1040"/>
+          </w:tcPr>
+          <w:p>
+            <w:pPr>
+              <w:jc w:val="left"/>
+            </w:pPr>
+            <w:r>
+              <w:rPr>
+                <w:rFonts w:ascii="PingFangTC-Regular" w:hAnsi="PingFangTC-Regular" w:eastAsia="PingFangTC-Regular" w:cs="PingFangTC-Regular"/>
+                <w:b w:val="0"/>
+                <w:sz w:val="20"/>
+              </w:rPr>
+              <w:t>D-016</w:t>
+            </w:r>
+          </w:p>
+        </w:tc>
+        <w:tc>
+          <w:tcPr>
+            <w:tcW w:type="dxa" w:w="1040"/>
+          </w:tcPr>
+          <w:p>
+            <w:pPr>
+              <w:jc w:val="left"/>
+            </w:pPr>
+            <w:r>
+              <w:rPr>
+                <w:rFonts w:ascii="PingFangTC-Regular" w:hAnsi="PingFangTC-Regular" w:eastAsia="PingFangTC-Regular" w:cs="PingFangTC-Regular"/>
+                <w:b w:val="0"/>
+                <w:sz w:val="20"/>
+              </w:rPr>
+              <w:t>2026-07-26</w:t>
+            </w:r>
+          </w:p>
+        </w:tc>
+        <w:tc>
+          <w:tcPr>
+            <w:tcW w:type="dxa" w:w="1040"/>
+          </w:tcPr>
+          <w:p>
+            <w:pPr>
+              <w:jc w:val="left"/>
+            </w:pPr>
+            <w:r>
+              <w:rPr>
+                <w:rFonts w:ascii="PingFangTC-Regular" w:hAnsi="PingFangTC-Regular" w:eastAsia="PingFangTC-Regular" w:cs="PingFangTC-Regular"/>
+                <w:b w:val="0"/>
+                <w:sz w:val="20"/>
+              </w:rPr>
+              <w:t>已執行</w:t>
+            </w:r>
+          </w:p>
+        </w:tc>
+        <w:tc>
+          <w:tcPr>
+            <w:tcW w:type="dxa" w:w="1040"/>
+          </w:tcPr>
+          <w:p>
+            <w:pPr>
+              <w:jc w:val="left"/>
+            </w:pPr>
+            <w:r>
+              <w:rPr>
+                <w:rFonts w:ascii="PingFangTC-Regular" w:hAnsi="PingFangTC-Regular" w:eastAsia="PingFangTC-Regular" w:cs="PingFangTC-Regular"/>
+                <w:b w:val="0"/>
+                <w:sz w:val="20"/>
+              </w:rPr>
+              <w:t>回測</w:t>
+            </w:r>
+          </w:p>
+        </w:tc>
+        <w:tc>
+          <w:tcPr>
+            <w:tcW w:type="dxa" w:w="1040"/>
+          </w:tcPr>
+          <w:p>
+            <w:pPr>
+              <w:jc w:val="left"/>
+            </w:pPr>
+            <w:r>
+              <w:rPr>
+                <w:rFonts w:ascii="PingFangTC-Regular" w:hAnsi="PingFangTC-Regular" w:eastAsia="PingFangTC-Regular" w:cs="PingFangTC-Regular"/>
+                <w:b w:val="0"/>
+                <w:sz w:val="20"/>
+              </w:rPr>
+              <w:t>KG 歷史回測資格與因子有效性報告</w:t>
+            </w:r>
+          </w:p>
+        </w:tc>
+        <w:tc>
+          <w:tcPr>
+            <w:tcW w:type="dxa" w:w="1040"/>
+          </w:tcPr>
+          <w:p>
+            <w:pPr>
+              <w:jc w:val="left"/>
+            </w:pPr>
+            <w:r>
+              <w:rPr>
+                <w:rFonts w:ascii="PingFangTC-Regular" w:hAnsi="PingFangTC-Regular" w:eastAsia="PingFangTC-Regular" w:cs="PingFangTC-Regular"/>
+                <w:b w:val="0"/>
+                <w:sz w:val="20"/>
+              </w:rPr>
+              <w:t>新增歷史 KG 回測資格層與技術因子有效性報告；只有同時具備多來源事件和 point-in-time 基本面者才能進完整 KG 回測。</w:t>
+            </w:r>
+          </w:p>
+        </w:tc>
+        <w:tc>
+          <w:tcPr>
+            <w:tcW w:type="dxa" w:w="1040"/>
+          </w:tcPr>
+          <w:p>
+            <w:pPr>
+              <w:jc w:val="left"/>
+            </w:pPr>
+            <w:r>
+              <w:rPr>
+                <w:rFonts w:ascii="PingFangTC-Regular" w:hAnsi="PingFangTC-Regular" w:eastAsia="PingFangTC-Regular" w:cs="PingFangTC-Regular"/>
+                <w:b w:val="0"/>
+                <w:sz w:val="20"/>
+              </w:rPr>
+              <w:t>將市場技術基線與知識圖譜證據分開，避免缺少歷史新聞時產生虛假的 KG 回測結論。</w:t>
+            </w:r>
+          </w:p>
+        </w:tc>
+        <w:tc>
+          <w:tcPr>
+            <w:tcW w:type="dxa" w:w="1040"/>
+          </w:tcPr>
+          <w:p>
+            <w:pPr>
+              <w:jc w:val="left"/>
+            </w:pPr>
+            <w:r>
+              <w:rPr>
+                <w:rFonts w:ascii="PingFangTC-Regular" w:hAnsi="PingFangTC-Regular" w:eastAsia="PingFangTC-Regular" w:cs="PingFangTC-Regular"/>
+                <w:b w:val="0"/>
+                <w:sz w:val="20"/>
+              </w:rPr>
+              <w:t>金融知識圖譜、量化數據中心、資料匯出、GitHub Actions 更新流程</w:t>
+            </w:r>
+          </w:p>
+        </w:tc>
+        <w:tc>
+          <w:tcPr>
+            <w:tcW w:type="dxa" w:w="1040"/>
+          </w:tcPr>
+          <w:p>
+            <w:pPr>
+              <w:jc w:val="left"/>
+            </w:pPr>
+            <w:r>
+              <w:rPr>
+                <w:rFonts w:ascii="PingFangTC-Regular" w:hAnsi="PingFangTC-Regular" w:eastAsia="PingFangTC-Regular" w:cs="PingFangTC-Regular"/>
+                <w:b w:val="0"/>
+                <w:sz w:val="20"/>
+              </w:rPr>
+            </w:r>
+          </w:p>
+        </w:tc>
+      </w:tr>
+      <w:tr>
+        <w:tc>
+          <w:tcPr>
+            <w:tcW w:type="dxa" w:w="1040"/>
+          </w:tcPr>
+          <w:p>
+            <w:pPr>
+              <w:jc w:val="left"/>
+            </w:pPr>
+            <w:r>
+              <w:rPr>
+                <w:rFonts w:ascii="PingFangTC-Regular" w:hAnsi="PingFangTC-Regular" w:eastAsia="PingFangTC-Regular" w:cs="PingFangTC-Regular"/>
+                <w:b w:val="0"/>
+                <w:sz w:val="20"/>
+              </w:rPr>
+              <w:t>D-017</w:t>
+            </w:r>
+          </w:p>
+        </w:tc>
+        <w:tc>
+          <w:tcPr>
+            <w:tcW w:type="dxa" w:w="1040"/>
+          </w:tcPr>
+          <w:p>
+            <w:pPr>
+              <w:jc w:val="left"/>
+            </w:pPr>
+            <w:r>
+              <w:rPr>
+                <w:rFonts w:ascii="PingFangTC-Regular" w:hAnsi="PingFangTC-Regular" w:eastAsia="PingFangTC-Regular" w:cs="PingFangTC-Regular"/>
+                <w:b w:val="0"/>
+                <w:sz w:val="20"/>
+              </w:rPr>
+              <w:t>2026-07-26</w:t>
+            </w:r>
+          </w:p>
+        </w:tc>
+        <w:tc>
+          <w:tcPr>
+            <w:tcW w:type="dxa" w:w="1040"/>
+          </w:tcPr>
+          <w:p>
+            <w:pPr>
+              <w:jc w:val="left"/>
+            </w:pPr>
+            <w:r>
+              <w:rPr>
+                <w:rFonts w:ascii="PingFangTC-Regular" w:hAnsi="PingFangTC-Regular" w:eastAsia="PingFangTC-Regular" w:cs="PingFangTC-Regular"/>
+                <w:b w:val="0"/>
+                <w:sz w:val="20"/>
+              </w:rPr>
+              <w:t>已執行</w:t>
+            </w:r>
+          </w:p>
+        </w:tc>
+        <w:tc>
+          <w:tcPr>
+            <w:tcW w:type="dxa" w:w="1040"/>
+          </w:tcPr>
+          <w:p>
+            <w:pPr>
+              <w:jc w:val="left"/>
+            </w:pPr>
+            <w:r>
+              <w:rPr>
+                <w:rFonts w:ascii="PingFangTC-Regular" w:hAnsi="PingFangTC-Regular" w:eastAsia="PingFangTC-Regular" w:cs="PingFangTC-Regular"/>
+                <w:b w:val="0"/>
+                <w:sz w:val="20"/>
+              </w:rPr>
+              <w:t>模型</w:t>
+            </w:r>
+          </w:p>
+        </w:tc>
+        <w:tc>
+          <w:tcPr>
+            <w:tcW w:type="dxa" w:w="1040"/>
+          </w:tcPr>
+          <w:p>
+            <w:pPr>
+              <w:jc w:val="left"/>
+            </w:pPr>
+            <w:r>
+              <w:rPr>
+                <w:rFonts w:ascii="PingFangTC-Regular" w:hAnsi="PingFangTC-Regular" w:eastAsia="PingFangTC-Regular" w:cs="PingFangTC-Regular"/>
+                <w:b w:val="0"/>
+                <w:sz w:val="20"/>
+              </w:rPr>
+              <w:t>LSTM 基準比較與機率校準</w:t>
+            </w:r>
+          </w:p>
+        </w:tc>
+        <w:tc>
+          <w:tcPr>
+            <w:tcW w:type="dxa" w:w="1040"/>
+          </w:tcPr>
+          <w:p>
+            <w:pPr>
+              <w:jc w:val="left"/>
+            </w:pPr>
+            <w:r>
+              <w:rPr>
+                <w:rFonts w:ascii="PingFangTC-Regular" w:hAnsi="PingFangTC-Regular" w:eastAsia="PingFangTC-Regular" w:cs="PingFangTC-Regular"/>
+                <w:b w:val="0"/>
+                <w:sz w:val="20"/>
+              </w:rPr>
+              <w:t>LSTM 評估新增持續偏多基準、方向報酬差與預測機率分桶校準。</w:t>
+            </w:r>
+          </w:p>
+        </w:tc>
+        <w:tc>
+          <w:tcPr>
+            <w:tcW w:type="dxa" w:w="1040"/>
+          </w:tcPr>
+          <w:p>
+            <w:pPr>
+              <w:jc w:val="left"/>
+            </w:pPr>
+            <w:r>
+              <w:rPr>
+                <w:rFonts w:ascii="PingFangTC-Regular" w:hAnsi="PingFangTC-Regular" w:eastAsia="PingFangTC-Regular" w:cs="PingFangTC-Regular"/>
+                <w:b w:val="0"/>
+                <w:sz w:val="20"/>
+              </w:rPr>
+              <w:t>只看準確率容易被市場方向偏態誤導，需與持續偏多及實際方向報酬比較。</w:t>
+            </w:r>
+          </w:p>
+        </w:tc>
+        <w:tc>
+          <w:tcPr>
+            <w:tcW w:type="dxa" w:w="1040"/>
+          </w:tcPr>
+          <w:p>
+            <w:pPr>
+              <w:jc w:val="left"/>
+            </w:pPr>
+            <w:r>
+              <w:rPr>
+                <w:rFonts w:ascii="PingFangTC-Regular" w:hAnsi="PingFangTC-Regular" w:eastAsia="PingFangTC-Regular" w:cs="PingFangTC-Regular"/>
+                <w:b w:val="0"/>
+                <w:sz w:val="20"/>
+              </w:rPr>
+              <w:t>LSTM 預測驗證、模型評估、資料健康與量化數據中心</w:t>
+            </w:r>
+          </w:p>
+        </w:tc>
+        <w:tc>
+          <w:tcPr>
+            <w:tcW w:type="dxa" w:w="1040"/>
+          </w:tcPr>
+          <w:p>
+            <w:pPr>
+              <w:jc w:val="left"/>
+            </w:pPr>
+            <w:r>
+              <w:rPr>
+                <w:rFonts w:ascii="PingFangTC-Regular" w:hAnsi="PingFangTC-Regular" w:eastAsia="PingFangTC-Regular" w:cs="PingFangTC-Regular"/>
+                <w:b w:val="0"/>
+                <w:sz w:val="20"/>
+              </w:rPr>
+            </w:r>
+          </w:p>
+        </w:tc>
+      </w:tr>
     </w:tbl>
     <w:p>
       <w:pPr>
@@ -6647,6 +7135,154 @@
           </w:p>
         </w:tc>
       </w:tr>
+      <w:tr>
+        <w:tc>
+          <w:tcPr>
+            <w:tcW w:type="dxa" w:w="2340"/>
+          </w:tcPr>
+          <w:p>
+            <w:pPr>
+              <w:jc w:val="left"/>
+            </w:pPr>
+            <w:r>
+              <w:rPr>
+                <w:rFonts w:ascii="PingFangTC-Regular" w:hAnsi="PingFangTC-Regular" w:eastAsia="PingFangTC-Regular" w:cs="PingFangTC-Regular"/>
+                <w:b w:val="0"/>
+                <w:sz w:val="20"/>
+              </w:rPr>
+              <w:t>2026-07-26</w:t>
+            </w:r>
+          </w:p>
+        </w:tc>
+        <w:tc>
+          <w:tcPr>
+            <w:tcW w:type="dxa" w:w="2340"/>
+          </w:tcPr>
+          <w:p>
+            <w:pPr>
+              <w:jc w:val="left"/>
+            </w:pPr>
+            <w:r>
+              <w:rPr>
+                <w:rFonts w:ascii="PingFangTC-Regular" w:hAnsi="PingFangTC-Regular" w:eastAsia="PingFangTC-Regular" w:cs="PingFangTC-Regular"/>
+                <w:b w:val="0"/>
+                <w:sz w:val="20"/>
+              </w:rPr>
+              <w:t>KG 歷史回測資格與因子有效性報告</w:t>
+            </w:r>
+          </w:p>
+        </w:tc>
+        <w:tc>
+          <w:tcPr>
+            <w:tcW w:type="dxa" w:w="2340"/>
+          </w:tcPr>
+          <w:p>
+            <w:pPr>
+              <w:jc w:val="left"/>
+            </w:pPr>
+            <w:r>
+              <w:rPr>
+                <w:rFonts w:ascii="PingFangTC-Regular" w:hAnsi="PingFangTC-Regular" w:eastAsia="PingFangTC-Regular" w:cs="PingFangTC-Regular"/>
+                <w:b w:val="0"/>
+                <w:sz w:val="20"/>
+              </w:rPr>
+              <w:t>將市場技術基線與知識圖譜證據分開，避免缺少歷史新聞時產生虛假的 KG 回測結論。</w:t>
+            </w:r>
+          </w:p>
+        </w:tc>
+        <w:tc>
+          <w:tcPr>
+            <w:tcW w:type="dxa" w:w="2340"/>
+          </w:tcPr>
+          <w:p>
+            <w:pPr>
+              <w:jc w:val="left"/>
+            </w:pPr>
+            <w:r>
+              <w:rPr>
+                <w:rFonts w:ascii="PingFangTC-Regular" w:hAnsi="PingFangTC-Regular" w:eastAsia="PingFangTC-Regular" w:cs="PingFangTC-Regular"/>
+                <w:b w:val="0"/>
+                <w:sz w:val="20"/>
+              </w:rPr>
+              <w:t>Codex 已確認決策</w:t>
+            </w:r>
+          </w:p>
+        </w:tc>
+      </w:tr>
+      <w:tr>
+        <w:tc>
+          <w:tcPr>
+            <w:tcW w:type="dxa" w:w="2340"/>
+          </w:tcPr>
+          <w:p>
+            <w:pPr>
+              <w:jc w:val="left"/>
+            </w:pPr>
+            <w:r>
+              <w:rPr>
+                <w:rFonts w:ascii="PingFangTC-Regular" w:hAnsi="PingFangTC-Regular" w:eastAsia="PingFangTC-Regular" w:cs="PingFangTC-Regular"/>
+                <w:b w:val="0"/>
+                <w:sz w:val="20"/>
+              </w:rPr>
+              <w:t>2026-07-26</w:t>
+            </w:r>
+          </w:p>
+        </w:tc>
+        <w:tc>
+          <w:tcPr>
+            <w:tcW w:type="dxa" w:w="2340"/>
+          </w:tcPr>
+          <w:p>
+            <w:pPr>
+              <w:jc w:val="left"/>
+            </w:pPr>
+            <w:r>
+              <w:rPr>
+                <w:rFonts w:ascii="PingFangTC-Regular" w:hAnsi="PingFangTC-Regular" w:eastAsia="PingFangTC-Regular" w:cs="PingFangTC-Regular"/>
+                <w:b w:val="0"/>
+                <w:sz w:val="20"/>
+              </w:rPr>
+              <w:t>LSTM 基準比較與機率校準</w:t>
+            </w:r>
+          </w:p>
+        </w:tc>
+        <w:tc>
+          <w:tcPr>
+            <w:tcW w:type="dxa" w:w="2340"/>
+          </w:tcPr>
+          <w:p>
+            <w:pPr>
+              <w:jc w:val="left"/>
+            </w:pPr>
+            <w:r>
+              <w:rPr>
+                <w:rFonts w:ascii="PingFangTC-Regular" w:hAnsi="PingFangTC-Regular" w:eastAsia="PingFangTC-Regular" w:cs="PingFangTC-Regular"/>
+                <w:b w:val="0"/>
+                <w:sz w:val="20"/>
+              </w:rPr>
+              <w:t>只看準確率容易被市場方向偏態誤導，需與持續偏多及實際方向報酬比較。</w:t>
+            </w:r>
+          </w:p>
+        </w:tc>
+        <w:tc>
+          <w:tcPr>
+            <w:tcW w:type="dxa" w:w="2340"/>
+          </w:tcPr>
+          <w:p>
+            <w:pPr>
+              <w:jc w:val="left"/>
+            </w:pPr>
+            <w:r>
+              <w:rPr>
+                <w:rFonts w:ascii="PingFangTC-Regular" w:hAnsi="PingFangTC-Regular" w:eastAsia="PingFangTC-Regular" w:cs="PingFangTC-Regular"/>
+                <w:b w:val="0"/>
+                <w:sz w:val="20"/>
+              </w:rPr>
+              <w:t>Codex 已確認決策</w:t>
+            </w:r>
+          </w:p>
+        </w:tc>
+      </w:tr>
     </w:tbl>
     <w:p>
       <w:pPr>

</xml_diff>

<commit_message>
Personalize daily AI research summaries
</commit_message>
<xml_diff>
--- a/data/觀察版資料/13_專案記憶/專案記憶與討論摘要.docx
+++ b/data/觀察版資料/13_專案記憶/專案記憶與討論摘要.docx
@@ -26,7 +26,7 @@
           <w:b w:val="0"/>
           <w:sz w:val="20"/>
         </w:rPr>
-        <w:t>產生時間：2026-08-02 08:28 UTC｜來源：專案記憶資料夾</w:t>
+        <w:t>產生時間：2026-08-02 11:09 UTC｜來源：專案記憶資料夾</w:t>
       </w:r>
     </w:p>
     <w:p>
@@ -156,7 +156,7 @@
                 <w:b w:val="0"/>
                 <w:sz w:val="20"/>
               </w:rPr>
-              <w:t>17</w:t>
+              <w:t>18</w:t>
             </w:r>
           </w:p>
         </w:tc>
@@ -212,7 +212,7 @@
                 <w:b w:val="0"/>
                 <w:sz w:val="20"/>
               </w:rPr>
-              <w:t>16</w:t>
+              <w:t>17</w:t>
             </w:r>
           </w:p>
         </w:tc>
@@ -324,7 +324,7 @@
                 <w:b w:val="0"/>
                 <w:sz w:val="20"/>
               </w:rPr>
-              <w:t>2026-07-26</w:t>
+              <w:t>2026-08-02</w:t>
             </w:r>
           </w:p>
         </w:tc>
@@ -444,6 +444,80 @@
                 <w:sz w:val="20"/>
               </w:rPr>
               <w:t>狀態</w:t>
+            </w:r>
+          </w:p>
+        </w:tc>
+      </w:tr>
+      <w:tr>
+        <w:tc>
+          <w:tcPr>
+            <w:tcW w:type="dxa" w:w="2340"/>
+          </w:tcPr>
+          <w:p>
+            <w:pPr>
+              <w:jc w:val="left"/>
+            </w:pPr>
+            <w:r>
+              <w:rPr>
+                <w:rFonts w:ascii="PingFangTC-Regular" w:hAnsi="PingFangTC-Regular" w:eastAsia="PingFangTC-Regular" w:cs="PingFangTC-Regular"/>
+                <w:b w:val="0"/>
+                <w:sz w:val="20"/>
+              </w:rPr>
+              <w:t>決策</w:t>
+            </w:r>
+          </w:p>
+        </w:tc>
+        <w:tc>
+          <w:tcPr>
+            <w:tcW w:type="dxa" w:w="2340"/>
+          </w:tcPr>
+          <w:p>
+            <w:pPr>
+              <w:jc w:val="left"/>
+            </w:pPr>
+            <w:r>
+              <w:rPr>
+                <w:rFonts w:ascii="PingFangTC-Regular" w:hAnsi="PingFangTC-Regular" w:eastAsia="PingFangTC-Regular" w:cs="PingFangTC-Regular"/>
+                <w:b w:val="0"/>
+                <w:sz w:val="20"/>
+              </w:rPr>
+              <w:t>2026-08-02</w:t>
+            </w:r>
+          </w:p>
+        </w:tc>
+        <w:tc>
+          <w:tcPr>
+            <w:tcW w:type="dxa" w:w="2340"/>
+          </w:tcPr>
+          <w:p>
+            <w:pPr>
+              <w:jc w:val="left"/>
+            </w:pPr>
+            <w:r>
+              <w:rPr>
+                <w:rFonts w:ascii="PingFangTC-Regular" w:hAnsi="PingFangTC-Regular" w:eastAsia="PingFangTC-Regular" w:cs="PingFangTC-Regular"/>
+                <w:b w:val="0"/>
+                <w:sz w:val="20"/>
+              </w:rPr>
+              <w:t>AI 摘要改為個人研究優先模式</w:t>
+            </w:r>
+          </w:p>
+        </w:tc>
+        <w:tc>
+          <w:tcPr>
+            <w:tcW w:type="dxa" w:w="2340"/>
+          </w:tcPr>
+          <w:p>
+            <w:pPr>
+              <w:jc w:val="left"/>
+            </w:pPr>
+            <w:r>
+              <w:rPr>
+                <w:rFonts w:ascii="PingFangTC-Regular" w:hAnsi="PingFangTC-Regular" w:eastAsia="PingFangTC-Regular" w:cs="PingFangTC-Regular"/>
+                <w:b w:val="0"/>
+                <w:sz w:val="20"/>
+              </w:rPr>
+              <w:t>已執行</w:t>
             </w:r>
           </w:p>
         </w:tc>
@@ -647,7 +721,7 @@
                 <w:b w:val="0"/>
                 <w:sz w:val="20"/>
               </w:rPr>
-              <w:t>KG 預測 V2 多因子趨勢觀察</w:t>
+              <w:t>專案記憶受控寫入流程</w:t>
             </w:r>
           </w:p>
         </w:tc>
@@ -759,7 +833,7 @@
                 <w:b w:val="0"/>
                 <w:sz w:val="20"/>
               </w:rPr>
-              <w:t>決策</w:t>
+              <w:t>記憶更新</w:t>
             </w:r>
           </w:p>
         </w:tc>
@@ -777,7 +851,7 @@
                 <w:b w:val="0"/>
                 <w:sz w:val="20"/>
               </w:rPr>
-              <w:t>2026-07-24</w:t>
+              <w:t>2026-08-02</w:t>
             </w:r>
           </w:p>
         </w:tc>
@@ -795,7 +869,7 @@
                 <w:b w:val="0"/>
                 <w:sz w:val="20"/>
               </w:rPr>
-              <w:t>KG 新聞出版者與跨來源識別修正</w:t>
+              <w:t>AI 摘要改為個人研究優先模式</w:t>
             </w:r>
           </w:p>
         </w:tc>
@@ -813,7 +887,7 @@
                 <w:b w:val="0"/>
                 <w:sz w:val="20"/>
               </w:rPr>
-              <w:t>已執行</w:t>
+              <w:t>Codex 已確認決策</w:t>
             </w:r>
           </w:p>
         </w:tc>
@@ -1092,80 +1166,6 @@
                 <w:sz w:val="20"/>
               </w:rPr>
               <w:t>專案記憶受控寫入流程</w:t>
-            </w:r>
-          </w:p>
-        </w:tc>
-        <w:tc>
-          <w:tcPr>
-            <w:tcW w:type="dxa" w:w="2340"/>
-          </w:tcPr>
-          <w:p>
-            <w:pPr>
-              <w:jc w:val="left"/>
-            </w:pPr>
-            <w:r>
-              <w:rPr>
-                <w:rFonts w:ascii="PingFangTC-Regular" w:hAnsi="PingFangTC-Regular" w:eastAsia="PingFangTC-Regular" w:cs="PingFangTC-Regular"/>
-                <w:b w:val="0"/>
-                <w:sz w:val="20"/>
-              </w:rPr>
-              <w:t>Codex 已確認決策</w:t>
-            </w:r>
-          </w:p>
-        </w:tc>
-      </w:tr>
-      <w:tr>
-        <w:tc>
-          <w:tcPr>
-            <w:tcW w:type="dxa" w:w="2340"/>
-          </w:tcPr>
-          <w:p>
-            <w:pPr>
-              <w:jc w:val="left"/>
-            </w:pPr>
-            <w:r>
-              <w:rPr>
-                <w:rFonts w:ascii="PingFangTC-Regular" w:hAnsi="PingFangTC-Regular" w:eastAsia="PingFangTC-Regular" w:cs="PingFangTC-Regular"/>
-                <w:b w:val="0"/>
-                <w:sz w:val="20"/>
-              </w:rPr>
-              <w:t>記憶更新</w:t>
-            </w:r>
-          </w:p>
-        </w:tc>
-        <w:tc>
-          <w:tcPr>
-            <w:tcW w:type="dxa" w:w="2340"/>
-          </w:tcPr>
-          <w:p>
-            <w:pPr>
-              <w:jc w:val="left"/>
-            </w:pPr>
-            <w:r>
-              <w:rPr>
-                <w:rFonts w:ascii="PingFangTC-Regular" w:hAnsi="PingFangTC-Regular" w:eastAsia="PingFangTC-Regular" w:cs="PingFangTC-Regular"/>
-                <w:b w:val="0"/>
-                <w:sz w:val="20"/>
-              </w:rPr>
-              <w:t>2026-07-24</w:t>
-            </w:r>
-          </w:p>
-        </w:tc>
-        <w:tc>
-          <w:tcPr>
-            <w:tcW w:type="dxa" w:w="2340"/>
-          </w:tcPr>
-          <w:p>
-            <w:pPr>
-              <w:jc w:val="left"/>
-            </w:pPr>
-            <w:r>
-              <w:rPr>
-                <w:rFonts w:ascii="PingFangTC-Regular" w:hAnsi="PingFangTC-Regular" w:eastAsia="PingFangTC-Regular" w:cs="PingFangTC-Regular"/>
-                <w:b w:val="0"/>
-                <w:sz w:val="20"/>
-              </w:rPr>
-              <w:t>分層隨機歷史回測與多來源資料方向</w:t>
             </w:r>
           </w:p>
         </w:tc>
@@ -1858,6 +1858,33 @@
           <w:sz w:val="22"/>
         </w:rPr>
         <w:t>模型表現應同時呈現樣本數、基準比較、方向報酬與機率校準，不應用單一成功率作結論。</w:t>
+      </w:r>
+    </w:p>
+    <w:p>
+      <w:pPr>
+        <w:spacing w:before="200" w:after="120"/>
+      </w:pPr>
+      <w:r>
+        <w:rPr>
+          <w:rFonts w:ascii="PingFangTC-Regular" w:hAnsi="PingFangTC-Regular" w:eastAsia="PingFangTC-Regular" w:cs="PingFangTC-Regular"/>
+          <w:b w:val="0"/>
+          <w:sz w:val="26"/>
+        </w:rPr>
+        <w:t>2026-08-02｜AI 摘要改為個人研究優先模式</w:t>
+      </w:r>
+    </w:p>
+    <w:p>
+      <w:pPr>
+        <w:pStyle w:val="ListBullet"/>
+        <w:spacing w:after="60" w:line="276" w:lineRule="auto"/>
+      </w:pPr>
+      <w:r>
+        <w:rPr>
+          <w:rFonts w:ascii="PingFangTC-Regular" w:hAnsi="PingFangTC-Regular" w:eastAsia="PingFangTC-Regular" w:cs="PingFangTC-Regular"/>
+          <w:b w:val="0"/>
+          <w:sz w:val="22"/>
+        </w:rPr>
+        <w:t>個人研究摘要以可驗證的資料變化與研究偏好為主，舊主題沒有新證據時自動降權。</w:t>
       </w:r>
     </w:p>
     <w:p>
@@ -2695,6 +2722,33 @@
     </w:p>
     <w:p>
       <w:pPr>
+        <w:spacing w:before="200" w:after="120"/>
+      </w:pPr>
+      <w:r>
+        <w:rPr>
+          <w:rFonts w:ascii="PingFangTC-Regular" w:hAnsi="PingFangTC-Regular" w:eastAsia="PingFangTC-Regular" w:cs="PingFangTC-Regular"/>
+          <w:b w:val="0"/>
+          <w:sz w:val="26"/>
+        </w:rPr>
+        <w:t>2026-08-02｜AI 摘要改為個人研究優先模式</w:t>
+      </w:r>
+    </w:p>
+    <w:p>
+      <w:pPr>
+        <w:pStyle w:val="ListBullet"/>
+        <w:spacing w:after="60" w:line="276" w:lineRule="auto"/>
+      </w:pPr>
+      <w:r>
+        <w:rPr>
+          <w:rFonts w:ascii="PingFangTC-Regular" w:hAnsi="PingFangTC-Regular" w:eastAsia="PingFangTC-Regular" w:cs="PingFangTC-Regular"/>
+          <w:b w:val="0"/>
+          <w:sz w:val="22"/>
+        </w:rPr>
+        <w:t>持股數量與成本不寫入程式或 GitHub；只保存經確認的研究標的與主題。摘要必須根據新增事實排序，不以隨機性製造差異。</w:t>
+      </w:r>
+    </w:p>
+    <w:p>
+      <w:pPr>
         <w:spacing w:before="280" w:after="120"/>
       </w:pPr>
       <w:r>
@@ -3181,6 +3235,33 @@
           <w:sz w:val="22"/>
         </w:rPr>
         <w:t>LSTM 新評估已生成，資料洩漏檢查仍為 0；樣本數不足以調高模型信心。</w:t>
+      </w:r>
+    </w:p>
+    <w:p>
+      <w:pPr>
+        <w:spacing w:before="200" w:after="120"/>
+      </w:pPr>
+      <w:r>
+        <w:rPr>
+          <w:rFonts w:ascii="PingFangTC-Regular" w:hAnsi="PingFangTC-Regular" w:eastAsia="PingFangTC-Regular" w:cs="PingFangTC-Regular"/>
+          <w:b w:val="0"/>
+          <w:sz w:val="26"/>
+        </w:rPr>
+        <w:t>2026-08-02｜AI 摘要改為個人研究優先模式</w:t>
+      </w:r>
+    </w:p>
+    <w:p>
+      <w:pPr>
+        <w:pStyle w:val="ListBullet"/>
+        <w:spacing w:after="60" w:line="276" w:lineRule="auto"/>
+      </w:pPr>
+      <w:r>
+        <w:rPr>
+          <w:rFonts w:ascii="PingFangTC-Regular" w:hAnsi="PingFangTC-Regular" w:eastAsia="PingFangTC-Regular" w:cs="PingFangTC-Regular"/>
+          <w:b w:val="0"/>
+          <w:sz w:val="22"/>
+        </w:rPr>
+        <w:t>已新增個人研究設定、焦點排序、輸入指紋與低變化日標記；下一次每日 AI 排程會使用新版 Prompt。</w:t>
       </w:r>
     </w:p>
     <w:p>
@@ -6146,6 +6227,169 @@
           </w:p>
         </w:tc>
       </w:tr>
+      <w:tr>
+        <w:tc>
+          <w:tcPr>
+            <w:tcW w:type="dxa" w:w="1040"/>
+          </w:tcPr>
+          <w:p>
+            <w:pPr>
+              <w:jc w:val="left"/>
+            </w:pPr>
+            <w:r>
+              <w:rPr>
+                <w:rFonts w:ascii="PingFangTC-Regular" w:hAnsi="PingFangTC-Regular" w:eastAsia="PingFangTC-Regular" w:cs="PingFangTC-Regular"/>
+                <w:b w:val="0"/>
+                <w:sz w:val="20"/>
+              </w:rPr>
+              <w:t>D-018</w:t>
+            </w:r>
+          </w:p>
+        </w:tc>
+        <w:tc>
+          <w:tcPr>
+            <w:tcW w:type="dxa" w:w="1040"/>
+          </w:tcPr>
+          <w:p>
+            <w:pPr>
+              <w:jc w:val="left"/>
+            </w:pPr>
+            <w:r>
+              <w:rPr>
+                <w:rFonts w:ascii="PingFangTC-Regular" w:hAnsi="PingFangTC-Regular" w:eastAsia="PingFangTC-Regular" w:cs="PingFangTC-Regular"/>
+                <w:b w:val="0"/>
+                <w:sz w:val="20"/>
+              </w:rPr>
+              <w:t>2026-08-02</w:t>
+            </w:r>
+          </w:p>
+        </w:tc>
+        <w:tc>
+          <w:tcPr>
+            <w:tcW w:type="dxa" w:w="1040"/>
+          </w:tcPr>
+          <w:p>
+            <w:pPr>
+              <w:jc w:val="left"/>
+            </w:pPr>
+            <w:r>
+              <w:rPr>
+                <w:rFonts w:ascii="PingFangTC-Regular" w:hAnsi="PingFangTC-Regular" w:eastAsia="PingFangTC-Regular" w:cs="PingFangTC-Regular"/>
+                <w:b w:val="0"/>
+                <w:sz w:val="20"/>
+              </w:rPr>
+              <w:t>已執行</w:t>
+            </w:r>
+          </w:p>
+        </w:tc>
+        <w:tc>
+          <w:tcPr>
+            <w:tcW w:type="dxa" w:w="1040"/>
+          </w:tcPr>
+          <w:p>
+            <w:pPr>
+              <w:jc w:val="left"/>
+            </w:pPr>
+            <w:r>
+              <w:rPr>
+                <w:rFonts w:ascii="PingFangTC-Regular" w:hAnsi="PingFangTC-Regular" w:eastAsia="PingFangTC-Regular" w:cs="PingFangTC-Regular"/>
+                <w:b w:val="0"/>
+                <w:sz w:val="20"/>
+              </w:rPr>
+              <w:t>AI摘要</w:t>
+            </w:r>
+          </w:p>
+        </w:tc>
+        <w:tc>
+          <w:tcPr>
+            <w:tcW w:type="dxa" w:w="1040"/>
+          </w:tcPr>
+          <w:p>
+            <w:pPr>
+              <w:jc w:val="left"/>
+            </w:pPr>
+            <w:r>
+              <w:rPr>
+                <w:rFonts w:ascii="PingFangTC-Regular" w:hAnsi="PingFangTC-Regular" w:eastAsia="PingFangTC-Regular" w:cs="PingFangTC-Regular"/>
+                <w:b w:val="0"/>
+                <w:sz w:val="20"/>
+              </w:rPr>
+              <w:t>AI 摘要改為個人研究優先模式</w:t>
+            </w:r>
+          </w:p>
+        </w:tc>
+        <w:tc>
+          <w:tcPr>
+            <w:tcW w:type="dxa" w:w="1040"/>
+          </w:tcPr>
+          <w:p>
+            <w:pPr>
+              <w:jc w:val="left"/>
+            </w:pPr>
+            <w:r>
+              <w:rPr>
+                <w:rFonts w:ascii="PingFangTC-Regular" w:hAnsi="PingFangTC-Regular" w:eastAsia="PingFangTC-Regular" w:cs="PingFangTC-Regular"/>
+                <w:b w:val="0"/>
+                <w:sz w:val="20"/>
+              </w:rPr>
+              <w:t>每日摘要依使用者的持倉關注、科技市場、宏觀與國際風險自動排序，只寫當日最相關的三至四個研究焦點。</w:t>
+            </w:r>
+          </w:p>
+        </w:tc>
+        <w:tc>
+          <w:tcPr>
+            <w:tcW w:type="dxa" w:w="1040"/>
+          </w:tcPr>
+          <w:p>
+            <w:pPr>
+              <w:jc w:val="left"/>
+            </w:pPr>
+            <w:r>
+              <w:rPr>
+                <w:rFonts w:ascii="PingFangTC-Regular" w:hAnsi="PingFangTC-Regular" w:eastAsia="PingFangTC-Regular" w:cs="PingFangTC-Regular"/>
+                <w:b w:val="0"/>
+                <w:sz w:val="20"/>
+              </w:rPr>
+              <w:t>固定八段式模板使內容重複且無法反映使用者真正關心的標的與題材。</w:t>
+            </w:r>
+          </w:p>
+        </w:tc>
+        <w:tc>
+          <w:tcPr>
+            <w:tcW w:type="dxa" w:w="1040"/>
+          </w:tcPr>
+          <w:p>
+            <w:pPr>
+              <w:jc w:val="left"/>
+            </w:pPr>
+            <w:r>
+              <w:rPr>
+                <w:rFonts w:ascii="PingFangTC-Regular" w:hAnsi="PingFangTC-Regular" w:eastAsia="PingFangTC-Regular" w:cs="PingFangTC-Regular"/>
+                <w:b w:val="0"/>
+                <w:sz w:val="20"/>
+              </w:rPr>
+              <w:t>AI摘要、新聞與摘要頁、摘要歷史、雲端每日排程</w:t>
+            </w:r>
+          </w:p>
+        </w:tc>
+        <w:tc>
+          <w:tcPr>
+            <w:tcW w:type="dxa" w:w="1040"/>
+          </w:tcPr>
+          <w:p>
+            <w:pPr>
+              <w:jc w:val="left"/>
+            </w:pPr>
+            <w:r>
+              <w:rPr>
+                <w:rFonts w:ascii="PingFangTC-Regular" w:hAnsi="PingFangTC-Regular" w:eastAsia="PingFangTC-Regular" w:cs="PingFangTC-Regular"/>
+                <w:b w:val="0"/>
+                <w:sz w:val="20"/>
+              </w:rPr>
+            </w:r>
+          </w:p>
+        </w:tc>
+      </w:tr>
     </w:tbl>
     <w:p>
       <w:pPr>
@@ -7283,6 +7527,80 @@
           </w:p>
         </w:tc>
       </w:tr>
+      <w:tr>
+        <w:tc>
+          <w:tcPr>
+            <w:tcW w:type="dxa" w:w="2340"/>
+          </w:tcPr>
+          <w:p>
+            <w:pPr>
+              <w:jc w:val="left"/>
+            </w:pPr>
+            <w:r>
+              <w:rPr>
+                <w:rFonts w:ascii="PingFangTC-Regular" w:hAnsi="PingFangTC-Regular" w:eastAsia="PingFangTC-Regular" w:cs="PingFangTC-Regular"/>
+                <w:b w:val="0"/>
+                <w:sz w:val="20"/>
+              </w:rPr>
+              <w:t>2026-08-02</w:t>
+            </w:r>
+          </w:p>
+        </w:tc>
+        <w:tc>
+          <w:tcPr>
+            <w:tcW w:type="dxa" w:w="2340"/>
+          </w:tcPr>
+          <w:p>
+            <w:pPr>
+              <w:jc w:val="left"/>
+            </w:pPr>
+            <w:r>
+              <w:rPr>
+                <w:rFonts w:ascii="PingFangTC-Regular" w:hAnsi="PingFangTC-Regular" w:eastAsia="PingFangTC-Regular" w:cs="PingFangTC-Regular"/>
+                <w:b w:val="0"/>
+                <w:sz w:val="20"/>
+              </w:rPr>
+              <w:t>AI 摘要改為個人研究優先模式</w:t>
+            </w:r>
+          </w:p>
+        </w:tc>
+        <w:tc>
+          <w:tcPr>
+            <w:tcW w:type="dxa" w:w="2340"/>
+          </w:tcPr>
+          <w:p>
+            <w:pPr>
+              <w:jc w:val="left"/>
+            </w:pPr>
+            <w:r>
+              <w:rPr>
+                <w:rFonts w:ascii="PingFangTC-Regular" w:hAnsi="PingFangTC-Regular" w:eastAsia="PingFangTC-Regular" w:cs="PingFangTC-Regular"/>
+                <w:b w:val="0"/>
+                <w:sz w:val="20"/>
+              </w:rPr>
+              <w:t>固定八段式模板使內容重複且無法反映使用者真正關心的標的與題材。</w:t>
+            </w:r>
+          </w:p>
+        </w:tc>
+        <w:tc>
+          <w:tcPr>
+            <w:tcW w:type="dxa" w:w="2340"/>
+          </w:tcPr>
+          <w:p>
+            <w:pPr>
+              <w:jc w:val="left"/>
+            </w:pPr>
+            <w:r>
+              <w:rPr>
+                <w:rFonts w:ascii="PingFangTC-Regular" w:hAnsi="PingFangTC-Regular" w:eastAsia="PingFangTC-Regular" w:cs="PingFangTC-Regular"/>
+                <w:b w:val="0"/>
+                <w:sz w:val="20"/>
+              </w:rPr>
+              <w:t>Codex 已確認決策</w:t>
+            </w:r>
+          </w:p>
+        </w:tc>
+      </w:tr>
     </w:tbl>
     <w:p>
       <w:pPr>

</xml_diff>